<commit_message>
Fix the layout of the report
</commit_message>
<xml_diff>
--- a/OisinGibson_L00172671_AADSHashingCA.docx
+++ b/OisinGibson_L00172671_AADSHashingCA.docx
@@ -6,6 +6,7 @@
       <w:pPr>
         <w:jc w:val="center"/>
         <w:rPr>
+          <w:rFonts w:ascii="Arial" w:hAnsi="Arial" w:cs="Arial"/>
           <w:b/>
           <w:bCs/>
           <w:sz w:val="40"/>
@@ -14,6 +15,7 @@
       </w:pPr>
       <w:r>
         <w:rPr>
+          <w:rFonts w:ascii="Arial" w:hAnsi="Arial" w:cs="Arial"/>
           <w:b/>
           <w:bCs/>
           <w:sz w:val="40"/>
@@ -26,6 +28,7 @@
       <w:pPr>
         <w:jc w:val="center"/>
         <w:rPr>
+          <w:rFonts w:ascii="Arial" w:hAnsi="Arial" w:cs="Arial"/>
           <w:b/>
           <w:bCs/>
           <w:sz w:val="40"/>
@@ -34,6 +37,7 @@
       </w:pPr>
       <w:r>
         <w:rPr>
+          <w:rFonts w:ascii="Arial" w:hAnsi="Arial" w:cs="Arial"/>
           <w:b/>
           <w:bCs/>
           <w:sz w:val="40"/>
@@ -47,19 +51,22 @@
         <w:spacing w:after="0"/>
         <w:jc w:val="center"/>
         <w:rPr>
+          <w:rFonts w:ascii="Arial" w:hAnsi="Arial" w:cs="Arial"/>
           <w:b/>
           <w:bCs/>
-          <w:sz w:val="40"/>
-          <w:szCs w:val="40"/>
         </w:rPr>
       </w:pPr>
     </w:p>
     <w:p>
       <w:pPr>
         <w:jc w:val="center"/>
+        <w:rPr>
+          <w:rFonts w:ascii="Arial" w:hAnsi="Arial" w:cs="Arial"/>
+        </w:rPr>
       </w:pPr>
       <w:r>
         <w:rPr>
+          <w:rFonts w:ascii="Arial" w:hAnsi="Arial" w:cs="Arial"/>
           <w:noProof/>
         </w:rPr>
         <w:drawing>
@@ -116,129 +123,171 @@
       <w:pPr>
         <w:jc w:val="center"/>
         <w:rPr>
+          <w:rFonts w:ascii="Arial" w:hAnsi="Arial" w:cs="Arial"/>
+        </w:rPr>
+      </w:pPr>
+    </w:p>
+    <w:p>
+      <w:pPr>
+        <w:jc w:val="center"/>
+        <w:rPr>
+          <w:rFonts w:ascii="Arial" w:hAnsi="Arial" w:cs="Arial"/>
+        </w:rPr>
+      </w:pPr>
+    </w:p>
+    <w:p>
+      <w:pPr>
+        <w:jc w:val="center"/>
+        <w:rPr>
+          <w:rFonts w:ascii="Arial" w:hAnsi="Arial" w:cs="Arial"/>
           <w:sz w:val="40"/>
           <w:szCs w:val="40"/>
         </w:rPr>
       </w:pPr>
-    </w:p>
-    <w:p>
-      <w:pPr>
-        <w:jc w:val="center"/>
-        <w:rPr>
+      <w:r>
+        <w:rPr>
+          <w:rFonts w:ascii="Arial" w:hAnsi="Arial" w:cs="Arial"/>
           <w:sz w:val="40"/>
           <w:szCs w:val="40"/>
         </w:rPr>
-      </w:pPr>
+        <w:t>Hashing Algorithms Assignment</w:t>
+      </w:r>
     </w:p>
     <w:p>
       <w:pPr>
         <w:jc w:val="center"/>
         <w:rPr>
+          <w:rFonts w:ascii="Arial" w:hAnsi="Arial" w:cs="Arial"/>
+        </w:rPr>
+      </w:pPr>
+    </w:p>
+    <w:p>
+      <w:pPr>
+        <w:jc w:val="center"/>
+        <w:rPr>
+          <w:rFonts w:ascii="Arial" w:hAnsi="Arial" w:cs="Arial"/>
+        </w:rPr>
+      </w:pPr>
+    </w:p>
+    <w:p>
+      <w:pPr>
+        <w:jc w:val="center"/>
+        <w:rPr>
+          <w:rFonts w:ascii="Arial" w:hAnsi="Arial" w:cs="Arial"/>
+        </w:rPr>
+      </w:pPr>
+    </w:p>
+    <w:p>
+      <w:pPr>
+        <w:jc w:val="center"/>
+        <w:rPr>
+          <w:rFonts w:ascii="Arial" w:hAnsi="Arial" w:cs="Arial"/>
+        </w:rPr>
+      </w:pPr>
+    </w:p>
+    <w:p>
+      <w:pPr>
+        <w:jc w:val="center"/>
+        <w:rPr>
+          <w:rFonts w:ascii="Arial" w:hAnsi="Arial" w:cs="Arial"/>
           <w:sz w:val="40"/>
           <w:szCs w:val="40"/>
         </w:rPr>
       </w:pPr>
-      <w:r>
-        <w:rPr>
+    </w:p>
+    <w:p>
+      <w:pPr>
+        <w:jc w:val="center"/>
+        <w:rPr>
+          <w:rFonts w:ascii="Arial" w:hAnsi="Arial" w:cs="Arial"/>
           <w:sz w:val="40"/>
           <w:szCs w:val="40"/>
         </w:rPr>
-        <w:t>Hashing Algorithms Assignment</w:t>
-      </w:r>
-    </w:p>
-    <w:p>
-      <w:pPr>
-        <w:jc w:val="center"/>
-        <w:rPr>
+      </w:pPr>
+      <w:r>
+        <w:rPr>
+          <w:rFonts w:ascii="Arial" w:hAnsi="Arial" w:cs="Arial"/>
           <w:sz w:val="40"/>
           <w:szCs w:val="40"/>
         </w:rPr>
-      </w:pPr>
+        <w:t>Oisin Gibson</w:t>
+      </w:r>
     </w:p>
     <w:p>
       <w:pPr>
         <w:jc w:val="center"/>
         <w:rPr>
+          <w:rFonts w:ascii="Arial" w:hAnsi="Arial" w:cs="Arial"/>
           <w:sz w:val="40"/>
           <w:szCs w:val="40"/>
         </w:rPr>
       </w:pPr>
-    </w:p>
-    <w:p>
-      <w:pPr>
-        <w:jc w:val="center"/>
-        <w:rPr>
+      <w:r>
+        <w:rPr>
+          <w:rFonts w:ascii="Arial" w:hAnsi="Arial" w:cs="Arial"/>
           <w:sz w:val="40"/>
           <w:szCs w:val="40"/>
         </w:rPr>
-      </w:pPr>
-    </w:p>
-    <w:p>
-      <w:pPr>
-        <w:jc w:val="center"/>
-        <w:rPr>
-          <w:sz w:val="40"/>
-          <w:szCs w:val="40"/>
-        </w:rPr>
-      </w:pPr>
-    </w:p>
-    <w:p>
-      <w:pPr>
-        <w:jc w:val="center"/>
-        <w:rPr>
-          <w:sz w:val="40"/>
-          <w:szCs w:val="40"/>
-        </w:rPr>
-      </w:pPr>
-    </w:p>
-    <w:p>
-      <w:pPr>
-        <w:jc w:val="center"/>
-        <w:rPr>
-          <w:sz w:val="40"/>
-          <w:szCs w:val="40"/>
-        </w:rPr>
-      </w:pPr>
-      <w:r>
-        <w:rPr>
-          <w:sz w:val="40"/>
-          <w:szCs w:val="40"/>
-        </w:rPr>
-        <w:t>Oisin Gibson</w:t>
-      </w:r>
-    </w:p>
-    <w:p>
-      <w:pPr>
-        <w:jc w:val="center"/>
-        <w:rPr>
-          <w:sz w:val="40"/>
-          <w:szCs w:val="40"/>
-        </w:rPr>
-      </w:pPr>
-      <w:r>
-        <w:rPr>
-          <w:sz w:val="40"/>
-          <w:szCs w:val="40"/>
-        </w:rPr>
         <w:t>L00172671</w:t>
       </w:r>
     </w:p>
     <w:p>
       <w:pPr>
-        <w:rPr>
+        <w:jc w:val="center"/>
+        <w:rPr>
+          <w:rFonts w:ascii="Arial" w:hAnsi="Arial" w:cs="Arial"/>
+        </w:rPr>
+      </w:pPr>
+    </w:p>
+    <w:p>
+      <w:pPr>
+        <w:jc w:val="center"/>
+        <w:rPr>
+          <w:rFonts w:ascii="Arial" w:hAnsi="Arial" w:cs="Arial"/>
+        </w:rPr>
+      </w:pPr>
+    </w:p>
+    <w:p>
+      <w:pPr>
+        <w:jc w:val="center"/>
+        <w:rPr>
+          <w:rFonts w:ascii="Arial" w:hAnsi="Arial" w:cs="Arial"/>
+        </w:rPr>
+      </w:pPr>
+    </w:p>
+    <w:p>
+      <w:pPr>
+        <w:jc w:val="center"/>
+        <w:rPr>
+          <w:rFonts w:ascii="Arial" w:hAnsi="Arial" w:cs="Arial"/>
+        </w:rPr>
+      </w:pPr>
+    </w:p>
+    <w:p>
+      <w:pPr>
+        <w:rPr>
+          <w:rFonts w:ascii="Arial" w:hAnsi="Arial" w:cs="Arial"/>
+        </w:rPr>
+      </w:pPr>
+    </w:p>
+    <w:p>
+      <w:pPr>
+        <w:rPr>
+          <w:rFonts w:cs="Arial"/>
           <w:b/>
           <w:bCs/>
-          <w:sz w:val="32"/>
-          <w:szCs w:val="32"/>
+          <w:sz w:val="24"/>
+          <w:szCs w:val="24"/>
         </w:rPr>
       </w:pPr>
       <w:bookmarkStart w:id="0" w:name="_Toc101374233"/>
       <w:r>
         <w:rPr>
+          <w:rFonts w:cs="Arial"/>
           <w:b/>
           <w:bCs/>
-          <w:sz w:val="32"/>
-          <w:szCs w:val="32"/>
+          <w:sz w:val="24"/>
+          <w:szCs w:val="24"/>
         </w:rPr>
         <w:lastRenderedPageBreak/>
         <w:t>Declaration</w:t>
@@ -246,10 +295,11 @@
       <w:bookmarkEnd w:id="0"/>
       <w:r>
         <w:rPr>
+          <w:rFonts w:cs="Arial"/>
           <w:b/>
           <w:bCs/>
-          <w:sz w:val="32"/>
-          <w:szCs w:val="32"/>
+          <w:sz w:val="24"/>
+          <w:szCs w:val="24"/>
         </w:rPr>
         <w:t xml:space="preserve"> </w:t>
       </w:r>
@@ -257,6 +307,11 @@
     <w:p>
       <w:pPr>
         <w:spacing w:after="0"/>
+        <w:rPr>
+          <w:rFonts w:cs="Arial"/>
+          <w:sz w:val="24"/>
+          <w:szCs w:val="24"/>
+        </w:rPr>
       </w:pPr>
     </w:p>
     <w:p>
@@ -269,16 +324,16 @@
         <w:spacing w:after="0" w:line="360" w:lineRule="atLeast"/>
         <w:ind w:left="284" w:hanging="284"/>
         <w:rPr>
-          <w:rFonts w:ascii="Arial" w:hAnsi="Arial" w:cs="Arial"/>
-          <w:sz w:val="20"/>
-          <w:szCs w:val="20"/>
+          <w:rFonts w:cs="Arial"/>
+          <w:sz w:val="24"/>
+          <w:szCs w:val="24"/>
         </w:rPr>
       </w:pPr>
       <w:r>
         <w:rPr>
-          <w:rFonts w:ascii="Arial" w:hAnsi="Arial" w:cs="Arial"/>
-          <w:sz w:val="20"/>
-          <w:szCs w:val="20"/>
+          <w:rFonts w:cs="Arial"/>
+          <w:sz w:val="24"/>
+          <w:szCs w:val="24"/>
         </w:rPr>
         <w:t xml:space="preserve">I have accurately identified and included the sources of all facts, ideas, opinions, and viewpoints from others in the assignment references. All direct quotations, paraphrasing, and discussions of ideas from books, journal articles, internet sources, course materials, or any other sources used are properly acknowledged and cited in the assignment references. </w:t>
       </w:r>
@@ -293,16 +348,16 @@
         <w:spacing w:after="0" w:line="360" w:lineRule="atLeast"/>
         <w:ind w:left="284" w:hanging="284"/>
         <w:rPr>
-          <w:rFonts w:ascii="Arial" w:hAnsi="Arial" w:cs="Arial"/>
-          <w:sz w:val="20"/>
-          <w:szCs w:val="20"/>
+          <w:rFonts w:cs="Arial"/>
+          <w:sz w:val="24"/>
+          <w:szCs w:val="24"/>
         </w:rPr>
       </w:pPr>
       <w:r>
         <w:rPr>
-          <w:rFonts w:ascii="Arial" w:hAnsi="Arial" w:cs="Arial"/>
-          <w:sz w:val="20"/>
-          <w:szCs w:val="20"/>
+          <w:rFonts w:cs="Arial"/>
+          <w:sz w:val="24"/>
+          <w:szCs w:val="24"/>
         </w:rPr>
         <w:t xml:space="preserve">I have not used unauthorised artificial intelligence tools or aids. </w:t>
       </w:r>
@@ -317,16 +372,16 @@
         <w:spacing w:after="0" w:line="360" w:lineRule="atLeast"/>
         <w:ind w:left="284" w:hanging="284"/>
         <w:rPr>
-          <w:rFonts w:ascii="Arial" w:hAnsi="Arial" w:cs="Arial"/>
-          <w:sz w:val="20"/>
-          <w:szCs w:val="20"/>
+          <w:rFonts w:cs="Arial"/>
+          <w:sz w:val="24"/>
+          <w:szCs w:val="24"/>
         </w:rPr>
       </w:pPr>
       <w:r>
         <w:rPr>
-          <w:rFonts w:ascii="Arial" w:hAnsi="Arial" w:cs="Arial"/>
-          <w:sz w:val="20"/>
-          <w:szCs w:val="20"/>
+          <w:rFonts w:cs="Arial"/>
+          <w:sz w:val="24"/>
+          <w:szCs w:val="24"/>
         </w:rPr>
         <w:t xml:space="preserve">I understand and am compliant with ATU's policy and procedures regarding Academic Integrity and I am aware of the consequences of any violations. </w:t>
       </w:r>
@@ -341,16 +396,16 @@
         <w:spacing w:after="0" w:line="360" w:lineRule="atLeast"/>
         <w:ind w:left="284" w:hanging="284"/>
         <w:rPr>
-          <w:rFonts w:ascii="Arial" w:hAnsi="Arial" w:cs="Arial"/>
-          <w:sz w:val="20"/>
-          <w:szCs w:val="20"/>
+          <w:rFonts w:cs="Arial"/>
+          <w:sz w:val="24"/>
+          <w:szCs w:val="24"/>
         </w:rPr>
       </w:pPr>
       <w:r>
         <w:rPr>
-          <w:rFonts w:ascii="Arial" w:hAnsi="Arial" w:cs="Arial"/>
-          <w:sz w:val="20"/>
-          <w:szCs w:val="20"/>
+          <w:rFonts w:cs="Arial"/>
+          <w:sz w:val="24"/>
+          <w:szCs w:val="24"/>
         </w:rPr>
         <w:t xml:space="preserve">I have followed the referencing guidelines recommended in the assignment instructions and / or programme documentation. </w:t>
       </w:r>
@@ -365,16 +420,16 @@
         <w:spacing w:after="0" w:line="360" w:lineRule="atLeast"/>
         <w:ind w:left="284" w:hanging="284"/>
         <w:rPr>
-          <w:rFonts w:ascii="Arial" w:hAnsi="Arial" w:cs="Arial"/>
-          <w:sz w:val="20"/>
-          <w:szCs w:val="20"/>
+          <w:rFonts w:cs="Arial"/>
+          <w:sz w:val="24"/>
+          <w:szCs w:val="24"/>
         </w:rPr>
       </w:pPr>
       <w:r>
         <w:rPr>
-          <w:rFonts w:ascii="Arial" w:hAnsi="Arial" w:cs="Arial"/>
-          <w:sz w:val="20"/>
-          <w:szCs w:val="20"/>
+          <w:rFonts w:cs="Arial"/>
+          <w:sz w:val="24"/>
+          <w:szCs w:val="24"/>
         </w:rPr>
         <w:t>I understand that not adhering to the word limits on each section will result in penalties.</w:t>
       </w:r>
@@ -389,16 +444,16 @@
         <w:spacing w:after="0" w:line="360" w:lineRule="atLeast"/>
         <w:ind w:left="284" w:hanging="284"/>
         <w:rPr>
-          <w:rFonts w:ascii="Arial" w:hAnsi="Arial" w:cs="Arial"/>
-          <w:sz w:val="20"/>
-          <w:szCs w:val="20"/>
+          <w:rFonts w:cs="Arial"/>
+          <w:sz w:val="24"/>
+          <w:szCs w:val="24"/>
         </w:rPr>
       </w:pPr>
       <w:r>
         <w:rPr>
-          <w:rFonts w:ascii="Arial" w:hAnsi="Arial" w:cs="Arial"/>
-          <w:sz w:val="20"/>
-          <w:szCs w:val="20"/>
+          <w:rFonts w:cs="Arial"/>
+          <w:sz w:val="24"/>
+          <w:szCs w:val="24"/>
         </w:rPr>
         <w:t xml:space="preserve">By signing this form or by submitting material online I confirm that this assignment, or any part of it, has not been previously submitted by me or any other person for assessment on this or any other programme of study. </w:t>
       </w:r>
@@ -413,35 +468,27 @@
         <w:spacing w:after="0" w:line="360" w:lineRule="atLeast"/>
         <w:ind w:left="284" w:hanging="284"/>
         <w:rPr>
-          <w:rFonts w:ascii="Arial" w:hAnsi="Arial" w:cs="Arial"/>
-          <w:sz w:val="20"/>
-          <w:szCs w:val="20"/>
+          <w:rFonts w:cs="Arial"/>
+          <w:sz w:val="24"/>
+          <w:szCs w:val="24"/>
         </w:rPr>
       </w:pPr>
       <w:r>
         <w:rPr>
-          <w:rFonts w:ascii="Arial" w:hAnsi="Arial" w:cs="Arial"/>
-          <w:sz w:val="20"/>
-          <w:szCs w:val="20"/>
-        </w:rPr>
-        <w:t>By signing this form or by submitting material for assessment online I confirm that I have read and understood AQAE022 Academic Integrity Policy</w:t>
+          <w:rFonts w:cs="Arial"/>
+          <w:sz w:val="24"/>
+          <w:szCs w:val="24"/>
+        </w:rPr>
+        <w:t>By signing this form or by submitting material for assessment online I confirm that I have read and understood AQAE022 Academic Integrity Policy.</w:t>
       </w:r>
-      <w:r>
-        <w:rPr>
-          <w:rFonts w:ascii="Arial" w:hAnsi="Arial" w:cs="Arial"/>
-          <w:sz w:val="20"/>
-          <w:szCs w:val="20"/>
-        </w:rPr>
-        <w:t>.</w:t>
-      </w:r>
     </w:p>
     <w:p>
       <w:pPr>
         <w:spacing w:after="0" w:line="360" w:lineRule="atLeast"/>
         <w:rPr>
-          <w:rFonts w:ascii="Arial" w:hAnsi="Arial" w:cs="Arial"/>
-          <w:sz w:val="20"/>
-          <w:szCs w:val="20"/>
+          <w:rFonts w:cs="Arial"/>
+          <w:sz w:val="24"/>
+          <w:szCs w:val="24"/>
         </w:rPr>
       </w:pPr>
     </w:p>
@@ -449,31 +496,31 @@
       <w:pPr>
         <w:spacing w:after="0" w:line="360" w:lineRule="atLeast"/>
         <w:rPr>
-          <w:rFonts w:ascii="Arial" w:hAnsi="Arial" w:cs="Arial"/>
+          <w:rFonts w:cs="Arial"/>
           <w:b/>
           <w:bCs/>
-          <w:sz w:val="20"/>
-          <w:szCs w:val="20"/>
+          <w:sz w:val="24"/>
+          <w:szCs w:val="24"/>
         </w:rPr>
       </w:pPr>
       <w:r>
         <w:rPr>
-          <w:rFonts w:ascii="Arial" w:hAnsi="Arial" w:cs="Arial"/>
+          <w:rFonts w:cs="Arial"/>
           <w:b/>
           <w:bCs/>
-          <w:sz w:val="20"/>
-          <w:szCs w:val="20"/>
+          <w:sz w:val="24"/>
+          <w:szCs w:val="24"/>
         </w:rPr>
         <w:t xml:space="preserve">I confirm I agree to this declaration. </w:t>
       </w:r>
       <w:sdt>
         <w:sdtPr>
           <w:rPr>
-            <w:rFonts w:ascii="Arial" w:hAnsi="Arial" w:cs="Arial"/>
+            <w:rFonts w:cs="Arial"/>
             <w:b/>
             <w:bCs/>
-            <w:sz w:val="20"/>
-            <w:szCs w:val="20"/>
+            <w:sz w:val="24"/>
+            <w:szCs w:val="24"/>
           </w:rPr>
           <w:id w:val="1031225410"/>
           <w14:checkbox>
@@ -482,14 +529,15 @@
             <w14:uncheckedState w14:val="2610" w14:font="MS Gothic"/>
           </w14:checkbox>
         </w:sdtPr>
+        <w:sdtEndPr/>
         <w:sdtContent>
           <w:r>
             <w:rPr>
-              <w:rFonts w:ascii="MS Gothic" w:eastAsia="MS Gothic" w:hAnsi="MS Gothic" w:cs="Arial" w:hint="eastAsia"/>
+              <w:rFonts w:ascii="Segoe UI Symbol" w:eastAsia="MS Gothic" w:hAnsi="Segoe UI Symbol" w:cs="Segoe UI Symbol"/>
               <w:b/>
               <w:bCs/>
-              <w:sz w:val="20"/>
-              <w:szCs w:val="20"/>
+              <w:sz w:val="24"/>
+              <w:szCs w:val="24"/>
             </w:rPr>
             <w:t>☒</w:t>
           </w:r>
@@ -500,9 +548,9 @@
       <w:pPr>
         <w:spacing w:after="0" w:line="360" w:lineRule="atLeast"/>
         <w:rPr>
-          <w:rFonts w:ascii="Arial" w:hAnsi="Arial" w:cs="Arial"/>
-          <w:sz w:val="20"/>
-          <w:szCs w:val="20"/>
+          <w:rFonts w:cs="Arial"/>
+          <w:sz w:val="24"/>
+          <w:szCs w:val="24"/>
         </w:rPr>
       </w:pPr>
     </w:p>
@@ -510,26 +558,26 @@
       <w:pPr>
         <w:spacing w:after="0" w:line="360" w:lineRule="atLeast"/>
         <w:rPr>
-          <w:rFonts w:ascii="Arial" w:hAnsi="Arial" w:cs="Arial"/>
-          <w:sz w:val="20"/>
-          <w:szCs w:val="20"/>
+          <w:rFonts w:cs="Arial"/>
+          <w:sz w:val="24"/>
+          <w:szCs w:val="24"/>
         </w:rPr>
       </w:pPr>
       <w:r>
         <w:rPr>
-          <w:rFonts w:ascii="Arial" w:hAnsi="Arial" w:cs="Arial"/>
+          <w:rFonts w:cs="Arial"/>
           <w:b/>
           <w:bCs/>
-          <w:sz w:val="20"/>
-          <w:szCs w:val="20"/>
+          <w:sz w:val="24"/>
+          <w:szCs w:val="24"/>
         </w:rPr>
         <w:t>Print Signature:</w:t>
       </w:r>
       <w:r>
         <w:rPr>
-          <w:rFonts w:ascii="Arial" w:hAnsi="Arial" w:cs="Arial"/>
-          <w:sz w:val="20"/>
-          <w:szCs w:val="20"/>
+          <w:rFonts w:cs="Arial"/>
+          <w:sz w:val="24"/>
+          <w:szCs w:val="24"/>
         </w:rPr>
         <w:t xml:space="preserve"> Oisin Gibson</w:t>
       </w:r>
@@ -537,38 +585,1214 @@
     <w:p>
       <w:pPr>
         <w:rPr>
+          <w:rFonts w:cs="Arial"/>
           <w:b/>
           <w:bCs/>
-        </w:rPr>
-      </w:pPr>
-    </w:p>
-    <w:p>
+          <w:sz w:val="24"/>
+          <w:szCs w:val="24"/>
+        </w:rPr>
+      </w:pPr>
+    </w:p>
+    <w:p>
+      <w:pPr>
+        <w:rPr>
+          <w:rFonts w:cs="Arial"/>
+          <w:sz w:val="24"/>
+          <w:szCs w:val="24"/>
+        </w:rPr>
+      </w:pPr>
       <w:r>
         <w:rPr>
+          <w:rFonts w:cs="Arial"/>
           <w:b/>
           <w:bCs/>
+          <w:sz w:val="24"/>
+          <w:szCs w:val="24"/>
         </w:rPr>
         <w:t>Date:</w:t>
       </w:r>
       <w:r>
+        <w:rPr>
+          <w:rFonts w:cs="Arial"/>
+          <w:sz w:val="24"/>
+          <w:szCs w:val="24"/>
+        </w:rPr>
         <w:t xml:space="preserve"> </w:t>
       </w:r>
       <w:r>
+        <w:rPr>
+          <w:rFonts w:cs="Arial"/>
+          <w:sz w:val="24"/>
+          <w:szCs w:val="24"/>
+        </w:rPr>
         <w:t>29/12/2025</w:t>
       </w:r>
     </w:p>
-    <w:p/>
-    <w:p/>
-    <w:p/>
-    <w:p/>
-    <w:p/>
-    <w:p/>
-    <w:p/>
-    <w:p/>
-    <w:p/>
-    <w:p/>
+    <w:p>
+      <w:pPr>
+        <w:rPr>
+          <w:rFonts w:ascii="Arial" w:hAnsi="Arial" w:cs="Arial"/>
+        </w:rPr>
+      </w:pPr>
+    </w:p>
+    <w:p>
+      <w:pPr>
+        <w:rPr>
+          <w:rFonts w:ascii="Arial" w:hAnsi="Arial" w:cs="Arial"/>
+        </w:rPr>
+      </w:pPr>
+    </w:p>
+    <w:p>
+      <w:pPr>
+        <w:rPr>
+          <w:rFonts w:ascii="Arial" w:hAnsi="Arial" w:cs="Arial"/>
+        </w:rPr>
+      </w:pPr>
+    </w:p>
+    <w:p>
+      <w:pPr>
+        <w:rPr>
+          <w:rFonts w:ascii="Arial" w:hAnsi="Arial" w:cs="Arial"/>
+        </w:rPr>
+      </w:pPr>
+    </w:p>
+    <w:p>
+      <w:pPr>
+        <w:rPr>
+          <w:rFonts w:ascii="Arial" w:hAnsi="Arial" w:cs="Arial"/>
+        </w:rPr>
+      </w:pPr>
+    </w:p>
+    <w:p>
+      <w:pPr>
+        <w:rPr>
+          <w:rFonts w:ascii="Arial" w:hAnsi="Arial" w:cs="Arial"/>
+        </w:rPr>
+      </w:pPr>
+    </w:p>
+    <w:p>
+      <w:pPr>
+        <w:rPr>
+          <w:rFonts w:ascii="Arial" w:hAnsi="Arial" w:cs="Arial"/>
+        </w:rPr>
+      </w:pPr>
+    </w:p>
+    <w:p>
+      <w:pPr>
+        <w:rPr>
+          <w:rFonts w:ascii="Arial" w:hAnsi="Arial" w:cs="Arial"/>
+        </w:rPr>
+      </w:pPr>
+    </w:p>
+    <w:p>
+      <w:pPr>
+        <w:rPr>
+          <w:rFonts w:ascii="Arial" w:hAnsi="Arial" w:cs="Arial"/>
+        </w:rPr>
+      </w:pPr>
+    </w:p>
+    <w:p>
+      <w:pPr>
+        <w:rPr>
+          <w:rFonts w:ascii="Arial" w:hAnsi="Arial" w:cs="Arial"/>
+        </w:rPr>
+      </w:pPr>
+    </w:p>
+    <w:tbl>
+      <w:tblPr>
+        <w:tblStyle w:val="TableGrid"/>
+        <w:tblpPr w:leftFromText="180" w:rightFromText="180" w:vertAnchor="page" w:horzAnchor="margin" w:tblpX="-856" w:tblpY="314"/>
+        <w:tblW w:w="10892" w:type="dxa"/>
+        <w:tblLook w:val="04A0" w:firstRow="1" w:lastRow="0" w:firstColumn="1" w:lastColumn="0" w:noHBand="0" w:noVBand="1"/>
+      </w:tblPr>
+      <w:tblGrid>
+        <w:gridCol w:w="10892"/>
+      </w:tblGrid>
+      <w:tr>
+        <w:trPr>
+          <w:trHeight w:val="505"/>
+        </w:trPr>
+        <w:tc>
+          <w:tcPr>
+            <w:tcW w:w="10892" w:type="dxa"/>
+          </w:tcPr>
+          <w:p>
+            <w:pPr>
+              <w:rPr>
+                <w:rFonts w:ascii="Open Sans" w:hAnsi="Open Sans" w:cs="Open Sans"/>
+                <w:sz w:val="18"/>
+                <w:szCs w:val="18"/>
+              </w:rPr>
+            </w:pPr>
+            <w:r>
+              <w:rPr>
+                <w:rFonts w:ascii="Open Sans" w:hAnsi="Open Sans" w:cs="Open Sans"/>
+                <w:b/>
+                <w:bCs/>
+                <w:sz w:val="18"/>
+                <w:szCs w:val="18"/>
+              </w:rPr>
+              <w:t>Lecturer’s Name:</w:t>
+            </w:r>
+            <w:r>
+              <w:rPr>
+                <w:rFonts w:ascii="Open Sans" w:hAnsi="Open Sans" w:cs="Open Sans"/>
+                <w:sz w:val="18"/>
+                <w:szCs w:val="18"/>
+              </w:rPr>
+              <w:t xml:space="preserve">  </w:t>
+            </w:r>
+            <w:r>
+              <w:rPr>
+                <w:rFonts w:ascii="Open Sans" w:hAnsi="Open Sans" w:cs="Open Sans"/>
+                <w:b/>
+                <w:bCs/>
+                <w:sz w:val="18"/>
+                <w:szCs w:val="18"/>
+              </w:rPr>
+              <w:t xml:space="preserve">Ruth </w:t>
+            </w:r>
+            <w:r>
+              <w:rPr>
+                <w:rFonts w:ascii="Open Sans" w:hAnsi="Open Sans" w:cs="Open Sans"/>
+                <w:b/>
+                <w:bCs/>
+                <w:sz w:val="18"/>
+                <w:szCs w:val="18"/>
+              </w:rPr>
+              <w:t>Lennon</w:t>
+            </w:r>
+          </w:p>
+        </w:tc>
+      </w:tr>
+      <w:tr>
+        <w:trPr>
+          <w:trHeight w:val="518"/>
+        </w:trPr>
+        <w:tc>
+          <w:tcPr>
+            <w:tcW w:w="10892" w:type="dxa"/>
+          </w:tcPr>
+          <w:p>
+            <w:pPr>
+              <w:rPr>
+                <w:rFonts w:ascii="Open Sans" w:hAnsi="Open Sans" w:cs="Open Sans"/>
+                <w:b/>
+                <w:bCs/>
+                <w:sz w:val="18"/>
+                <w:szCs w:val="18"/>
+              </w:rPr>
+            </w:pPr>
+            <w:r>
+              <w:rPr>
+                <w:rFonts w:ascii="Open Sans" w:hAnsi="Open Sans" w:cs="Open Sans"/>
+                <w:b/>
+                <w:bCs/>
+                <w:sz w:val="18"/>
+                <w:szCs w:val="18"/>
+              </w:rPr>
+              <w:t>Assessment Title:</w:t>
+            </w:r>
+            <w:r>
+              <w:rPr>
+                <w:rFonts w:ascii="Open Sans" w:hAnsi="Open Sans" w:cs="Open Sans"/>
+                <w:b/>
+                <w:bCs/>
+                <w:sz w:val="18"/>
+                <w:szCs w:val="18"/>
+              </w:rPr>
+              <w:t xml:space="preserve"> </w:t>
+            </w:r>
+            <w:r>
+              <w:rPr>
+                <w:rFonts w:ascii="Open Sans" w:hAnsi="Open Sans" w:cs="Open Sans"/>
+                <w:b/>
+                <w:bCs/>
+                <w:sz w:val="18"/>
+                <w:szCs w:val="18"/>
+              </w:rPr>
+              <w:t>Hashing Algorithms Assignment</w:t>
+            </w:r>
+          </w:p>
+        </w:tc>
+      </w:tr>
+      <w:tr>
+        <w:trPr>
+          <w:trHeight w:val="505"/>
+        </w:trPr>
+        <w:tc>
+          <w:tcPr>
+            <w:tcW w:w="10892" w:type="dxa"/>
+          </w:tcPr>
+          <w:p>
+            <w:pPr>
+              <w:rPr>
+                <w:rFonts w:ascii="Open Sans" w:hAnsi="Open Sans" w:cs="Open Sans"/>
+                <w:b/>
+                <w:bCs/>
+                <w:sz w:val="18"/>
+                <w:szCs w:val="18"/>
+              </w:rPr>
+            </w:pPr>
+            <w:r>
+              <w:rPr>
+                <w:rFonts w:ascii="Open Sans" w:hAnsi="Open Sans" w:cs="Open Sans"/>
+                <w:b/>
+                <w:bCs/>
+                <w:sz w:val="18"/>
+                <w:szCs w:val="18"/>
+              </w:rPr>
+              <w:t xml:space="preserve">Work to be submitted to:  </w:t>
+            </w:r>
+            <w:r>
+              <w:rPr>
+                <w:rFonts w:ascii="Open Sans" w:hAnsi="Open Sans" w:cs="Open Sans"/>
+                <w:b/>
+                <w:bCs/>
+                <w:sz w:val="18"/>
+                <w:szCs w:val="18"/>
+              </w:rPr>
+              <w:t>Ruth Lennon</w:t>
+            </w:r>
+          </w:p>
+        </w:tc>
+      </w:tr>
+      <w:tr>
+        <w:trPr>
+          <w:trHeight w:val="505"/>
+        </w:trPr>
+        <w:tc>
+          <w:tcPr>
+            <w:tcW w:w="10892" w:type="dxa"/>
+          </w:tcPr>
+          <w:p>
+            <w:pPr>
+              <w:rPr>
+                <w:rFonts w:ascii="Open Sans" w:hAnsi="Open Sans" w:cs="Open Sans"/>
+                <w:b/>
+                <w:bCs/>
+                <w:sz w:val="18"/>
+                <w:szCs w:val="18"/>
+              </w:rPr>
+            </w:pPr>
+            <w:r>
+              <w:rPr>
+                <w:rFonts w:ascii="Open Sans" w:hAnsi="Open Sans" w:cs="Open Sans"/>
+                <w:b/>
+                <w:bCs/>
+                <w:sz w:val="18"/>
+                <w:szCs w:val="18"/>
+              </w:rPr>
+              <w:t xml:space="preserve">Date for submission of work:   </w:t>
+            </w:r>
+            <w:r>
+              <w:rPr>
+                <w:rFonts w:ascii="Open Sans" w:hAnsi="Open Sans" w:cs="Open Sans"/>
+                <w:b/>
+                <w:bCs/>
+                <w:sz w:val="18"/>
+                <w:szCs w:val="18"/>
+              </w:rPr>
+              <w:t>29/12/2025</w:t>
+            </w:r>
+            <w:r>
+              <w:rPr>
+                <w:rFonts w:ascii="Open Sans" w:hAnsi="Open Sans" w:cs="Open Sans"/>
+                <w:b/>
+                <w:bCs/>
+                <w:sz w:val="18"/>
+                <w:szCs w:val="18"/>
+              </w:rPr>
+              <w:t xml:space="preserve">                                                                  </w:t>
+            </w:r>
+          </w:p>
+        </w:tc>
+      </w:tr>
+      <w:tr>
+        <w:trPr>
+          <w:trHeight w:val="60"/>
+        </w:trPr>
+        <w:tc>
+          <w:tcPr>
+            <w:tcW w:w="10892" w:type="dxa"/>
+          </w:tcPr>
+          <w:p>
+            <w:pPr>
+              <w:rPr>
+                <w:rFonts w:ascii="Open Sans" w:hAnsi="Open Sans" w:cs="Open Sans"/>
+                <w:b/>
+                <w:bCs/>
+                <w:sz w:val="18"/>
+                <w:szCs w:val="18"/>
+              </w:rPr>
+            </w:pPr>
+            <w:r>
+              <w:rPr>
+                <w:rFonts w:ascii="Open Sans" w:hAnsi="Open Sans" w:cs="Open Sans"/>
+                <w:b/>
+                <w:bCs/>
+                <w:sz w:val="18"/>
+                <w:szCs w:val="18"/>
+              </w:rPr>
+              <w:t xml:space="preserve">Place and time for submitting work:    </w:t>
+            </w:r>
+            <w:proofErr w:type="spellStart"/>
+            <w:r>
+              <w:rPr>
+                <w:rFonts w:ascii="Open Sans" w:hAnsi="Open Sans" w:cs="Open Sans"/>
+                <w:b/>
+                <w:bCs/>
+                <w:sz w:val="18"/>
+                <w:szCs w:val="18"/>
+              </w:rPr>
+              <w:t>BlackBoard</w:t>
+            </w:r>
+            <w:proofErr w:type="spellEnd"/>
+            <w:r>
+              <w:rPr>
+                <w:rFonts w:ascii="Open Sans" w:hAnsi="Open Sans" w:cs="Open Sans"/>
+                <w:b/>
+                <w:bCs/>
+                <w:sz w:val="18"/>
+                <w:szCs w:val="18"/>
+              </w:rPr>
+              <w:t>/GitHub</w:t>
+            </w:r>
+            <w:r>
+              <w:rPr>
+                <w:rFonts w:ascii="Open Sans" w:hAnsi="Open Sans" w:cs="Open Sans"/>
+                <w:b/>
+                <w:bCs/>
+                <w:sz w:val="18"/>
+                <w:szCs w:val="18"/>
+              </w:rPr>
+              <w:t xml:space="preserve">                                                                  </w:t>
+            </w:r>
+          </w:p>
+        </w:tc>
+      </w:tr>
+    </w:tbl>
+    <w:p>
+      <w:pPr>
+        <w:rPr>
+          <w:rFonts w:ascii="Open Sans" w:hAnsi="Open Sans" w:cs="Open Sans"/>
+          <w:sz w:val="18"/>
+          <w:szCs w:val="18"/>
+        </w:rPr>
+      </w:pPr>
+    </w:p>
+    <w:tbl>
+      <w:tblPr>
+        <w:tblStyle w:val="TableGrid"/>
+        <w:tblW w:w="11103" w:type="dxa"/>
+        <w:tblInd w:w="-807" w:type="dxa"/>
+        <w:tblLook w:val="04A0" w:firstRow="1" w:lastRow="0" w:firstColumn="1" w:lastColumn="0" w:noHBand="0" w:noVBand="1"/>
+      </w:tblPr>
+      <w:tblGrid>
+        <w:gridCol w:w="10867"/>
+        <w:gridCol w:w="236"/>
+      </w:tblGrid>
+      <w:tr>
+        <w:trPr>
+          <w:gridAfter w:val="1"/>
+          <w:wAfter w:w="236" w:type="dxa"/>
+        </w:trPr>
+        <w:tc>
+          <w:tcPr>
+            <w:tcW w:w="10867" w:type="dxa"/>
+          </w:tcPr>
+          <w:p>
+            <w:pPr>
+              <w:pStyle w:val="Heading3"/>
+              <w:numPr>
+                <w:ilvl w:val="0"/>
+                <w:numId w:val="0"/>
+              </w:numPr>
+              <w:ind w:left="720"/>
+              <w:rPr>
+                <w:rFonts w:ascii="Open Sans" w:hAnsi="Open Sans" w:cs="Open Sans"/>
+                <w:sz w:val="18"/>
+                <w:szCs w:val="18"/>
+              </w:rPr>
+            </w:pPr>
+            <w:r>
+              <w:rPr>
+                <w:rFonts w:ascii="Open Sans" w:hAnsi="Open Sans" w:cs="Open Sans"/>
+                <w:sz w:val="18"/>
+                <w:szCs w:val="18"/>
+              </w:rPr>
+              <w:t xml:space="preserve">                </w:t>
+            </w:r>
+            <w:r>
+              <w:rPr>
+                <w:rFonts w:ascii="Open Sans" w:hAnsi="Open Sans" w:cs="Open Sans"/>
+                <w:sz w:val="18"/>
+                <w:szCs w:val="18"/>
+              </w:rPr>
+              <w:t xml:space="preserve">                                          </w:t>
+            </w:r>
+            <w:r>
+              <w:rPr>
+                <w:rFonts w:ascii="Open Sans" w:hAnsi="Open Sans" w:cs="Open Sans"/>
+                <w:sz w:val="18"/>
+                <w:szCs w:val="18"/>
+              </w:rPr>
+              <w:t xml:space="preserve">  </w:t>
+            </w:r>
+            <w:bookmarkStart w:id="1" w:name="_Toc215009748"/>
+            <w:r>
+              <w:rPr>
+                <w:rFonts w:ascii="Open Sans" w:hAnsi="Open Sans" w:cs="Open Sans"/>
+                <w:sz w:val="18"/>
+                <w:szCs w:val="18"/>
+              </w:rPr>
+              <w:t xml:space="preserve">To be completed by the </w:t>
+            </w:r>
+            <w:r>
+              <w:rPr>
+                <w:rFonts w:ascii="Open Sans" w:hAnsi="Open Sans" w:cs="Open Sans"/>
+                <w:sz w:val="18"/>
+                <w:szCs w:val="18"/>
+              </w:rPr>
+              <w:t>student</w:t>
+            </w:r>
+            <w:bookmarkEnd w:id="1"/>
+          </w:p>
+        </w:tc>
+      </w:tr>
+      <w:tr>
+        <w:trPr>
+          <w:gridAfter w:val="1"/>
+          <w:wAfter w:w="236" w:type="dxa"/>
+        </w:trPr>
+        <w:tc>
+          <w:tcPr>
+            <w:tcW w:w="10867" w:type="dxa"/>
+          </w:tcPr>
+          <w:p>
+            <w:pPr>
+              <w:rPr>
+                <w:rFonts w:ascii="Open Sans" w:hAnsi="Open Sans" w:cs="Open Sans"/>
+                <w:b/>
+                <w:bCs/>
+                <w:sz w:val="18"/>
+                <w:szCs w:val="18"/>
+              </w:rPr>
+            </w:pPr>
+            <w:r>
+              <w:rPr>
+                <w:rFonts w:ascii="Open Sans" w:hAnsi="Open Sans" w:cs="Open Sans"/>
+                <w:b/>
+                <w:bCs/>
+                <w:sz w:val="18"/>
+                <w:szCs w:val="18"/>
+              </w:rPr>
+              <w:t xml:space="preserve">Student’s Name: Oisin Gibson   </w:t>
+            </w:r>
+          </w:p>
+        </w:tc>
+      </w:tr>
+      <w:tr>
+        <w:trPr>
+          <w:gridAfter w:val="1"/>
+          <w:wAfter w:w="236" w:type="dxa"/>
+        </w:trPr>
+        <w:tc>
+          <w:tcPr>
+            <w:tcW w:w="10867" w:type="dxa"/>
+          </w:tcPr>
+          <w:p>
+            <w:pPr>
+              <w:rPr>
+                <w:rFonts w:ascii="Open Sans" w:hAnsi="Open Sans" w:cs="Open Sans"/>
+                <w:b/>
+                <w:bCs/>
+                <w:sz w:val="18"/>
+                <w:szCs w:val="18"/>
+              </w:rPr>
+            </w:pPr>
+            <w:r>
+              <w:rPr>
+                <w:rFonts w:ascii="Open Sans" w:hAnsi="Open Sans" w:cs="Open Sans"/>
+                <w:b/>
+                <w:bCs/>
+                <w:sz w:val="18"/>
+                <w:szCs w:val="18"/>
+              </w:rPr>
+              <w:t xml:space="preserve">Class: </w:t>
+            </w:r>
+            <w:r>
+              <w:rPr>
+                <w:rFonts w:ascii="Open Sans" w:hAnsi="Open Sans" w:cs="Open Sans"/>
+                <w:b/>
+                <w:bCs/>
+                <w:sz w:val="18"/>
+                <w:szCs w:val="18"/>
+              </w:rPr>
+              <w:t>BSC Computing</w:t>
+            </w:r>
+          </w:p>
+        </w:tc>
+      </w:tr>
+      <w:tr>
+        <w:trPr>
+          <w:gridAfter w:val="1"/>
+          <w:wAfter w:w="236" w:type="dxa"/>
+        </w:trPr>
+        <w:tc>
+          <w:tcPr>
+            <w:tcW w:w="10867" w:type="dxa"/>
+          </w:tcPr>
+          <w:p>
+            <w:pPr>
+              <w:rPr>
+                <w:rFonts w:ascii="Open Sans" w:hAnsi="Open Sans" w:cs="Open Sans"/>
+                <w:sz w:val="18"/>
+                <w:szCs w:val="18"/>
+              </w:rPr>
+            </w:pPr>
+            <w:r>
+              <w:rPr>
+                <w:rFonts w:ascii="Open Sans" w:hAnsi="Open Sans" w:cs="Open Sans"/>
+                <w:b/>
+                <w:bCs/>
+                <w:sz w:val="18"/>
+                <w:szCs w:val="18"/>
+              </w:rPr>
+              <w:t xml:space="preserve">Subject/Module: </w:t>
+            </w:r>
+            <w:r>
+              <w:rPr>
+                <w:rFonts w:ascii="Open Sans" w:hAnsi="Open Sans" w:cs="Open Sans"/>
+                <w:b/>
+                <w:bCs/>
+                <w:sz w:val="18"/>
+                <w:szCs w:val="18"/>
+              </w:rPr>
+              <w:t>Advanced Algorithms and Data Structures</w:t>
+            </w:r>
+          </w:p>
+        </w:tc>
+      </w:tr>
+      <w:tr>
+        <w:trPr>
+          <w:gridAfter w:val="1"/>
+          <w:wAfter w:w="236" w:type="dxa"/>
+        </w:trPr>
+        <w:tc>
+          <w:tcPr>
+            <w:tcW w:w="10867" w:type="dxa"/>
+          </w:tcPr>
+          <w:p>
+            <w:pPr>
+              <w:rPr>
+                <w:rFonts w:ascii="Open Sans" w:hAnsi="Open Sans" w:cs="Open Sans"/>
+                <w:b/>
+                <w:bCs/>
+                <w:sz w:val="18"/>
+                <w:szCs w:val="18"/>
+              </w:rPr>
+            </w:pPr>
+            <w:r>
+              <w:rPr>
+                <w:rFonts w:ascii="Open Sans" w:hAnsi="Open Sans" w:cs="Open Sans"/>
+                <w:b/>
+                <w:bCs/>
+                <w:sz w:val="18"/>
+                <w:szCs w:val="18"/>
+              </w:rPr>
+              <w:t xml:space="preserve">Word Count (where applicable):  </w:t>
+            </w:r>
+          </w:p>
+        </w:tc>
+      </w:tr>
+      <w:tr>
+        <w:trPr>
+          <w:gridAfter w:val="1"/>
+          <w:wAfter w:w="236" w:type="dxa"/>
+        </w:trPr>
+        <w:tc>
+          <w:tcPr>
+            <w:tcW w:w="10867" w:type="dxa"/>
+          </w:tcPr>
+          <w:p>
+            <w:pPr>
+              <w:rPr>
+                <w:rFonts w:ascii="Open Sans" w:hAnsi="Open Sans" w:cs="Open Sans"/>
+                <w:b/>
+                <w:bCs/>
+                <w:sz w:val="18"/>
+                <w:szCs w:val="18"/>
+              </w:rPr>
+            </w:pPr>
+            <w:r>
+              <w:rPr>
+                <w:rFonts w:ascii="Open Sans" w:hAnsi="Open Sans" w:cs="Open Sans"/>
+                <w:b/>
+                <w:bCs/>
+                <w:sz w:val="18"/>
+                <w:szCs w:val="18"/>
+              </w:rPr>
+              <w:t>I confirm that the work submitted has been produced solely through my own efforts.</w:t>
+            </w:r>
+          </w:p>
+          <w:p>
+            <w:pPr>
+              <w:rPr>
+                <w:rFonts w:ascii="Open Sans" w:hAnsi="Open Sans" w:cs="Open Sans"/>
+                <w:sz w:val="18"/>
+                <w:szCs w:val="18"/>
+              </w:rPr>
+            </w:pPr>
+            <w:r>
+              <w:rPr>
+                <w:rFonts w:ascii="Open Sans" w:hAnsi="Open Sans" w:cs="Open Sans"/>
+                <w:b/>
+                <w:bCs/>
+                <w:sz w:val="18"/>
+                <w:szCs w:val="18"/>
+              </w:rPr>
+              <w:t>Student’s signature:  Oisin Gibson</w:t>
+            </w:r>
+            <w:r>
+              <w:rPr>
+                <w:rFonts w:ascii="Open Sans" w:hAnsi="Open Sans" w:cs="Open Sans"/>
+                <w:b/>
+                <w:bCs/>
+                <w:sz w:val="18"/>
+                <w:szCs w:val="18"/>
+              </w:rPr>
+              <w:tab/>
+            </w:r>
+            <w:r>
+              <w:rPr>
+                <w:rFonts w:ascii="Open Sans" w:hAnsi="Open Sans" w:cs="Open Sans"/>
+                <w:b/>
+                <w:bCs/>
+                <w:sz w:val="18"/>
+                <w:szCs w:val="18"/>
+              </w:rPr>
+              <w:tab/>
+              <w:t xml:space="preserve">Date:  </w:t>
+            </w:r>
+            <w:r>
+              <w:rPr>
+                <w:rFonts w:ascii="Open Sans" w:hAnsi="Open Sans" w:cs="Open Sans"/>
+                <w:sz w:val="18"/>
+                <w:szCs w:val="18"/>
+              </w:rPr>
+              <w:tab/>
+            </w:r>
+            <w:r>
+              <w:rPr>
+                <w:rFonts w:ascii="Open Sans" w:hAnsi="Open Sans" w:cs="Open Sans"/>
+                <w:sz w:val="18"/>
+                <w:szCs w:val="18"/>
+              </w:rPr>
+              <w:tab/>
+            </w:r>
+          </w:p>
+        </w:tc>
+      </w:tr>
+      <w:tr>
+        <w:trPr>
+          <w:gridAfter w:val="1"/>
+          <w:wAfter w:w="236" w:type="dxa"/>
+        </w:trPr>
+        <w:tc>
+          <w:tcPr>
+            <w:tcW w:w="10867" w:type="dxa"/>
+          </w:tcPr>
+          <w:p>
+            <w:pPr>
+              <w:pStyle w:val="BodyText"/>
+              <w:jc w:val="center"/>
+              <w:rPr>
+                <w:rFonts w:ascii="Open Sans" w:hAnsi="Open Sans" w:cs="Open Sans"/>
+                <w:sz w:val="16"/>
+                <w:szCs w:val="16"/>
+              </w:rPr>
+            </w:pPr>
+            <w:r>
+              <w:rPr>
+                <w:rFonts w:ascii="Open Sans" w:hAnsi="Open Sans" w:cs="Open Sans"/>
+                <w:b/>
+                <w:bCs/>
+                <w:sz w:val="16"/>
+                <w:szCs w:val="16"/>
+              </w:rPr>
+              <w:t>Notes</w:t>
+            </w:r>
+          </w:p>
+          <w:p>
+            <w:pPr>
+              <w:pStyle w:val="NoSpacing"/>
+              <w:spacing w:line="276" w:lineRule="auto"/>
+              <w:rPr>
+                <w:rFonts w:ascii="Open Sans" w:hAnsi="Open Sans" w:cs="Open Sans"/>
+                <w:sz w:val="18"/>
+                <w:szCs w:val="18"/>
+              </w:rPr>
+            </w:pPr>
+            <w:r>
+              <w:rPr>
+                <w:rFonts w:ascii="Open Sans" w:hAnsi="Open Sans" w:cs="Open Sans"/>
+                <w:b/>
+                <w:bCs/>
+                <w:sz w:val="18"/>
+                <w:szCs w:val="18"/>
+              </w:rPr>
+              <w:t>Penalties</w:t>
+            </w:r>
+            <w:proofErr w:type="gramStart"/>
+            <w:r>
+              <w:rPr>
+                <w:rFonts w:ascii="Open Sans" w:hAnsi="Open Sans" w:cs="Open Sans"/>
+                <w:b/>
+                <w:bCs/>
+                <w:sz w:val="18"/>
+                <w:szCs w:val="18"/>
+              </w:rPr>
+              <w:t xml:space="preserve">:  </w:t>
+            </w:r>
+            <w:r>
+              <w:rPr>
+                <w:rFonts w:ascii="Open Sans" w:hAnsi="Open Sans" w:cs="Open Sans"/>
+                <w:sz w:val="18"/>
+                <w:szCs w:val="18"/>
+              </w:rPr>
+              <w:t>The</w:t>
+            </w:r>
+            <w:proofErr w:type="gramEnd"/>
+            <w:r>
+              <w:rPr>
+                <w:rFonts w:ascii="Open Sans" w:hAnsi="Open Sans" w:cs="Open Sans"/>
+                <w:sz w:val="18"/>
+                <w:szCs w:val="18"/>
+              </w:rPr>
+              <w:t xml:space="preserve"> total marks available for an assessment </w:t>
+            </w:r>
+            <w:proofErr w:type="gramStart"/>
+            <w:r>
+              <w:rPr>
+                <w:rFonts w:ascii="Open Sans" w:hAnsi="Open Sans" w:cs="Open Sans"/>
+                <w:sz w:val="18"/>
+                <w:szCs w:val="18"/>
+              </w:rPr>
+              <w:t>is</w:t>
+            </w:r>
+            <w:proofErr w:type="gramEnd"/>
+            <w:r>
+              <w:rPr>
+                <w:rFonts w:ascii="Open Sans" w:hAnsi="Open Sans" w:cs="Open Sans"/>
+                <w:sz w:val="18"/>
+                <w:szCs w:val="18"/>
+              </w:rPr>
+              <w:t xml:space="preserve"> reduced by 15% for work submitted up to one week </w:t>
+            </w:r>
+            <w:proofErr w:type="gramStart"/>
+            <w:r>
+              <w:rPr>
+                <w:rFonts w:ascii="Open Sans" w:hAnsi="Open Sans" w:cs="Open Sans"/>
+                <w:sz w:val="18"/>
+                <w:szCs w:val="18"/>
+              </w:rPr>
+              <w:t>late</w:t>
+            </w:r>
+            <w:proofErr w:type="gramEnd"/>
+            <w:r>
+              <w:rPr>
+                <w:rFonts w:ascii="Open Sans" w:hAnsi="Open Sans" w:cs="Open Sans"/>
+                <w:sz w:val="18"/>
+                <w:szCs w:val="18"/>
+              </w:rPr>
+              <w:t xml:space="preserve">.  The total marks available are reduced by 30% for work up to two weeks </w:t>
+            </w:r>
+            <w:proofErr w:type="gramStart"/>
+            <w:r>
+              <w:rPr>
+                <w:rFonts w:ascii="Open Sans" w:hAnsi="Open Sans" w:cs="Open Sans"/>
+                <w:sz w:val="18"/>
+                <w:szCs w:val="18"/>
+              </w:rPr>
+              <w:t>late</w:t>
+            </w:r>
+            <w:proofErr w:type="gramEnd"/>
+            <w:r>
+              <w:rPr>
+                <w:rFonts w:ascii="Open Sans" w:hAnsi="Open Sans" w:cs="Open Sans"/>
+                <w:sz w:val="18"/>
+                <w:szCs w:val="18"/>
+              </w:rPr>
+              <w:t xml:space="preserve">.  Assessment work received more than two weeks </w:t>
+            </w:r>
+            <w:proofErr w:type="gramStart"/>
+            <w:r>
+              <w:rPr>
+                <w:rFonts w:ascii="Open Sans" w:hAnsi="Open Sans" w:cs="Open Sans"/>
+                <w:sz w:val="18"/>
+                <w:szCs w:val="18"/>
+              </w:rPr>
+              <w:t>late</w:t>
+            </w:r>
+            <w:proofErr w:type="gramEnd"/>
+            <w:r>
+              <w:rPr>
+                <w:rFonts w:ascii="Open Sans" w:hAnsi="Open Sans" w:cs="Open Sans"/>
+                <w:sz w:val="18"/>
+                <w:szCs w:val="18"/>
+              </w:rPr>
+              <w:t xml:space="preserve"> will receive a mark of zero.  </w:t>
+            </w:r>
+          </w:p>
+          <w:p>
+            <w:pPr>
+              <w:pStyle w:val="NoSpacing"/>
+              <w:spacing w:line="276" w:lineRule="auto"/>
+              <w:rPr>
+                <w:rFonts w:ascii="Open Sans" w:hAnsi="Open Sans" w:cs="Open Sans"/>
+                <w:sz w:val="18"/>
+                <w:szCs w:val="18"/>
+              </w:rPr>
+            </w:pPr>
+            <w:r>
+              <w:rPr>
+                <w:rFonts w:ascii="Open Sans" w:hAnsi="Open Sans" w:cs="Open Sans"/>
+                <w:b/>
+                <w:bCs/>
+                <w:sz w:val="18"/>
+                <w:szCs w:val="18"/>
+              </w:rPr>
+              <w:t>Continuous Assessment</w:t>
+            </w:r>
+            <w:proofErr w:type="gramStart"/>
+            <w:r>
+              <w:rPr>
+                <w:rFonts w:ascii="Open Sans" w:hAnsi="Open Sans" w:cs="Open Sans"/>
+                <w:b/>
+                <w:bCs/>
+                <w:sz w:val="18"/>
+                <w:szCs w:val="18"/>
+              </w:rPr>
+              <w:t>:</w:t>
+            </w:r>
+            <w:r>
+              <w:rPr>
+                <w:rFonts w:ascii="Open Sans" w:hAnsi="Open Sans" w:cs="Open Sans"/>
+                <w:sz w:val="18"/>
+                <w:szCs w:val="18"/>
+              </w:rPr>
+              <w:t xml:space="preserve">  For</w:t>
+            </w:r>
+            <w:proofErr w:type="gramEnd"/>
+            <w:r>
+              <w:rPr>
+                <w:rFonts w:ascii="Open Sans" w:hAnsi="Open Sans" w:cs="Open Sans"/>
+                <w:sz w:val="18"/>
+                <w:szCs w:val="18"/>
+              </w:rPr>
+              <w:t xml:space="preserve"> students repeating an examination, marks awarded for continuous assessment shall normally be carried forward from the original examination to the repeat examination.</w:t>
+            </w:r>
+          </w:p>
+          <w:p>
+            <w:pPr>
+              <w:pStyle w:val="NoSpacing"/>
+              <w:spacing w:line="276" w:lineRule="auto"/>
+              <w:rPr>
+                <w:rFonts w:ascii="Open Sans" w:hAnsi="Open Sans" w:cs="Open Sans"/>
+                <w:b/>
+                <w:sz w:val="18"/>
+                <w:szCs w:val="18"/>
+              </w:rPr>
+            </w:pPr>
+            <w:r>
+              <w:rPr>
+                <w:rFonts w:ascii="Open Sans" w:hAnsi="Open Sans" w:cs="Open Sans"/>
+                <w:b/>
+                <w:sz w:val="18"/>
+                <w:szCs w:val="18"/>
+              </w:rPr>
+              <w:t>Declaration:</w:t>
+            </w:r>
+          </w:p>
+          <w:p>
+            <w:pPr>
+              <w:pStyle w:val="NoSpacing"/>
+              <w:spacing w:line="276" w:lineRule="auto"/>
+              <w:rPr>
+                <w:rFonts w:ascii="Open Sans" w:hAnsi="Open Sans" w:cs="Open Sans"/>
+                <w:b/>
+                <w:sz w:val="18"/>
+                <w:szCs w:val="18"/>
+              </w:rPr>
+            </w:pPr>
+            <w:r>
+              <w:rPr>
+                <w:rFonts w:ascii="Open Sans" w:hAnsi="Open Sans" w:cs="Open Sans"/>
+                <w:sz w:val="18"/>
+                <w:szCs w:val="18"/>
+              </w:rPr>
+              <w:t xml:space="preserve">I declare that this work is entirely my own and does not contain the words or ideas of someone else, whether published or not, without specific acknowledgement by relevant </w:t>
+            </w:r>
+            <w:proofErr w:type="gramStart"/>
+            <w:r>
+              <w:rPr>
+                <w:rFonts w:ascii="Open Sans" w:hAnsi="Open Sans" w:cs="Open Sans"/>
+                <w:sz w:val="18"/>
+                <w:szCs w:val="18"/>
+              </w:rPr>
+              <w:t>referencing</w:t>
+            </w:r>
+            <w:proofErr w:type="gramEnd"/>
+            <w:r>
+              <w:rPr>
+                <w:rFonts w:ascii="Open Sans" w:hAnsi="Open Sans" w:cs="Open Sans"/>
+                <w:sz w:val="18"/>
+                <w:szCs w:val="18"/>
+              </w:rPr>
+              <w:t xml:space="preserve">. I have read and understood the </w:t>
+            </w:r>
+            <w:r>
+              <w:rPr>
+                <w:rFonts w:ascii="Open Sans" w:hAnsi="Open Sans" w:cs="Open Sans"/>
+                <w:sz w:val="18"/>
+                <w:szCs w:val="18"/>
+              </w:rPr>
+              <w:t>ATU Donegal</w:t>
+            </w:r>
+            <w:r>
+              <w:rPr>
+                <w:rFonts w:ascii="Open Sans" w:hAnsi="Open Sans" w:cs="Open Sans"/>
+                <w:sz w:val="18"/>
+                <w:szCs w:val="18"/>
+              </w:rPr>
+              <w:t xml:space="preserve"> Plagiarism Policy on the “Student &amp; Academic Policies” section of the </w:t>
+            </w:r>
+            <w:r>
+              <w:rPr>
+                <w:rFonts w:ascii="Open Sans" w:hAnsi="Open Sans" w:cs="Open Sans"/>
+                <w:sz w:val="18"/>
+                <w:szCs w:val="18"/>
+              </w:rPr>
+              <w:t>ATU Donegal</w:t>
+            </w:r>
+            <w:r>
+              <w:rPr>
+                <w:rFonts w:ascii="Open Sans" w:hAnsi="Open Sans" w:cs="Open Sans"/>
+                <w:sz w:val="18"/>
+                <w:szCs w:val="18"/>
+              </w:rPr>
+              <w:t xml:space="preserve"> Website and understand plagiarism to include:</w:t>
+            </w:r>
+          </w:p>
+          <w:p>
+            <w:pPr>
+              <w:pStyle w:val="NoSpacing"/>
+              <w:spacing w:line="276" w:lineRule="auto"/>
+              <w:rPr>
+                <w:rFonts w:ascii="Open Sans" w:hAnsi="Open Sans" w:cs="Open Sans"/>
+                <w:sz w:val="18"/>
+                <w:szCs w:val="18"/>
+              </w:rPr>
+            </w:pPr>
+            <w:r>
+              <w:rPr>
+                <w:rFonts w:ascii="Open Sans" w:hAnsi="Open Sans" w:cs="Open Sans"/>
+                <w:sz w:val="18"/>
+                <w:szCs w:val="18"/>
+              </w:rPr>
+              <w:t>Direct copying of text, images and other materials (electronic or otherwise) from a book, article, fellow student’s essay, handout, web page or other source without proper acknowledgement.</w:t>
+            </w:r>
+          </w:p>
+          <w:p>
+            <w:pPr>
+              <w:pStyle w:val="NoSpacing"/>
+              <w:spacing w:line="276" w:lineRule="auto"/>
+              <w:rPr>
+                <w:rFonts w:ascii="Open Sans" w:hAnsi="Open Sans" w:cs="Open Sans"/>
+                <w:sz w:val="18"/>
+                <w:szCs w:val="18"/>
+              </w:rPr>
+            </w:pPr>
+            <w:r>
+              <w:rPr>
+                <w:rFonts w:ascii="Open Sans" w:hAnsi="Open Sans" w:cs="Open Sans"/>
+                <w:sz w:val="18"/>
+                <w:szCs w:val="18"/>
+              </w:rPr>
+              <w:t>Claiming individual ideas derived from a book, article etc. as one’s own and incorporating them into one’s work without acknowledging the source of these ideas.</w:t>
+            </w:r>
+          </w:p>
+          <w:p>
+            <w:pPr>
+              <w:pStyle w:val="NoSpacing"/>
+              <w:spacing w:line="276" w:lineRule="auto"/>
+              <w:rPr>
+                <w:rFonts w:ascii="Open Sans" w:hAnsi="Open Sans" w:cs="Open Sans"/>
+                <w:sz w:val="18"/>
+                <w:szCs w:val="18"/>
+              </w:rPr>
+            </w:pPr>
+            <w:r>
+              <w:rPr>
+                <w:rFonts w:ascii="Open Sans" w:hAnsi="Open Sans" w:cs="Open Sans"/>
+                <w:sz w:val="18"/>
+                <w:szCs w:val="18"/>
+              </w:rPr>
+              <w:t xml:space="preserve">Overly depending on the work of one or more other sources without proper acknowledgement of the source, by constructing an essay, project etc., extracting large sections of text from another source and merely linking these together with a few of one’s own sentences. </w:t>
+            </w:r>
+          </w:p>
+          <w:p>
+            <w:pPr>
+              <w:pStyle w:val="NoSpacing"/>
+              <w:spacing w:line="276" w:lineRule="auto"/>
+              <w:rPr>
+                <w:rFonts w:ascii="Open Sans" w:hAnsi="Open Sans" w:cs="Open Sans"/>
+                <w:sz w:val="18"/>
+                <w:szCs w:val="18"/>
+              </w:rPr>
+            </w:pPr>
+            <w:r>
+              <w:rPr>
+                <w:rFonts w:ascii="Open Sans" w:hAnsi="Open Sans" w:cs="Open Sans"/>
+                <w:sz w:val="18"/>
+                <w:szCs w:val="18"/>
+              </w:rPr>
+              <w:t xml:space="preserve">I understand that it is my responsibility to </w:t>
+            </w:r>
+            <w:proofErr w:type="spellStart"/>
+            <w:r>
+              <w:rPr>
+                <w:rFonts w:ascii="Open Sans" w:hAnsi="Open Sans" w:cs="Open Sans"/>
+                <w:sz w:val="18"/>
+                <w:szCs w:val="18"/>
+              </w:rPr>
+              <w:t>familiarise</w:t>
+            </w:r>
+            <w:proofErr w:type="spellEnd"/>
+            <w:r>
+              <w:rPr>
+                <w:rFonts w:ascii="Open Sans" w:hAnsi="Open Sans" w:cs="Open Sans"/>
+                <w:sz w:val="18"/>
+                <w:szCs w:val="18"/>
+              </w:rPr>
+              <w:t xml:space="preserve"> myself with and to follow the Institute’s Assessment Regulations. I acknowledge that Incidents of alleged plagiarism and cheating are dealt with in accordance with the Institute’s Assessment Regulations and that penalties will be applied if I breach this policy.</w:t>
+            </w:r>
+          </w:p>
+          <w:p>
+            <w:pPr>
+              <w:rPr>
+                <w:rFonts w:ascii="Open Sans" w:hAnsi="Open Sans" w:cs="Open Sans"/>
+              </w:rPr>
+            </w:pPr>
+          </w:p>
+        </w:tc>
+      </w:tr>
+      <w:tr>
+        <w:trPr>
+          <w:trHeight w:val="844"/>
+        </w:trPr>
+        <w:tc>
+          <w:tcPr>
+            <w:tcW w:w="10867" w:type="dxa"/>
+          </w:tcPr>
+          <w:p>
+            <w:pPr>
+              <w:rPr>
+                <w:rFonts w:ascii="Open Sans" w:hAnsi="Open Sans" w:cs="Open Sans"/>
+                <w:b/>
+                <w:bCs/>
+                <w:sz w:val="16"/>
+                <w:szCs w:val="16"/>
+              </w:rPr>
+            </w:pPr>
+            <w:r>
+              <w:rPr>
+                <w:rFonts w:ascii="Open Sans" w:hAnsi="Open Sans" w:cs="Open Sans"/>
+                <w:b/>
+                <w:bCs/>
+                <w:sz w:val="16"/>
+                <w:szCs w:val="16"/>
+              </w:rPr>
+              <w:t xml:space="preserve">Signed:     </w:t>
+            </w:r>
+            <w:r>
+              <w:rPr>
+                <w:rFonts w:ascii="Open Sans" w:hAnsi="Open Sans" w:cs="Open Sans"/>
+                <w:b/>
+                <w:bCs/>
+                <w:sz w:val="16"/>
+                <w:szCs w:val="16"/>
+              </w:rPr>
+              <w:t>Oisin Gibson</w:t>
+            </w:r>
+            <w:r>
+              <w:rPr>
+                <w:rFonts w:ascii="Open Sans" w:hAnsi="Open Sans" w:cs="Open Sans"/>
+                <w:b/>
+                <w:bCs/>
+                <w:sz w:val="16"/>
+                <w:szCs w:val="16"/>
+              </w:rPr>
+              <w:t xml:space="preserve">   </w:t>
+            </w:r>
+          </w:p>
+          <w:p>
+            <w:pPr>
+              <w:rPr>
+                <w:rFonts w:ascii="Open Sans" w:hAnsi="Open Sans" w:cs="Open Sans"/>
+                <w:b/>
+                <w:bCs/>
+                <w:sz w:val="18"/>
+                <w:szCs w:val="18"/>
+              </w:rPr>
+            </w:pPr>
+            <w:r>
+              <w:rPr>
+                <w:rFonts w:ascii="Open Sans" w:hAnsi="Open Sans" w:cs="Open Sans"/>
+                <w:b/>
+                <w:bCs/>
+                <w:sz w:val="18"/>
+                <w:szCs w:val="18"/>
+              </w:rPr>
+              <w:t>Date:</w:t>
+            </w:r>
+          </w:p>
+        </w:tc>
+        <w:tc>
+          <w:tcPr>
+            <w:tcW w:w="236" w:type="dxa"/>
+          </w:tcPr>
+          <w:p>
+            <w:pPr>
+              <w:rPr>
+                <w:rFonts w:ascii="Open Sans" w:hAnsi="Open Sans" w:cs="Open Sans"/>
+                <w:b/>
+                <w:bCs/>
+                <w:sz w:val="16"/>
+                <w:szCs w:val="16"/>
+              </w:rPr>
+            </w:pPr>
+          </w:p>
+        </w:tc>
+      </w:tr>
+    </w:tbl>
+    <w:p>
+      <w:pPr>
+        <w:rPr>
+          <w:rFonts w:ascii="Arial" w:hAnsi="Arial" w:cs="Arial"/>
+        </w:rPr>
+      </w:pPr>
+    </w:p>
     <w:sdt>
       <w:sdtPr>
+        <w:rPr>
+          <w:rFonts w:ascii="Arial" w:eastAsiaTheme="minorEastAsia" w:hAnsi="Arial" w:cs="Arial"/>
+          <w:color w:val="auto"/>
+          <w:sz w:val="22"/>
+          <w:szCs w:val="22"/>
+          <w:lang w:val="en-IE"/>
+        </w:rPr>
         <w:id w:val="-87074959"/>
         <w:docPartObj>
           <w:docPartGallery w:val="Table of Contents"/>
@@ -577,109 +1801,1796 @@
       </w:sdtPr>
       <w:sdtEndPr>
         <w:rPr>
-          <w:rFonts w:asciiTheme="minorHAnsi" w:eastAsiaTheme="minorEastAsia" w:hAnsiTheme="minorHAnsi" w:cstheme="minorBidi"/>
           <w:b/>
           <w:bCs/>
           <w:noProof/>
-          <w:color w:val="auto"/>
-          <w:sz w:val="22"/>
-          <w:szCs w:val="22"/>
-          <w:lang w:val="en-IE"/>
         </w:rPr>
       </w:sdtEndPr>
       <w:sdtContent>
         <w:p>
           <w:pPr>
             <w:pStyle w:val="TOCHeading"/>
+            <w:numPr>
+              <w:ilvl w:val="0"/>
+              <w:numId w:val="0"/>
+            </w:numPr>
+            <w:ind w:left="432" w:hanging="432"/>
+            <w:rPr>
+              <w:rFonts w:cs="Arial"/>
+            </w:rPr>
           </w:pPr>
           <w:r>
+            <w:rPr>
+              <w:rFonts w:cs="Arial"/>
+            </w:rPr>
             <w:t>Contents</w:t>
           </w:r>
         </w:p>
         <w:p>
-          <w:fldSimple w:instr=" TOC \o &quot;1-3&quot; \h \z \u ">
-            <w:r>
-              <w:rPr>
-                <w:b/>
-                <w:bCs/>
-                <w:noProof/>
-                <w:lang w:val="en-US"/>
-              </w:rPr>
-              <w:t>No table of contents entries found.</w:t>
-            </w:r>
-          </w:fldSimple>
+          <w:pPr>
+            <w:pStyle w:val="TOC3"/>
+            <w:tabs>
+              <w:tab w:val="right" w:leader="dot" w:pos="9016"/>
+            </w:tabs>
+            <w:rPr>
+              <w:noProof/>
+              <w:kern w:val="2"/>
+              <w:sz w:val="24"/>
+              <w:szCs w:val="24"/>
+              <w:lang w:eastAsia="en-IE"/>
+              <w14:ligatures w14:val="standardContextual"/>
+            </w:rPr>
+          </w:pPr>
+          <w:r>
+            <w:rPr>
+              <w:rFonts w:cs="Arial"/>
+              <w:sz w:val="24"/>
+              <w:szCs w:val="24"/>
+            </w:rPr>
+            <w:fldChar w:fldCharType="begin"/>
+          </w:r>
+          <w:r>
+            <w:rPr>
+              <w:rFonts w:cs="Arial"/>
+              <w:sz w:val="24"/>
+              <w:szCs w:val="24"/>
+            </w:rPr>
+            <w:instrText xml:space="preserve"> TOC \o "1-3" \h \z \u </w:instrText>
+          </w:r>
+          <w:r>
+            <w:rPr>
+              <w:rFonts w:cs="Arial"/>
+              <w:sz w:val="24"/>
+              <w:szCs w:val="24"/>
+            </w:rPr>
+            <w:fldChar w:fldCharType="separate"/>
+          </w:r>
+          <w:hyperlink w:anchor="_Toc215009748" w:history="1">
+            <w:r>
+              <w:rPr>
+                <w:rStyle w:val="Hyperlink"/>
+                <w:rFonts w:ascii="Open Sans" w:hAnsi="Open Sans" w:cs="Open Sans"/>
+                <w:noProof/>
+                <w:lang w:bidi="hi-IN"/>
+              </w:rPr>
+              <w:t>To be completed by the student</w:t>
+            </w:r>
+            <w:r>
+              <w:rPr>
+                <w:noProof/>
+                <w:webHidden/>
+              </w:rPr>
+              <w:tab/>
+            </w:r>
+            <w:r>
+              <w:rPr>
+                <w:noProof/>
+                <w:webHidden/>
+              </w:rPr>
+              <w:fldChar w:fldCharType="begin"/>
+            </w:r>
+            <w:r>
+              <w:rPr>
+                <w:noProof/>
+                <w:webHidden/>
+              </w:rPr>
+              <w:instrText xml:space="preserve"> PAGEREF _Toc215009748 \h </w:instrText>
+            </w:r>
+            <w:r>
+              <w:rPr>
+                <w:noProof/>
+                <w:webHidden/>
+              </w:rPr>
+            </w:r>
+            <w:r>
+              <w:rPr>
+                <w:noProof/>
+                <w:webHidden/>
+              </w:rPr>
+              <w:fldChar w:fldCharType="separate"/>
+            </w:r>
+            <w:r>
+              <w:rPr>
+                <w:noProof/>
+                <w:webHidden/>
+              </w:rPr>
+              <w:t>3</w:t>
+            </w:r>
+            <w:r>
+              <w:rPr>
+                <w:noProof/>
+                <w:webHidden/>
+              </w:rPr>
+              <w:fldChar w:fldCharType="end"/>
+            </w:r>
+          </w:hyperlink>
+        </w:p>
+        <w:p>
+          <w:pPr>
+            <w:pStyle w:val="TOC1"/>
+            <w:tabs>
+              <w:tab w:val="left" w:pos="440"/>
+              <w:tab w:val="right" w:leader="dot" w:pos="9016"/>
+            </w:tabs>
+            <w:rPr>
+              <w:noProof/>
+              <w:kern w:val="2"/>
+              <w:sz w:val="24"/>
+              <w:szCs w:val="24"/>
+              <w:lang w:eastAsia="en-IE"/>
+              <w14:ligatures w14:val="standardContextual"/>
+            </w:rPr>
+          </w:pPr>
+          <w:hyperlink w:anchor="_Toc215009749" w:history="1">
+            <w:r>
+              <w:rPr>
+                <w:rStyle w:val="Hyperlink"/>
+                <w:rFonts w:cs="Arial"/>
+                <w:noProof/>
+              </w:rPr>
+              <w:t>1</w:t>
+            </w:r>
+            <w:r>
+              <w:rPr>
+                <w:noProof/>
+                <w:kern w:val="2"/>
+                <w:sz w:val="24"/>
+                <w:szCs w:val="24"/>
+                <w:lang w:eastAsia="en-IE"/>
+                <w14:ligatures w14:val="standardContextual"/>
+              </w:rPr>
+              <w:tab/>
+            </w:r>
+            <w:r>
+              <w:rPr>
+                <w:rStyle w:val="Hyperlink"/>
+                <w:rFonts w:cs="Arial"/>
+                <w:noProof/>
+              </w:rPr>
+              <w:t>Question 1</w:t>
+            </w:r>
+            <w:r>
+              <w:rPr>
+                <w:noProof/>
+                <w:webHidden/>
+              </w:rPr>
+              <w:tab/>
+            </w:r>
+            <w:r>
+              <w:rPr>
+                <w:noProof/>
+                <w:webHidden/>
+              </w:rPr>
+              <w:fldChar w:fldCharType="begin"/>
+            </w:r>
+            <w:r>
+              <w:rPr>
+                <w:noProof/>
+                <w:webHidden/>
+              </w:rPr>
+              <w:instrText xml:space="preserve"> PAGEREF _Toc215009749 \h </w:instrText>
+            </w:r>
+            <w:r>
+              <w:rPr>
+                <w:noProof/>
+                <w:webHidden/>
+              </w:rPr>
+            </w:r>
+            <w:r>
+              <w:rPr>
+                <w:noProof/>
+                <w:webHidden/>
+              </w:rPr>
+              <w:fldChar w:fldCharType="separate"/>
+            </w:r>
+            <w:r>
+              <w:rPr>
+                <w:noProof/>
+                <w:webHidden/>
+              </w:rPr>
+              <w:t>6</w:t>
+            </w:r>
+            <w:r>
+              <w:rPr>
+                <w:noProof/>
+                <w:webHidden/>
+              </w:rPr>
+              <w:fldChar w:fldCharType="end"/>
+            </w:r>
+          </w:hyperlink>
+        </w:p>
+        <w:p>
+          <w:pPr>
+            <w:pStyle w:val="TOC2"/>
+            <w:tabs>
+              <w:tab w:val="left" w:pos="960"/>
+              <w:tab w:val="right" w:leader="dot" w:pos="9016"/>
+            </w:tabs>
+            <w:rPr>
+              <w:noProof/>
+              <w:kern w:val="2"/>
+              <w:sz w:val="24"/>
+              <w:szCs w:val="24"/>
+              <w:lang w:eastAsia="en-IE"/>
+              <w14:ligatures w14:val="standardContextual"/>
+            </w:rPr>
+          </w:pPr>
+          <w:hyperlink w:anchor="_Toc215009750" w:history="1">
+            <w:r>
+              <w:rPr>
+                <w:rStyle w:val="Hyperlink"/>
+                <w:rFonts w:cs="Arial"/>
+                <w:noProof/>
+              </w:rPr>
+              <w:t>1.1</w:t>
+            </w:r>
+            <w:r>
+              <w:rPr>
+                <w:noProof/>
+                <w:kern w:val="2"/>
+                <w:sz w:val="24"/>
+                <w:szCs w:val="24"/>
+                <w:lang w:eastAsia="en-IE"/>
+                <w14:ligatures w14:val="standardContextual"/>
+              </w:rPr>
+              <w:tab/>
+            </w:r>
+            <w:r>
+              <w:rPr>
+                <w:rStyle w:val="Hyperlink"/>
+                <w:rFonts w:cs="Arial"/>
+                <w:noProof/>
+              </w:rPr>
+              <w:t>Hash Function</w:t>
+            </w:r>
+            <w:r>
+              <w:rPr>
+                <w:noProof/>
+                <w:webHidden/>
+              </w:rPr>
+              <w:tab/>
+            </w:r>
+            <w:r>
+              <w:rPr>
+                <w:noProof/>
+                <w:webHidden/>
+              </w:rPr>
+              <w:fldChar w:fldCharType="begin"/>
+            </w:r>
+            <w:r>
+              <w:rPr>
+                <w:noProof/>
+                <w:webHidden/>
+              </w:rPr>
+              <w:instrText xml:space="preserve"> PAGEREF _Toc215009750 \h </w:instrText>
+            </w:r>
+            <w:r>
+              <w:rPr>
+                <w:noProof/>
+                <w:webHidden/>
+              </w:rPr>
+            </w:r>
+            <w:r>
+              <w:rPr>
+                <w:noProof/>
+                <w:webHidden/>
+              </w:rPr>
+              <w:fldChar w:fldCharType="separate"/>
+            </w:r>
+            <w:r>
+              <w:rPr>
+                <w:noProof/>
+                <w:webHidden/>
+              </w:rPr>
+              <w:t>6</w:t>
+            </w:r>
+            <w:r>
+              <w:rPr>
+                <w:noProof/>
+                <w:webHidden/>
+              </w:rPr>
+              <w:fldChar w:fldCharType="end"/>
+            </w:r>
+          </w:hyperlink>
+        </w:p>
+        <w:p>
+          <w:pPr>
+            <w:pStyle w:val="TOC2"/>
+            <w:tabs>
+              <w:tab w:val="left" w:pos="960"/>
+              <w:tab w:val="right" w:leader="dot" w:pos="9016"/>
+            </w:tabs>
+            <w:rPr>
+              <w:noProof/>
+              <w:kern w:val="2"/>
+              <w:sz w:val="24"/>
+              <w:szCs w:val="24"/>
+              <w:lang w:eastAsia="en-IE"/>
+              <w14:ligatures w14:val="standardContextual"/>
+            </w:rPr>
+          </w:pPr>
+          <w:hyperlink w:anchor="_Toc215009751" w:history="1">
+            <w:r>
+              <w:rPr>
+                <w:rStyle w:val="Hyperlink"/>
+                <w:rFonts w:cs="Arial"/>
+                <w:noProof/>
+              </w:rPr>
+              <w:t>1.2</w:t>
+            </w:r>
+            <w:r>
+              <w:rPr>
+                <w:noProof/>
+                <w:kern w:val="2"/>
+                <w:sz w:val="24"/>
+                <w:szCs w:val="24"/>
+                <w:lang w:eastAsia="en-IE"/>
+                <w14:ligatures w14:val="standardContextual"/>
+              </w:rPr>
+              <w:tab/>
+            </w:r>
+            <w:r>
+              <w:rPr>
+                <w:rStyle w:val="Hyperlink"/>
+                <w:rFonts w:cs="Arial"/>
+                <w:noProof/>
+              </w:rPr>
+              <w:t>Hash Table</w:t>
+            </w:r>
+            <w:r>
+              <w:rPr>
+                <w:noProof/>
+                <w:webHidden/>
+              </w:rPr>
+              <w:tab/>
+            </w:r>
+            <w:r>
+              <w:rPr>
+                <w:noProof/>
+                <w:webHidden/>
+              </w:rPr>
+              <w:fldChar w:fldCharType="begin"/>
+            </w:r>
+            <w:r>
+              <w:rPr>
+                <w:noProof/>
+                <w:webHidden/>
+              </w:rPr>
+              <w:instrText xml:space="preserve"> PAGEREF _Toc215009751 \h </w:instrText>
+            </w:r>
+            <w:r>
+              <w:rPr>
+                <w:noProof/>
+                <w:webHidden/>
+              </w:rPr>
+            </w:r>
+            <w:r>
+              <w:rPr>
+                <w:noProof/>
+                <w:webHidden/>
+              </w:rPr>
+              <w:fldChar w:fldCharType="separate"/>
+            </w:r>
+            <w:r>
+              <w:rPr>
+                <w:noProof/>
+                <w:webHidden/>
+              </w:rPr>
+              <w:t>6</w:t>
+            </w:r>
+            <w:r>
+              <w:rPr>
+                <w:noProof/>
+                <w:webHidden/>
+              </w:rPr>
+              <w:fldChar w:fldCharType="end"/>
+            </w:r>
+          </w:hyperlink>
+        </w:p>
+        <w:p>
+          <w:pPr>
+            <w:pStyle w:val="TOC2"/>
+            <w:tabs>
+              <w:tab w:val="left" w:pos="960"/>
+              <w:tab w:val="right" w:leader="dot" w:pos="9016"/>
+            </w:tabs>
+            <w:rPr>
+              <w:noProof/>
+              <w:kern w:val="2"/>
+              <w:sz w:val="24"/>
+              <w:szCs w:val="24"/>
+              <w:lang w:eastAsia="en-IE"/>
+              <w14:ligatures w14:val="standardContextual"/>
+            </w:rPr>
+          </w:pPr>
+          <w:hyperlink w:anchor="_Toc215009752" w:history="1">
+            <w:r>
+              <w:rPr>
+                <w:rStyle w:val="Hyperlink"/>
+                <w:rFonts w:cs="Arial"/>
+                <w:noProof/>
+              </w:rPr>
+              <w:t>1.3</w:t>
+            </w:r>
+            <w:r>
+              <w:rPr>
+                <w:noProof/>
+                <w:kern w:val="2"/>
+                <w:sz w:val="24"/>
+                <w:szCs w:val="24"/>
+                <w:lang w:eastAsia="en-IE"/>
+                <w14:ligatures w14:val="standardContextual"/>
+              </w:rPr>
+              <w:tab/>
+            </w:r>
+            <w:r>
+              <w:rPr>
+                <w:rStyle w:val="Hyperlink"/>
+                <w:rFonts w:cs="Arial"/>
+                <w:noProof/>
+              </w:rPr>
+              <w:t>Collision in a hash table</w:t>
+            </w:r>
+            <w:r>
+              <w:rPr>
+                <w:noProof/>
+                <w:webHidden/>
+              </w:rPr>
+              <w:tab/>
+            </w:r>
+            <w:r>
+              <w:rPr>
+                <w:noProof/>
+                <w:webHidden/>
+              </w:rPr>
+              <w:fldChar w:fldCharType="begin"/>
+            </w:r>
+            <w:r>
+              <w:rPr>
+                <w:noProof/>
+                <w:webHidden/>
+              </w:rPr>
+              <w:instrText xml:space="preserve"> PAGEREF _Toc215009752 \h </w:instrText>
+            </w:r>
+            <w:r>
+              <w:rPr>
+                <w:noProof/>
+                <w:webHidden/>
+              </w:rPr>
+            </w:r>
+            <w:r>
+              <w:rPr>
+                <w:noProof/>
+                <w:webHidden/>
+              </w:rPr>
+              <w:fldChar w:fldCharType="separate"/>
+            </w:r>
+            <w:r>
+              <w:rPr>
+                <w:noProof/>
+                <w:webHidden/>
+              </w:rPr>
+              <w:t>6</w:t>
+            </w:r>
+            <w:r>
+              <w:rPr>
+                <w:noProof/>
+                <w:webHidden/>
+              </w:rPr>
+              <w:fldChar w:fldCharType="end"/>
+            </w:r>
+          </w:hyperlink>
+        </w:p>
+        <w:p>
+          <w:pPr>
+            <w:pStyle w:val="TOC2"/>
+            <w:tabs>
+              <w:tab w:val="left" w:pos="960"/>
+              <w:tab w:val="right" w:leader="dot" w:pos="9016"/>
+            </w:tabs>
+            <w:rPr>
+              <w:noProof/>
+              <w:kern w:val="2"/>
+              <w:sz w:val="24"/>
+              <w:szCs w:val="24"/>
+              <w:lang w:eastAsia="en-IE"/>
+              <w14:ligatures w14:val="standardContextual"/>
+            </w:rPr>
+          </w:pPr>
+          <w:hyperlink w:anchor="_Toc215009753" w:history="1">
+            <w:r>
+              <w:rPr>
+                <w:rStyle w:val="Hyperlink"/>
+                <w:rFonts w:cs="Arial"/>
+                <w:noProof/>
+              </w:rPr>
+              <w:t>1.4</w:t>
+            </w:r>
+            <w:r>
+              <w:rPr>
+                <w:noProof/>
+                <w:kern w:val="2"/>
+                <w:sz w:val="24"/>
+                <w:szCs w:val="24"/>
+                <w:lang w:eastAsia="en-IE"/>
+                <w14:ligatures w14:val="standardContextual"/>
+              </w:rPr>
+              <w:tab/>
+            </w:r>
+            <w:r>
+              <w:rPr>
+                <w:rStyle w:val="Hyperlink"/>
+                <w:rFonts w:cs="Arial"/>
+                <w:noProof/>
+              </w:rPr>
+              <w:t>Load factor</w:t>
+            </w:r>
+            <w:r>
+              <w:rPr>
+                <w:noProof/>
+                <w:webHidden/>
+              </w:rPr>
+              <w:tab/>
+            </w:r>
+            <w:r>
+              <w:rPr>
+                <w:noProof/>
+                <w:webHidden/>
+              </w:rPr>
+              <w:fldChar w:fldCharType="begin"/>
+            </w:r>
+            <w:r>
+              <w:rPr>
+                <w:noProof/>
+                <w:webHidden/>
+              </w:rPr>
+              <w:instrText xml:space="preserve"> PAGEREF _Toc215009753 \h </w:instrText>
+            </w:r>
+            <w:r>
+              <w:rPr>
+                <w:noProof/>
+                <w:webHidden/>
+              </w:rPr>
+            </w:r>
+            <w:r>
+              <w:rPr>
+                <w:noProof/>
+                <w:webHidden/>
+              </w:rPr>
+              <w:fldChar w:fldCharType="separate"/>
+            </w:r>
+            <w:r>
+              <w:rPr>
+                <w:noProof/>
+                <w:webHidden/>
+              </w:rPr>
+              <w:t>6</w:t>
+            </w:r>
+            <w:r>
+              <w:rPr>
+                <w:noProof/>
+                <w:webHidden/>
+              </w:rPr>
+              <w:fldChar w:fldCharType="end"/>
+            </w:r>
+          </w:hyperlink>
+        </w:p>
+        <w:p>
+          <w:pPr>
+            <w:pStyle w:val="TOC2"/>
+            <w:tabs>
+              <w:tab w:val="left" w:pos="960"/>
+              <w:tab w:val="right" w:leader="dot" w:pos="9016"/>
+            </w:tabs>
+            <w:rPr>
+              <w:noProof/>
+              <w:kern w:val="2"/>
+              <w:sz w:val="24"/>
+              <w:szCs w:val="24"/>
+              <w:lang w:eastAsia="en-IE"/>
+              <w14:ligatures w14:val="standardContextual"/>
+            </w:rPr>
+          </w:pPr>
+          <w:hyperlink w:anchor="_Toc215009754" w:history="1">
+            <w:r>
+              <w:rPr>
+                <w:rStyle w:val="Hyperlink"/>
+                <w:rFonts w:cs="Arial"/>
+                <w:noProof/>
+              </w:rPr>
+              <w:t>1.5</w:t>
+            </w:r>
+            <w:r>
+              <w:rPr>
+                <w:noProof/>
+                <w:kern w:val="2"/>
+                <w:sz w:val="24"/>
+                <w:szCs w:val="24"/>
+                <w:lang w:eastAsia="en-IE"/>
+                <w14:ligatures w14:val="standardContextual"/>
+              </w:rPr>
+              <w:tab/>
+            </w:r>
+            <w:r>
+              <w:rPr>
+                <w:rStyle w:val="Hyperlink"/>
+                <w:rFonts w:cs="Arial"/>
+                <w:noProof/>
+              </w:rPr>
+              <w:t>Open addressing</w:t>
+            </w:r>
+            <w:r>
+              <w:rPr>
+                <w:noProof/>
+                <w:webHidden/>
+              </w:rPr>
+              <w:tab/>
+            </w:r>
+            <w:r>
+              <w:rPr>
+                <w:noProof/>
+                <w:webHidden/>
+              </w:rPr>
+              <w:fldChar w:fldCharType="begin"/>
+            </w:r>
+            <w:r>
+              <w:rPr>
+                <w:noProof/>
+                <w:webHidden/>
+              </w:rPr>
+              <w:instrText xml:space="preserve"> PAGEREF _Toc215009754 \h </w:instrText>
+            </w:r>
+            <w:r>
+              <w:rPr>
+                <w:noProof/>
+                <w:webHidden/>
+              </w:rPr>
+            </w:r>
+            <w:r>
+              <w:rPr>
+                <w:noProof/>
+                <w:webHidden/>
+              </w:rPr>
+              <w:fldChar w:fldCharType="separate"/>
+            </w:r>
+            <w:r>
+              <w:rPr>
+                <w:noProof/>
+                <w:webHidden/>
+              </w:rPr>
+              <w:t>6</w:t>
+            </w:r>
+            <w:r>
+              <w:rPr>
+                <w:noProof/>
+                <w:webHidden/>
+              </w:rPr>
+              <w:fldChar w:fldCharType="end"/>
+            </w:r>
+          </w:hyperlink>
+        </w:p>
+        <w:p>
+          <w:pPr>
+            <w:pStyle w:val="TOC1"/>
+            <w:tabs>
+              <w:tab w:val="left" w:pos="440"/>
+              <w:tab w:val="right" w:leader="dot" w:pos="9016"/>
+            </w:tabs>
+            <w:rPr>
+              <w:noProof/>
+              <w:kern w:val="2"/>
+              <w:sz w:val="24"/>
+              <w:szCs w:val="24"/>
+              <w:lang w:eastAsia="en-IE"/>
+              <w14:ligatures w14:val="standardContextual"/>
+            </w:rPr>
+          </w:pPr>
+          <w:hyperlink w:anchor="_Toc215009755" w:history="1">
+            <w:r>
+              <w:rPr>
+                <w:rStyle w:val="Hyperlink"/>
+                <w:rFonts w:cs="Arial"/>
+                <w:noProof/>
+              </w:rPr>
+              <w:t>2</w:t>
+            </w:r>
+            <w:r>
+              <w:rPr>
+                <w:noProof/>
+                <w:kern w:val="2"/>
+                <w:sz w:val="24"/>
+                <w:szCs w:val="24"/>
+                <w:lang w:eastAsia="en-IE"/>
+                <w14:ligatures w14:val="standardContextual"/>
+              </w:rPr>
+              <w:tab/>
+            </w:r>
+            <w:r>
+              <w:rPr>
+                <w:rStyle w:val="Hyperlink"/>
+                <w:rFonts w:cs="Arial"/>
+                <w:noProof/>
+              </w:rPr>
+              <w:t>Appendix</w:t>
+            </w:r>
+            <w:r>
+              <w:rPr>
+                <w:noProof/>
+                <w:webHidden/>
+              </w:rPr>
+              <w:tab/>
+            </w:r>
+            <w:r>
+              <w:rPr>
+                <w:noProof/>
+                <w:webHidden/>
+              </w:rPr>
+              <w:fldChar w:fldCharType="begin"/>
+            </w:r>
+            <w:r>
+              <w:rPr>
+                <w:noProof/>
+                <w:webHidden/>
+              </w:rPr>
+              <w:instrText xml:space="preserve"> PAGEREF _Toc215009755 \h </w:instrText>
+            </w:r>
+            <w:r>
+              <w:rPr>
+                <w:noProof/>
+                <w:webHidden/>
+              </w:rPr>
+            </w:r>
+            <w:r>
+              <w:rPr>
+                <w:noProof/>
+                <w:webHidden/>
+              </w:rPr>
+              <w:fldChar w:fldCharType="separate"/>
+            </w:r>
+            <w:r>
+              <w:rPr>
+                <w:noProof/>
+                <w:webHidden/>
+              </w:rPr>
+              <w:t>8</w:t>
+            </w:r>
+            <w:r>
+              <w:rPr>
+                <w:noProof/>
+                <w:webHidden/>
+              </w:rPr>
+              <w:fldChar w:fldCharType="end"/>
+            </w:r>
+          </w:hyperlink>
+        </w:p>
+        <w:p>
+          <w:pPr>
+            <w:rPr>
+              <w:rFonts w:ascii="Arial" w:hAnsi="Arial" w:cs="Arial"/>
+            </w:rPr>
+          </w:pPr>
+          <w:r>
+            <w:rPr>
+              <w:rFonts w:cs="Arial"/>
+              <w:b/>
+              <w:bCs/>
+              <w:noProof/>
+              <w:sz w:val="24"/>
+              <w:szCs w:val="24"/>
+              <w:lang w:val="en-US"/>
+            </w:rPr>
+            <w:fldChar w:fldCharType="end"/>
+          </w:r>
         </w:p>
       </w:sdtContent>
     </w:sdt>
-    <w:p/>
-    <w:p/>
-    <w:p/>
-    <w:p/>
-    <w:p/>
-    <w:p/>
-    <w:p/>
-    <w:p/>
-    <w:p/>
-    <w:p/>
-    <w:p/>
-    <w:p/>
-    <w:p/>
-    <w:p/>
-    <w:p/>
-    <w:p/>
-    <w:p/>
-    <w:p/>
-    <w:p/>
-    <w:p/>
-    <w:p/>
-    <w:p/>
-    <w:p/>
-    <w:p/>
-    <w:p/>
-    <w:p/>
-    <w:p>
-      <w:fldSimple w:instr=" TOC \h \z \c &quot;Figure&quot; ">
-        <w:r>
-          <w:rPr>
-            <w:b/>
-            <w:bCs/>
-            <w:noProof/>
-            <w:lang w:val="en-US"/>
-          </w:rPr>
-          <w:t>No table of figures entries found.</w:t>
-        </w:r>
-      </w:fldSimple>
-    </w:p>
-    <w:p/>
-    <w:p/>
-    <w:p/>
-    <w:p/>
-    <w:p/>
-    <w:p/>
-    <w:p/>
-    <w:p/>
-    <w:p/>
-    <w:p/>
-    <w:p/>
-    <w:p/>
-    <w:p/>
-    <w:p/>
-    <w:p/>
-    <w:p/>
-    <w:p/>
-    <w:p/>
-    <w:p/>
-    <w:p/>
-    <w:p/>
-    <w:p/>
-    <w:p/>
-    <w:p/>
-    <w:p/>
-    <w:p/>
-    <w:p/>
-    <w:p/>
+    <w:p>
+      <w:pPr>
+        <w:rPr>
+          <w:rFonts w:ascii="Arial" w:hAnsi="Arial" w:cs="Arial"/>
+        </w:rPr>
+      </w:pPr>
+    </w:p>
+    <w:p>
+      <w:pPr>
+        <w:rPr>
+          <w:rFonts w:ascii="Arial" w:hAnsi="Arial" w:cs="Arial"/>
+        </w:rPr>
+      </w:pPr>
+    </w:p>
+    <w:p>
+      <w:pPr>
+        <w:rPr>
+          <w:rFonts w:ascii="Arial" w:hAnsi="Arial" w:cs="Arial"/>
+        </w:rPr>
+      </w:pPr>
+    </w:p>
+    <w:p>
+      <w:pPr>
+        <w:rPr>
+          <w:rFonts w:ascii="Arial" w:hAnsi="Arial" w:cs="Arial"/>
+        </w:rPr>
+      </w:pPr>
+    </w:p>
+    <w:p>
+      <w:pPr>
+        <w:rPr>
+          <w:rFonts w:ascii="Arial" w:hAnsi="Arial" w:cs="Arial"/>
+        </w:rPr>
+      </w:pPr>
+    </w:p>
+    <w:p>
+      <w:pPr>
+        <w:rPr>
+          <w:rFonts w:ascii="Arial" w:hAnsi="Arial" w:cs="Arial"/>
+        </w:rPr>
+      </w:pPr>
+    </w:p>
+    <w:p>
+      <w:pPr>
+        <w:rPr>
+          <w:rFonts w:ascii="Arial" w:hAnsi="Arial" w:cs="Arial"/>
+        </w:rPr>
+      </w:pPr>
+    </w:p>
+    <w:p>
+      <w:pPr>
+        <w:rPr>
+          <w:rFonts w:ascii="Arial" w:hAnsi="Arial" w:cs="Arial"/>
+        </w:rPr>
+      </w:pPr>
+    </w:p>
+    <w:p>
+      <w:pPr>
+        <w:rPr>
+          <w:rFonts w:ascii="Arial" w:hAnsi="Arial" w:cs="Arial"/>
+        </w:rPr>
+      </w:pPr>
+    </w:p>
+    <w:p>
+      <w:pPr>
+        <w:rPr>
+          <w:rFonts w:ascii="Arial" w:hAnsi="Arial" w:cs="Arial"/>
+        </w:rPr>
+      </w:pPr>
+    </w:p>
+    <w:p>
+      <w:pPr>
+        <w:rPr>
+          <w:rFonts w:ascii="Arial" w:hAnsi="Arial" w:cs="Arial"/>
+        </w:rPr>
+      </w:pPr>
+    </w:p>
+    <w:p>
+      <w:pPr>
+        <w:rPr>
+          <w:rFonts w:ascii="Arial" w:hAnsi="Arial" w:cs="Arial"/>
+        </w:rPr>
+      </w:pPr>
+    </w:p>
+    <w:p>
+      <w:pPr>
+        <w:rPr>
+          <w:rFonts w:ascii="Arial" w:hAnsi="Arial" w:cs="Arial"/>
+        </w:rPr>
+      </w:pPr>
+    </w:p>
+    <w:p>
+      <w:pPr>
+        <w:rPr>
+          <w:rFonts w:ascii="Arial" w:hAnsi="Arial" w:cs="Arial"/>
+        </w:rPr>
+      </w:pPr>
+    </w:p>
+    <w:p>
+      <w:pPr>
+        <w:rPr>
+          <w:rFonts w:ascii="Arial" w:hAnsi="Arial" w:cs="Arial"/>
+        </w:rPr>
+      </w:pPr>
+    </w:p>
+    <w:p>
+      <w:pPr>
+        <w:rPr>
+          <w:rFonts w:ascii="Arial" w:hAnsi="Arial" w:cs="Arial"/>
+        </w:rPr>
+      </w:pPr>
+    </w:p>
+    <w:p>
+      <w:pPr>
+        <w:rPr>
+          <w:rFonts w:ascii="Arial" w:hAnsi="Arial" w:cs="Arial"/>
+        </w:rPr>
+      </w:pPr>
+    </w:p>
+    <w:p>
+      <w:pPr>
+        <w:rPr>
+          <w:rFonts w:ascii="Arial" w:hAnsi="Arial" w:cs="Arial"/>
+        </w:rPr>
+      </w:pPr>
+    </w:p>
+    <w:p>
+      <w:pPr>
+        <w:rPr>
+          <w:rFonts w:ascii="Arial" w:hAnsi="Arial" w:cs="Arial"/>
+        </w:rPr>
+      </w:pPr>
+    </w:p>
+    <w:p>
+      <w:pPr>
+        <w:rPr>
+          <w:rFonts w:ascii="Arial" w:hAnsi="Arial" w:cs="Arial"/>
+        </w:rPr>
+      </w:pPr>
+    </w:p>
+    <w:p>
+      <w:pPr>
+        <w:rPr>
+          <w:rFonts w:ascii="Arial" w:hAnsi="Arial" w:cs="Arial"/>
+        </w:rPr>
+      </w:pPr>
+    </w:p>
+    <w:p>
+      <w:pPr>
+        <w:rPr>
+          <w:rFonts w:ascii="Arial" w:hAnsi="Arial" w:cs="Arial"/>
+        </w:rPr>
+      </w:pPr>
+      <w:r>
+        <w:rPr>
+          <w:rFonts w:ascii="Arial" w:hAnsi="Arial" w:cs="Arial"/>
+        </w:rPr>
+        <w:fldChar w:fldCharType="begin"/>
+      </w:r>
+      <w:r>
+        <w:rPr>
+          <w:rFonts w:ascii="Arial" w:hAnsi="Arial" w:cs="Arial"/>
+        </w:rPr>
+        <w:instrText xml:space="preserve"> TOC \h \z \c "Figure" </w:instrText>
+      </w:r>
+      <w:r>
+        <w:rPr>
+          <w:rFonts w:ascii="Arial" w:hAnsi="Arial" w:cs="Arial"/>
+        </w:rPr>
+        <w:fldChar w:fldCharType="separate"/>
+      </w:r>
+      <w:r>
+        <w:rPr>
+          <w:rFonts w:ascii="Arial" w:hAnsi="Arial" w:cs="Arial"/>
+          <w:b/>
+          <w:bCs/>
+          <w:noProof/>
+          <w:lang w:val="en-US"/>
+        </w:rPr>
+        <w:t>No table of figures entries found.</w:t>
+      </w:r>
+      <w:r>
+        <w:rPr>
+          <w:rFonts w:ascii="Arial" w:hAnsi="Arial" w:cs="Arial"/>
+          <w:b/>
+          <w:bCs/>
+          <w:noProof/>
+          <w:lang w:val="en-US"/>
+        </w:rPr>
+        <w:fldChar w:fldCharType="end"/>
+      </w:r>
+    </w:p>
+    <w:p>
+      <w:pPr>
+        <w:rPr>
+          <w:rFonts w:ascii="Arial" w:hAnsi="Arial" w:cs="Arial"/>
+        </w:rPr>
+      </w:pPr>
+    </w:p>
+    <w:p>
+      <w:pPr>
+        <w:rPr>
+          <w:rFonts w:ascii="Arial" w:hAnsi="Arial" w:cs="Arial"/>
+        </w:rPr>
+      </w:pPr>
+    </w:p>
+    <w:p>
+      <w:pPr>
+        <w:rPr>
+          <w:rFonts w:ascii="Arial" w:hAnsi="Arial" w:cs="Arial"/>
+        </w:rPr>
+      </w:pPr>
+    </w:p>
+    <w:p>
+      <w:pPr>
+        <w:rPr>
+          <w:rFonts w:ascii="Arial" w:hAnsi="Arial" w:cs="Arial"/>
+        </w:rPr>
+      </w:pPr>
+    </w:p>
+    <w:p>
+      <w:pPr>
+        <w:rPr>
+          <w:rFonts w:ascii="Arial" w:hAnsi="Arial" w:cs="Arial"/>
+        </w:rPr>
+      </w:pPr>
+    </w:p>
+    <w:p>
+      <w:pPr>
+        <w:rPr>
+          <w:rFonts w:ascii="Arial" w:hAnsi="Arial" w:cs="Arial"/>
+        </w:rPr>
+      </w:pPr>
+    </w:p>
+    <w:p>
+      <w:pPr>
+        <w:rPr>
+          <w:rFonts w:ascii="Arial" w:hAnsi="Arial" w:cs="Arial"/>
+        </w:rPr>
+      </w:pPr>
+    </w:p>
+    <w:p>
+      <w:pPr>
+        <w:rPr>
+          <w:rFonts w:ascii="Arial" w:hAnsi="Arial" w:cs="Arial"/>
+        </w:rPr>
+      </w:pPr>
+    </w:p>
+    <w:p>
+      <w:pPr>
+        <w:rPr>
+          <w:rFonts w:ascii="Arial" w:hAnsi="Arial" w:cs="Arial"/>
+        </w:rPr>
+      </w:pPr>
+    </w:p>
+    <w:p>
+      <w:pPr>
+        <w:rPr>
+          <w:rFonts w:ascii="Arial" w:hAnsi="Arial" w:cs="Arial"/>
+        </w:rPr>
+      </w:pPr>
+    </w:p>
+    <w:p>
+      <w:pPr>
+        <w:rPr>
+          <w:rFonts w:ascii="Arial" w:hAnsi="Arial" w:cs="Arial"/>
+        </w:rPr>
+      </w:pPr>
+    </w:p>
+    <w:p>
+      <w:pPr>
+        <w:rPr>
+          <w:rFonts w:ascii="Arial" w:hAnsi="Arial" w:cs="Arial"/>
+        </w:rPr>
+      </w:pPr>
+    </w:p>
+    <w:p>
+      <w:pPr>
+        <w:rPr>
+          <w:rFonts w:ascii="Arial" w:hAnsi="Arial" w:cs="Arial"/>
+        </w:rPr>
+      </w:pPr>
+    </w:p>
+    <w:p>
+      <w:pPr>
+        <w:rPr>
+          <w:rFonts w:ascii="Arial" w:hAnsi="Arial" w:cs="Arial"/>
+        </w:rPr>
+      </w:pPr>
+    </w:p>
+    <w:p>
+      <w:pPr>
+        <w:rPr>
+          <w:rFonts w:ascii="Arial" w:hAnsi="Arial" w:cs="Arial"/>
+        </w:rPr>
+      </w:pPr>
+    </w:p>
+    <w:p>
+      <w:pPr>
+        <w:rPr>
+          <w:rFonts w:ascii="Arial" w:hAnsi="Arial" w:cs="Arial"/>
+        </w:rPr>
+      </w:pPr>
+    </w:p>
+    <w:p>
+      <w:pPr>
+        <w:rPr>
+          <w:rFonts w:ascii="Arial" w:hAnsi="Arial" w:cs="Arial"/>
+        </w:rPr>
+      </w:pPr>
+    </w:p>
+    <w:p>
+      <w:pPr>
+        <w:rPr>
+          <w:rFonts w:ascii="Arial" w:hAnsi="Arial" w:cs="Arial"/>
+        </w:rPr>
+      </w:pPr>
+    </w:p>
+    <w:p>
+      <w:pPr>
+        <w:rPr>
+          <w:rFonts w:ascii="Arial" w:hAnsi="Arial" w:cs="Arial"/>
+        </w:rPr>
+      </w:pPr>
+    </w:p>
+    <w:p>
+      <w:pPr>
+        <w:rPr>
+          <w:rFonts w:ascii="Arial" w:hAnsi="Arial" w:cs="Arial"/>
+        </w:rPr>
+      </w:pPr>
+    </w:p>
+    <w:p>
+      <w:pPr>
+        <w:rPr>
+          <w:rFonts w:ascii="Arial" w:hAnsi="Arial" w:cs="Arial"/>
+        </w:rPr>
+      </w:pPr>
+    </w:p>
+    <w:p>
+      <w:pPr>
+        <w:rPr>
+          <w:rFonts w:ascii="Arial" w:hAnsi="Arial" w:cs="Arial"/>
+        </w:rPr>
+      </w:pPr>
+    </w:p>
+    <w:p>
+      <w:pPr>
+        <w:rPr>
+          <w:rFonts w:ascii="Arial" w:hAnsi="Arial" w:cs="Arial"/>
+        </w:rPr>
+      </w:pPr>
+    </w:p>
+    <w:p>
+      <w:pPr>
+        <w:rPr>
+          <w:rFonts w:ascii="Arial" w:hAnsi="Arial" w:cs="Arial"/>
+        </w:rPr>
+      </w:pPr>
+    </w:p>
+    <w:p>
+      <w:pPr>
+        <w:rPr>
+          <w:rFonts w:ascii="Arial" w:hAnsi="Arial" w:cs="Arial"/>
+        </w:rPr>
+      </w:pPr>
+    </w:p>
+    <w:p>
+      <w:pPr>
+        <w:pStyle w:val="Heading1"/>
+        <w:rPr>
+          <w:rFonts w:cs="Arial"/>
+          <w:sz w:val="32"/>
+          <w:szCs w:val="32"/>
+        </w:rPr>
+      </w:pPr>
+      <w:bookmarkStart w:id="2" w:name="_Toc215009749"/>
+      <w:r>
+        <w:rPr>
+          <w:rFonts w:cs="Arial"/>
+          <w:sz w:val="32"/>
+          <w:szCs w:val="32"/>
+        </w:rPr>
+        <w:lastRenderedPageBreak/>
+        <w:t>Question 1</w:t>
+      </w:r>
+      <w:bookmarkEnd w:id="2"/>
+    </w:p>
+    <w:p>
+      <w:pPr>
+        <w:pStyle w:val="Heading2"/>
+        <w:rPr>
+          <w:rFonts w:cs="Arial"/>
+          <w:sz w:val="28"/>
+          <w:szCs w:val="28"/>
+        </w:rPr>
+      </w:pPr>
+      <w:bookmarkStart w:id="3" w:name="_Toc215009750"/>
+      <w:r>
+        <w:rPr>
+          <w:rFonts w:cs="Arial"/>
+          <w:sz w:val="28"/>
+          <w:szCs w:val="28"/>
+        </w:rPr>
+        <w:t>Hash Function</w:t>
+      </w:r>
+      <w:bookmarkEnd w:id="3"/>
+    </w:p>
+    <w:p>
+      <w:pPr>
+        <w:rPr>
+          <w:rFonts w:asciiTheme="majorHAnsi" w:hAnsiTheme="majorHAnsi" w:cs="Arial"/>
+          <w:sz w:val="28"/>
+          <w:szCs w:val="28"/>
+        </w:rPr>
+      </w:pPr>
+    </w:p>
+    <w:p>
+      <w:pPr>
+        <w:pStyle w:val="Heading2"/>
+        <w:rPr>
+          <w:rFonts w:cs="Arial"/>
+          <w:sz w:val="28"/>
+          <w:szCs w:val="28"/>
+        </w:rPr>
+      </w:pPr>
+      <w:bookmarkStart w:id="4" w:name="_Toc215009751"/>
+      <w:r>
+        <w:rPr>
+          <w:rFonts w:cs="Arial"/>
+          <w:sz w:val="28"/>
+          <w:szCs w:val="28"/>
+        </w:rPr>
+        <w:t>Hash Table</w:t>
+      </w:r>
+      <w:bookmarkEnd w:id="4"/>
+    </w:p>
+    <w:p>
+      <w:pPr>
+        <w:rPr>
+          <w:rFonts w:asciiTheme="majorHAnsi" w:hAnsiTheme="majorHAnsi" w:cs="Arial"/>
+          <w:sz w:val="28"/>
+          <w:szCs w:val="28"/>
+        </w:rPr>
+      </w:pPr>
+    </w:p>
+    <w:p>
+      <w:pPr>
+        <w:pStyle w:val="Heading2"/>
+        <w:rPr>
+          <w:rFonts w:cs="Arial"/>
+          <w:sz w:val="28"/>
+          <w:szCs w:val="28"/>
+        </w:rPr>
+      </w:pPr>
+      <w:bookmarkStart w:id="5" w:name="_Toc215009752"/>
+      <w:r>
+        <w:rPr>
+          <w:rFonts w:cs="Arial"/>
+          <w:sz w:val="28"/>
+          <w:szCs w:val="28"/>
+        </w:rPr>
+        <w:t>Collision in a hash table</w:t>
+      </w:r>
+      <w:bookmarkEnd w:id="5"/>
+    </w:p>
+    <w:p>
+      <w:pPr>
+        <w:rPr>
+          <w:rFonts w:asciiTheme="majorHAnsi" w:hAnsiTheme="majorHAnsi" w:cs="Arial"/>
+          <w:sz w:val="28"/>
+          <w:szCs w:val="28"/>
+        </w:rPr>
+      </w:pPr>
+    </w:p>
+    <w:p>
+      <w:pPr>
+        <w:pStyle w:val="Heading2"/>
+        <w:rPr>
+          <w:rFonts w:cs="Arial"/>
+          <w:sz w:val="28"/>
+          <w:szCs w:val="28"/>
+        </w:rPr>
+      </w:pPr>
+      <w:bookmarkStart w:id="6" w:name="_Toc215009753"/>
+      <w:r>
+        <w:rPr>
+          <w:rFonts w:cs="Arial"/>
+          <w:sz w:val="28"/>
+          <w:szCs w:val="28"/>
+        </w:rPr>
+        <w:t>Load factor</w:t>
+      </w:r>
+      <w:bookmarkEnd w:id="6"/>
+    </w:p>
+    <w:p>
+      <w:pPr>
+        <w:rPr>
+          <w:rFonts w:asciiTheme="majorHAnsi" w:hAnsiTheme="majorHAnsi" w:cs="Arial"/>
+          <w:sz w:val="28"/>
+          <w:szCs w:val="28"/>
+        </w:rPr>
+      </w:pPr>
+    </w:p>
+    <w:p>
+      <w:pPr>
+        <w:pStyle w:val="Heading2"/>
+        <w:rPr>
+          <w:rFonts w:cs="Arial"/>
+          <w:sz w:val="28"/>
+          <w:szCs w:val="28"/>
+        </w:rPr>
+      </w:pPr>
+      <w:bookmarkStart w:id="7" w:name="_Toc215009754"/>
+      <w:r>
+        <w:rPr>
+          <w:rFonts w:cs="Arial"/>
+          <w:sz w:val="28"/>
+          <w:szCs w:val="28"/>
+        </w:rPr>
+        <w:t>Open addressing</w:t>
+      </w:r>
+      <w:bookmarkEnd w:id="7"/>
+    </w:p>
+    <w:p>
+      <w:pPr>
+        <w:rPr>
+          <w:rFonts w:ascii="Arial" w:hAnsi="Arial" w:cs="Arial"/>
+        </w:rPr>
+      </w:pPr>
+    </w:p>
+    <w:p>
+      <w:pPr>
+        <w:rPr>
+          <w:rFonts w:ascii="Arial" w:hAnsi="Arial" w:cs="Arial"/>
+        </w:rPr>
+      </w:pPr>
+    </w:p>
+    <w:p>
+      <w:pPr>
+        <w:rPr>
+          <w:rFonts w:ascii="Arial" w:hAnsi="Arial" w:cs="Arial"/>
+        </w:rPr>
+      </w:pPr>
+    </w:p>
+    <w:p>
+      <w:pPr>
+        <w:rPr>
+          <w:rFonts w:ascii="Arial" w:hAnsi="Arial" w:cs="Arial"/>
+        </w:rPr>
+      </w:pPr>
+    </w:p>
+    <w:p>
+      <w:pPr>
+        <w:rPr>
+          <w:rFonts w:ascii="Arial" w:hAnsi="Arial" w:cs="Arial"/>
+        </w:rPr>
+      </w:pPr>
+    </w:p>
+    <w:p>
+      <w:pPr>
+        <w:rPr>
+          <w:rFonts w:ascii="Arial" w:hAnsi="Arial" w:cs="Arial"/>
+        </w:rPr>
+      </w:pPr>
+    </w:p>
+    <w:p>
+      <w:pPr>
+        <w:rPr>
+          <w:rFonts w:ascii="Arial" w:hAnsi="Arial" w:cs="Arial"/>
+        </w:rPr>
+      </w:pPr>
+    </w:p>
+    <w:p>
+      <w:pPr>
+        <w:rPr>
+          <w:rFonts w:ascii="Arial" w:hAnsi="Arial" w:cs="Arial"/>
+        </w:rPr>
+      </w:pPr>
+    </w:p>
+    <w:p>
+      <w:pPr>
+        <w:rPr>
+          <w:rFonts w:ascii="Arial" w:hAnsi="Arial" w:cs="Arial"/>
+        </w:rPr>
+      </w:pPr>
+    </w:p>
+    <w:p>
+      <w:pPr>
+        <w:rPr>
+          <w:rFonts w:ascii="Arial" w:hAnsi="Arial" w:cs="Arial"/>
+        </w:rPr>
+      </w:pPr>
+    </w:p>
+    <w:p>
+      <w:pPr>
+        <w:rPr>
+          <w:rFonts w:ascii="Arial" w:hAnsi="Arial" w:cs="Arial"/>
+        </w:rPr>
+      </w:pPr>
+    </w:p>
+    <w:p>
+      <w:pPr>
+        <w:rPr>
+          <w:rFonts w:ascii="Arial" w:hAnsi="Arial" w:cs="Arial"/>
+        </w:rPr>
+      </w:pPr>
+    </w:p>
+    <w:p>
+      <w:pPr>
+        <w:rPr>
+          <w:rFonts w:ascii="Arial" w:hAnsi="Arial" w:cs="Arial"/>
+        </w:rPr>
+      </w:pPr>
+    </w:p>
+    <w:p>
+      <w:pPr>
+        <w:rPr>
+          <w:rFonts w:ascii="Arial" w:hAnsi="Arial" w:cs="Arial"/>
+        </w:rPr>
+      </w:pPr>
+    </w:p>
+    <w:p>
+      <w:pPr>
+        <w:rPr>
+          <w:rFonts w:ascii="Arial" w:hAnsi="Arial" w:cs="Arial"/>
+        </w:rPr>
+      </w:pPr>
+    </w:p>
+    <w:p>
+      <w:pPr>
+        <w:rPr>
+          <w:rFonts w:ascii="Arial" w:hAnsi="Arial" w:cs="Arial"/>
+        </w:rPr>
+      </w:pPr>
+    </w:p>
+    <w:p>
+      <w:pPr>
+        <w:rPr>
+          <w:rFonts w:ascii="Arial" w:hAnsi="Arial" w:cs="Arial"/>
+        </w:rPr>
+      </w:pPr>
+    </w:p>
+    <w:p>
+      <w:pPr>
+        <w:rPr>
+          <w:rFonts w:ascii="Arial" w:hAnsi="Arial" w:cs="Arial"/>
+        </w:rPr>
+      </w:pPr>
+    </w:p>
+    <w:p>
+      <w:pPr>
+        <w:rPr>
+          <w:rFonts w:ascii="Arial" w:hAnsi="Arial" w:cs="Arial"/>
+        </w:rPr>
+      </w:pPr>
+    </w:p>
+    <w:p>
+      <w:pPr>
+        <w:rPr>
+          <w:rFonts w:ascii="Arial" w:hAnsi="Arial" w:cs="Arial"/>
+        </w:rPr>
+      </w:pPr>
+    </w:p>
+    <w:p>
+      <w:pPr>
+        <w:rPr>
+          <w:rFonts w:ascii="Arial" w:hAnsi="Arial" w:cs="Arial"/>
+        </w:rPr>
+      </w:pPr>
+    </w:p>
+    <w:p>
+      <w:pPr>
+        <w:rPr>
+          <w:rFonts w:ascii="Arial" w:hAnsi="Arial" w:cs="Arial"/>
+        </w:rPr>
+      </w:pPr>
+    </w:p>
+    <w:p>
+      <w:pPr>
+        <w:rPr>
+          <w:rFonts w:ascii="Arial" w:hAnsi="Arial" w:cs="Arial"/>
+        </w:rPr>
+      </w:pPr>
+    </w:p>
+    <w:p>
+      <w:pPr>
+        <w:rPr>
+          <w:rFonts w:ascii="Arial" w:hAnsi="Arial" w:cs="Arial"/>
+        </w:rPr>
+      </w:pPr>
+    </w:p>
+    <w:p>
+      <w:pPr>
+        <w:rPr>
+          <w:rFonts w:ascii="Arial" w:hAnsi="Arial" w:cs="Arial"/>
+        </w:rPr>
+      </w:pPr>
+    </w:p>
+    <w:p>
+      <w:pPr>
+        <w:rPr>
+          <w:rFonts w:ascii="Arial" w:hAnsi="Arial" w:cs="Arial"/>
+        </w:rPr>
+      </w:pPr>
+    </w:p>
+    <w:p>
+      <w:pPr>
+        <w:rPr>
+          <w:rFonts w:ascii="Arial" w:hAnsi="Arial" w:cs="Arial"/>
+        </w:rPr>
+      </w:pPr>
+    </w:p>
+    <w:p>
+      <w:pPr>
+        <w:rPr>
+          <w:rFonts w:ascii="Arial" w:hAnsi="Arial" w:cs="Arial"/>
+        </w:rPr>
+      </w:pPr>
+    </w:p>
+    <w:p>
+      <w:pPr>
+        <w:rPr>
+          <w:rFonts w:ascii="Arial" w:hAnsi="Arial" w:cs="Arial"/>
+        </w:rPr>
+      </w:pPr>
+    </w:p>
+    <w:p>
+      <w:pPr>
+        <w:rPr>
+          <w:rFonts w:ascii="Arial" w:hAnsi="Arial" w:cs="Arial"/>
+        </w:rPr>
+      </w:pPr>
+    </w:p>
+    <w:p>
+      <w:pPr>
+        <w:rPr>
+          <w:rFonts w:ascii="Arial" w:hAnsi="Arial" w:cs="Arial"/>
+        </w:rPr>
+      </w:pPr>
+    </w:p>
+    <w:p>
+      <w:pPr>
+        <w:rPr>
+          <w:rFonts w:ascii="Arial" w:hAnsi="Arial" w:cs="Arial"/>
+        </w:rPr>
+      </w:pPr>
+    </w:p>
+    <w:p>
+      <w:pPr>
+        <w:rPr>
+          <w:rFonts w:ascii="Arial" w:hAnsi="Arial" w:cs="Arial"/>
+        </w:rPr>
+      </w:pPr>
+    </w:p>
+    <w:p>
+      <w:pPr>
+        <w:rPr>
+          <w:rFonts w:ascii="Arial" w:hAnsi="Arial" w:cs="Arial"/>
+        </w:rPr>
+      </w:pPr>
+    </w:p>
+    <w:p>
+      <w:pPr>
+        <w:rPr>
+          <w:rFonts w:ascii="Arial" w:hAnsi="Arial" w:cs="Arial"/>
+        </w:rPr>
+      </w:pPr>
+    </w:p>
+    <w:p>
+      <w:pPr>
+        <w:rPr>
+          <w:rFonts w:ascii="Arial" w:hAnsi="Arial" w:cs="Arial"/>
+        </w:rPr>
+      </w:pPr>
+    </w:p>
+    <w:p>
+      <w:pPr>
+        <w:rPr>
+          <w:rFonts w:ascii="Arial" w:hAnsi="Arial" w:cs="Arial"/>
+        </w:rPr>
+      </w:pPr>
+    </w:p>
+    <w:p>
+      <w:pPr>
+        <w:rPr>
+          <w:rFonts w:ascii="Arial" w:hAnsi="Arial" w:cs="Arial"/>
+        </w:rPr>
+      </w:pPr>
+    </w:p>
+    <w:p>
+      <w:pPr>
+        <w:rPr>
+          <w:rFonts w:ascii="Arial" w:hAnsi="Arial" w:cs="Arial"/>
+        </w:rPr>
+      </w:pPr>
+    </w:p>
+    <w:p>
+      <w:pPr>
+        <w:rPr>
+          <w:rFonts w:ascii="Arial" w:hAnsi="Arial" w:cs="Arial"/>
+        </w:rPr>
+      </w:pPr>
+    </w:p>
+    <w:p>
+      <w:pPr>
+        <w:rPr>
+          <w:rFonts w:ascii="Arial" w:hAnsi="Arial" w:cs="Arial"/>
+        </w:rPr>
+      </w:pPr>
+    </w:p>
+    <w:p>
+      <w:pPr>
+        <w:rPr>
+          <w:rFonts w:ascii="Arial" w:hAnsi="Arial" w:cs="Arial"/>
+        </w:rPr>
+      </w:pPr>
+    </w:p>
+    <w:p>
+      <w:pPr>
+        <w:rPr>
+          <w:rFonts w:ascii="Arial" w:hAnsi="Arial" w:cs="Arial"/>
+        </w:rPr>
+      </w:pPr>
+    </w:p>
+    <w:p>
+      <w:pPr>
+        <w:rPr>
+          <w:rFonts w:ascii="Arial" w:hAnsi="Arial" w:cs="Arial"/>
+        </w:rPr>
+      </w:pPr>
+    </w:p>
+    <w:p>
+      <w:pPr>
+        <w:rPr>
+          <w:rFonts w:ascii="Arial" w:hAnsi="Arial" w:cs="Arial"/>
+        </w:rPr>
+      </w:pPr>
+    </w:p>
+    <w:p>
+      <w:pPr>
+        <w:pStyle w:val="Heading1"/>
+        <w:rPr>
+          <w:rFonts w:cs="Arial"/>
+          <w:sz w:val="32"/>
+          <w:szCs w:val="32"/>
+        </w:rPr>
+      </w:pPr>
+      <w:bookmarkStart w:id="8" w:name="_Toc215009755"/>
+      <w:r>
+        <w:rPr>
+          <w:rFonts w:cs="Arial"/>
+          <w:sz w:val="32"/>
+          <w:szCs w:val="32"/>
+        </w:rPr>
+        <w:lastRenderedPageBreak/>
+        <w:t>Appendix</w:t>
+      </w:r>
+      <w:bookmarkEnd w:id="8"/>
+    </w:p>
+    <w:p>
+      <w:pPr>
+        <w:rPr>
+          <w:rFonts w:cs="Arial"/>
+          <w:sz w:val="24"/>
+          <w:szCs w:val="24"/>
+        </w:rPr>
+      </w:pPr>
+      <w:r>
+        <w:rPr>
+          <w:rFonts w:cs="Arial"/>
+          <w:sz w:val="24"/>
+          <w:szCs w:val="24"/>
+        </w:rPr>
+        <w:t xml:space="preserve">GitHub Repo </w:t>
+      </w:r>
+      <w:proofErr w:type="gramStart"/>
+      <w:r>
+        <w:rPr>
+          <w:rFonts w:cs="Arial"/>
+          <w:sz w:val="24"/>
+          <w:szCs w:val="24"/>
+        </w:rPr>
+        <w:t>Link</w:t>
+      </w:r>
+      <w:r>
+        <w:rPr>
+          <w:rFonts w:cs="Arial"/>
+          <w:sz w:val="24"/>
+          <w:szCs w:val="24"/>
+        </w:rPr>
+        <w:t>;</w:t>
+      </w:r>
+      <w:proofErr w:type="gramEnd"/>
+    </w:p>
+    <w:p>
+      <w:pPr>
+        <w:rPr>
+          <w:rFonts w:cs="Arial"/>
+          <w:sz w:val="24"/>
+          <w:szCs w:val="24"/>
+        </w:rPr>
+      </w:pPr>
+      <w:r>
+        <w:rPr>
+          <w:rFonts w:cs="Arial"/>
+          <w:sz w:val="24"/>
+          <w:szCs w:val="24"/>
+        </w:rPr>
+        <w:t>Word Count:</w:t>
+      </w:r>
+    </w:p>
+    <w:p>
+      <w:pPr>
+        <w:rPr>
+          <w:rFonts w:cs="Arial"/>
+          <w:sz w:val="24"/>
+          <w:szCs w:val="24"/>
+        </w:rPr>
+      </w:pPr>
+      <w:r>
+        <w:rPr>
+          <w:rFonts w:cs="Arial"/>
+          <w:sz w:val="24"/>
+          <w:szCs w:val="24"/>
+        </w:rPr>
+        <w:t>Font:</w:t>
+      </w:r>
+      <w:r>
+        <w:rPr>
+          <w:rFonts w:cs="Arial"/>
+          <w:sz w:val="24"/>
+          <w:szCs w:val="24"/>
+        </w:rPr>
+        <w:t xml:space="preserve"> Aptos</w:t>
+      </w:r>
+    </w:p>
+    <w:p>
+      <w:pPr>
+        <w:rPr>
+          <w:rFonts w:cs="Arial"/>
+          <w:sz w:val="24"/>
+          <w:szCs w:val="24"/>
+        </w:rPr>
+      </w:pPr>
+      <w:r>
+        <w:rPr>
+          <w:rFonts w:cs="Arial"/>
+          <w:sz w:val="24"/>
+          <w:szCs w:val="24"/>
+        </w:rPr>
+        <w:t>Font Size</w:t>
+      </w:r>
+      <w:r>
+        <w:rPr>
+          <w:rFonts w:cs="Arial"/>
+          <w:sz w:val="24"/>
+          <w:szCs w:val="24"/>
+        </w:rPr>
+        <w:t>:</w:t>
+      </w:r>
+      <w:r>
+        <w:rPr>
+          <w:rFonts w:cs="Arial"/>
+          <w:sz w:val="24"/>
+          <w:szCs w:val="24"/>
+        </w:rPr>
+        <w:t xml:space="preserve"> 12-16</w:t>
+      </w:r>
+    </w:p>
+    <w:p>
+      <w:pPr>
+        <w:rPr>
+          <w:rFonts w:ascii="Arial" w:hAnsi="Arial" w:cs="Arial"/>
+        </w:rPr>
+      </w:pPr>
+    </w:p>
+    <w:p>
+      <w:pPr>
+        <w:rPr>
+          <w:rFonts w:ascii="Arial" w:hAnsi="Arial" w:cs="Arial"/>
+        </w:rPr>
+      </w:pPr>
+    </w:p>
     <w:sectPr>
-      <w:footerReference w:type="default" r:id="rId9"/>
+      <w:headerReference w:type="default" r:id="rId9"/>
+      <w:footerReference w:type="default" r:id="rId10"/>
       <w:pgSz w:w="11906" w:h="16838"/>
       <w:pgMar w:top="1440" w:right="1440" w:bottom="1440" w:left="1440" w:header="708" w:footer="708" w:gutter="0"/>
       <w:cols w:space="708"/>
@@ -871,6 +3782,16 @@
 </w:footnotes>
 </file>
 
+<file path=word/header1.xml><?xml version="1.0" encoding="utf-8"?>
+<w:hdr xmlns:wpc="http://schemas.microsoft.com/office/word/2010/wordprocessingCanvas" xmlns:cx="http://schemas.microsoft.com/office/drawing/2014/chartex" xmlns:cx1="http://schemas.microsoft.com/office/drawing/2015/9/8/chartex" xmlns:cx2="http://schemas.microsoft.com/office/drawing/2015/10/21/chartex" xmlns:cx3="http://schemas.microsoft.com/office/drawing/2016/5/9/chartex" xmlns:cx4="http://schemas.microsoft.com/office/drawing/2016/5/10/chartex" xmlns:cx5="http://schemas.microsoft.com/office/drawing/2016/5/11/chartex" xmlns:cx6="http://schemas.microsoft.com/office/drawing/2016/5/12/chartex" xmlns:cx7="http://schemas.microsoft.com/office/drawing/2016/5/13/chartex" xmlns:cx8="http://schemas.microsoft.com/office/drawing/2016/5/14/chartex" xmlns:mc="http://schemas.openxmlformats.org/markup-compatibility/2006" xmlns:aink="http://schemas.microsoft.com/office/drawing/2016/ink" xmlns:am3d="http://schemas.microsoft.com/office/drawing/2017/model3d" xmlns:o="urn:schemas-microsoft-com:office:office" xmlns:oel="http://schemas.microsoft.com/office/2019/extlst" xmlns:r="http://schemas.openxmlformats.org/officeDocument/2006/relationships" xmlns:m="http://schemas.openxmlformats.org/officeDocument/2006/math" xmlns:v="urn:schemas-microsoft-com:vml" xmlns:wp14="http://schemas.microsoft.com/office/word/2010/wordprocessingDrawing" xmlns:wp="http://schemas.openxmlformats.org/drawingml/2006/wordprocessingDrawing" xmlns:w10="urn:schemas-microsoft-com:office:word" xmlns:w="http://schemas.openxmlformats.org/wordprocessingml/2006/main" xmlns:w14="http://schemas.microsoft.com/office/word/2010/wordml" xmlns:w15="http://schemas.microsoft.com/office/word/2012/wordml" xmlns:w16cex="http://schemas.microsoft.com/office/word/2018/wordml/cex" xmlns:w16cid="http://schemas.microsoft.com/office/word/2016/wordml/cid" xmlns:w16="http://schemas.microsoft.com/office/word/2018/wordml" xmlns:w16du="http://schemas.microsoft.com/office/word/2023/wordml/word16du" xmlns:w16sdtdh="http://schemas.microsoft.com/office/word/2020/wordml/sdtdatahash" xmlns:w16sdtfl="http://schemas.microsoft.com/office/word/2024/wordml/sdtformatlock" xmlns:w16se="http://schemas.microsoft.com/office/word/2015/wordml/symex" xmlns:wpg="http://schemas.microsoft.com/office/word/2010/wordprocessingGroup" xmlns:wpi="http://schemas.microsoft.com/office/word/2010/wordprocessingInk" xmlns:wne="http://schemas.microsoft.com/office/word/2006/wordml" xmlns:wps="http://schemas.microsoft.com/office/word/2010/wordprocessingShape" mc:Ignorable="w14 w15 w16se w16cid w16 w16cex w16sdtdh w16sdtfl w16du wp14">
+  <w:p>
+    <w:pPr>
+      <w:pStyle w:val="Header"/>
+    </w:pPr>
+  </w:p>
+</w:hdr>
+</file>
+
 <file path=word/numbering.xml><?xml version="1.0" encoding="utf-8"?>
 <w:numbering xmlns:wpc="http://schemas.microsoft.com/office/word/2010/wordprocessingCanvas" xmlns:cx="http://schemas.microsoft.com/office/drawing/2014/chartex" xmlns:cx1="http://schemas.microsoft.com/office/drawing/2015/9/8/chartex" xmlns:cx2="http://schemas.microsoft.com/office/drawing/2015/10/21/chartex" xmlns:cx3="http://schemas.microsoft.com/office/drawing/2016/5/9/chartex" xmlns:cx4="http://schemas.microsoft.com/office/drawing/2016/5/10/chartex" xmlns:cx5="http://schemas.microsoft.com/office/drawing/2016/5/11/chartex" xmlns:cx6="http://schemas.microsoft.com/office/drawing/2016/5/12/chartex" xmlns:cx7="http://schemas.microsoft.com/office/drawing/2016/5/13/chartex" xmlns:cx8="http://schemas.microsoft.com/office/drawing/2016/5/14/chartex" xmlns:mc="http://schemas.openxmlformats.org/markup-compatibility/2006" xmlns:aink="http://schemas.microsoft.com/office/drawing/2016/ink" xmlns:am3d="http://schemas.microsoft.com/office/drawing/2017/model3d" xmlns:o="urn:schemas-microsoft-com:office:office" xmlns:oel="http://schemas.microsoft.com/office/2019/extlst" xmlns:r="http://schemas.openxmlformats.org/officeDocument/2006/relationships" xmlns:m="http://schemas.openxmlformats.org/officeDocument/2006/math" xmlns:v="urn:schemas-microsoft-com:vml" xmlns:wp14="http://schemas.microsoft.com/office/word/2010/wordprocessingDrawing" xmlns:wp="http://schemas.openxmlformats.org/drawingml/2006/wordprocessingDrawing" xmlns:w10="urn:schemas-microsoft-com:office:word" xmlns:w="http://schemas.openxmlformats.org/wordprocessingml/2006/main" xmlns:w14="http://schemas.microsoft.com/office/word/2010/wordml" xmlns:w15="http://schemas.microsoft.com/office/word/2012/wordml" xmlns:w16cex="http://schemas.microsoft.com/office/word/2018/wordml/cex" xmlns:w16cid="http://schemas.microsoft.com/office/word/2016/wordml/cid" xmlns:w16="http://schemas.microsoft.com/office/word/2018/wordml" xmlns:w16du="http://schemas.microsoft.com/office/word/2023/wordml/word16du" xmlns:w16sdtdh="http://schemas.microsoft.com/office/word/2020/wordml/sdtdatahash" xmlns:w16sdtfl="http://schemas.microsoft.com/office/word/2024/wordml/sdtformatlock" xmlns:w16se="http://schemas.microsoft.com/office/word/2015/wordml/symex" xmlns:wpg="http://schemas.microsoft.com/office/word/2010/wordprocessingGroup" xmlns:wpi="http://schemas.microsoft.com/office/word/2010/wordprocessingInk" xmlns:wne="http://schemas.microsoft.com/office/word/2006/wordml" xmlns:wps="http://schemas.microsoft.com/office/word/2010/wordprocessingShape" mc:Ignorable="w14 w15 w16se w16cid w16 w16cex w16sdtdh w16sdtfl w16du wp14">
   <w:abstractNum w:abstractNumId="0" w15:restartNumberingAfterBreak="0">
@@ -959,8 +3880,427 @@
       </w:pPr>
     </w:lvl>
   </w:abstractNum>
+  <w:abstractNum w:abstractNumId="1" w15:restartNumberingAfterBreak="0">
+    <w:nsid w:val="26222807"/>
+    <w:multiLevelType w:val="multilevel"/>
+    <w:tmpl w:val="1809001F"/>
+    <w:lvl w:ilvl="0">
+      <w:start w:val="1"/>
+      <w:numFmt w:val="decimal"/>
+      <w:lvlText w:val="%1."/>
+      <w:lvlJc w:val="left"/>
+      <w:pPr>
+        <w:ind w:left="360" w:hanging="360"/>
+      </w:pPr>
+    </w:lvl>
+    <w:lvl w:ilvl="1">
+      <w:start w:val="1"/>
+      <w:numFmt w:val="decimal"/>
+      <w:lvlText w:val="%1.%2."/>
+      <w:lvlJc w:val="left"/>
+      <w:pPr>
+        <w:ind w:left="792" w:hanging="432"/>
+      </w:pPr>
+    </w:lvl>
+    <w:lvl w:ilvl="2">
+      <w:start w:val="1"/>
+      <w:numFmt w:val="decimal"/>
+      <w:lvlText w:val="%1.%2.%3."/>
+      <w:lvlJc w:val="left"/>
+      <w:pPr>
+        <w:ind w:left="1224" w:hanging="504"/>
+      </w:pPr>
+    </w:lvl>
+    <w:lvl w:ilvl="3">
+      <w:start w:val="1"/>
+      <w:numFmt w:val="decimal"/>
+      <w:lvlText w:val="%1.%2.%3.%4."/>
+      <w:lvlJc w:val="left"/>
+      <w:pPr>
+        <w:ind w:left="1728" w:hanging="648"/>
+      </w:pPr>
+    </w:lvl>
+    <w:lvl w:ilvl="4">
+      <w:start w:val="1"/>
+      <w:numFmt w:val="decimal"/>
+      <w:lvlText w:val="%1.%2.%3.%4.%5."/>
+      <w:lvlJc w:val="left"/>
+      <w:pPr>
+        <w:ind w:left="2232" w:hanging="792"/>
+      </w:pPr>
+    </w:lvl>
+    <w:lvl w:ilvl="5">
+      <w:start w:val="1"/>
+      <w:numFmt w:val="decimal"/>
+      <w:lvlText w:val="%1.%2.%3.%4.%5.%6."/>
+      <w:lvlJc w:val="left"/>
+      <w:pPr>
+        <w:ind w:left="2736" w:hanging="936"/>
+      </w:pPr>
+    </w:lvl>
+    <w:lvl w:ilvl="6">
+      <w:start w:val="1"/>
+      <w:numFmt w:val="decimal"/>
+      <w:lvlText w:val="%1.%2.%3.%4.%5.%6.%7."/>
+      <w:lvlJc w:val="left"/>
+      <w:pPr>
+        <w:ind w:left="3240" w:hanging="1080"/>
+      </w:pPr>
+    </w:lvl>
+    <w:lvl w:ilvl="7">
+      <w:start w:val="1"/>
+      <w:numFmt w:val="decimal"/>
+      <w:lvlText w:val="%1.%2.%3.%4.%5.%6.%7.%8."/>
+      <w:lvlJc w:val="left"/>
+      <w:pPr>
+        <w:ind w:left="3744" w:hanging="1224"/>
+      </w:pPr>
+    </w:lvl>
+    <w:lvl w:ilvl="8">
+      <w:start w:val="1"/>
+      <w:numFmt w:val="decimal"/>
+      <w:lvlText w:val="%1.%2.%3.%4.%5.%6.%7.%8.%9."/>
+      <w:lvlJc w:val="left"/>
+      <w:pPr>
+        <w:ind w:left="4320" w:hanging="1440"/>
+      </w:pPr>
+    </w:lvl>
+  </w:abstractNum>
+  <w:abstractNum w:abstractNumId="2" w15:restartNumberingAfterBreak="0">
+    <w:nsid w:val="31B07540"/>
+    <w:multiLevelType w:val="hybridMultilevel"/>
+    <w:tmpl w:val="BC9AF9AC"/>
+    <w:lvl w:ilvl="0" w:tplc="1809000F">
+      <w:start w:val="1"/>
+      <w:numFmt w:val="decimal"/>
+      <w:lvlText w:val="%1."/>
+      <w:lvlJc w:val="left"/>
+      <w:pPr>
+        <w:ind w:left="720" w:hanging="360"/>
+      </w:pPr>
+    </w:lvl>
+    <w:lvl w:ilvl="1" w:tplc="18090019" w:tentative="1">
+      <w:start w:val="1"/>
+      <w:numFmt w:val="lowerLetter"/>
+      <w:lvlText w:val="%2."/>
+      <w:lvlJc w:val="left"/>
+      <w:pPr>
+        <w:ind w:left="1440" w:hanging="360"/>
+      </w:pPr>
+    </w:lvl>
+    <w:lvl w:ilvl="2" w:tplc="1809001B" w:tentative="1">
+      <w:start w:val="1"/>
+      <w:numFmt w:val="lowerRoman"/>
+      <w:lvlText w:val="%3."/>
+      <w:lvlJc w:val="right"/>
+      <w:pPr>
+        <w:ind w:left="2160" w:hanging="180"/>
+      </w:pPr>
+    </w:lvl>
+    <w:lvl w:ilvl="3" w:tplc="1809000F" w:tentative="1">
+      <w:start w:val="1"/>
+      <w:numFmt w:val="decimal"/>
+      <w:lvlText w:val="%4."/>
+      <w:lvlJc w:val="left"/>
+      <w:pPr>
+        <w:ind w:left="2880" w:hanging="360"/>
+      </w:pPr>
+    </w:lvl>
+    <w:lvl w:ilvl="4" w:tplc="18090019" w:tentative="1">
+      <w:start w:val="1"/>
+      <w:numFmt w:val="lowerLetter"/>
+      <w:lvlText w:val="%5."/>
+      <w:lvlJc w:val="left"/>
+      <w:pPr>
+        <w:ind w:left="3600" w:hanging="360"/>
+      </w:pPr>
+    </w:lvl>
+    <w:lvl w:ilvl="5" w:tplc="1809001B" w:tentative="1">
+      <w:start w:val="1"/>
+      <w:numFmt w:val="lowerRoman"/>
+      <w:lvlText w:val="%6."/>
+      <w:lvlJc w:val="right"/>
+      <w:pPr>
+        <w:ind w:left="4320" w:hanging="180"/>
+      </w:pPr>
+    </w:lvl>
+    <w:lvl w:ilvl="6" w:tplc="1809000F" w:tentative="1">
+      <w:start w:val="1"/>
+      <w:numFmt w:val="decimal"/>
+      <w:lvlText w:val="%7."/>
+      <w:lvlJc w:val="left"/>
+      <w:pPr>
+        <w:ind w:left="5040" w:hanging="360"/>
+      </w:pPr>
+    </w:lvl>
+    <w:lvl w:ilvl="7" w:tplc="18090019" w:tentative="1">
+      <w:start w:val="1"/>
+      <w:numFmt w:val="lowerLetter"/>
+      <w:lvlText w:val="%8."/>
+      <w:lvlJc w:val="left"/>
+      <w:pPr>
+        <w:ind w:left="5760" w:hanging="360"/>
+      </w:pPr>
+    </w:lvl>
+    <w:lvl w:ilvl="8" w:tplc="1809001B" w:tentative="1">
+      <w:start w:val="1"/>
+      <w:numFmt w:val="lowerRoman"/>
+      <w:lvlText w:val="%9."/>
+      <w:lvlJc w:val="right"/>
+      <w:pPr>
+        <w:ind w:left="6480" w:hanging="180"/>
+      </w:pPr>
+    </w:lvl>
+  </w:abstractNum>
+  <w:abstractNum w:abstractNumId="3" w15:restartNumberingAfterBreak="0">
+    <w:nsid w:val="36FC1EC9"/>
+    <w:multiLevelType w:val="multilevel"/>
+    <w:tmpl w:val="18090025"/>
+    <w:lvl w:ilvl="0">
+      <w:start w:val="1"/>
+      <w:numFmt w:val="decimal"/>
+      <w:pStyle w:val="Heading1"/>
+      <w:lvlText w:val="%1"/>
+      <w:lvlJc w:val="left"/>
+      <w:pPr>
+        <w:ind w:left="432" w:hanging="432"/>
+      </w:pPr>
+    </w:lvl>
+    <w:lvl w:ilvl="1">
+      <w:start w:val="1"/>
+      <w:numFmt w:val="decimal"/>
+      <w:pStyle w:val="Heading2"/>
+      <w:lvlText w:val="%1.%2"/>
+      <w:lvlJc w:val="left"/>
+      <w:pPr>
+        <w:ind w:left="576" w:hanging="576"/>
+      </w:pPr>
+    </w:lvl>
+    <w:lvl w:ilvl="2">
+      <w:start w:val="1"/>
+      <w:numFmt w:val="decimal"/>
+      <w:pStyle w:val="Heading3"/>
+      <w:lvlText w:val="%1.%2.%3"/>
+      <w:lvlJc w:val="left"/>
+      <w:pPr>
+        <w:ind w:left="720" w:hanging="720"/>
+      </w:pPr>
+    </w:lvl>
+    <w:lvl w:ilvl="3">
+      <w:start w:val="1"/>
+      <w:numFmt w:val="decimal"/>
+      <w:pStyle w:val="Heading4"/>
+      <w:lvlText w:val="%1.%2.%3.%4"/>
+      <w:lvlJc w:val="left"/>
+      <w:pPr>
+        <w:ind w:left="864" w:hanging="864"/>
+      </w:pPr>
+    </w:lvl>
+    <w:lvl w:ilvl="4">
+      <w:start w:val="1"/>
+      <w:numFmt w:val="decimal"/>
+      <w:pStyle w:val="Heading5"/>
+      <w:lvlText w:val="%1.%2.%3.%4.%5"/>
+      <w:lvlJc w:val="left"/>
+      <w:pPr>
+        <w:ind w:left="1008" w:hanging="1008"/>
+      </w:pPr>
+    </w:lvl>
+    <w:lvl w:ilvl="5">
+      <w:start w:val="1"/>
+      <w:numFmt w:val="decimal"/>
+      <w:pStyle w:val="Heading6"/>
+      <w:lvlText w:val="%1.%2.%3.%4.%5.%6"/>
+      <w:lvlJc w:val="left"/>
+      <w:pPr>
+        <w:ind w:left="1152" w:hanging="1152"/>
+      </w:pPr>
+    </w:lvl>
+    <w:lvl w:ilvl="6">
+      <w:start w:val="1"/>
+      <w:numFmt w:val="decimal"/>
+      <w:pStyle w:val="Heading7"/>
+      <w:lvlText w:val="%1.%2.%3.%4.%5.%6.%7"/>
+      <w:lvlJc w:val="left"/>
+      <w:pPr>
+        <w:ind w:left="1296" w:hanging="1296"/>
+      </w:pPr>
+    </w:lvl>
+    <w:lvl w:ilvl="7">
+      <w:start w:val="1"/>
+      <w:numFmt w:val="decimal"/>
+      <w:pStyle w:val="Heading8"/>
+      <w:lvlText w:val="%1.%2.%3.%4.%5.%6.%7.%8"/>
+      <w:lvlJc w:val="left"/>
+      <w:pPr>
+        <w:ind w:left="1440" w:hanging="1440"/>
+      </w:pPr>
+    </w:lvl>
+    <w:lvl w:ilvl="8">
+      <w:start w:val="1"/>
+      <w:numFmt w:val="decimal"/>
+      <w:pStyle w:val="Heading9"/>
+      <w:lvlText w:val="%1.%2.%3.%4.%5.%6.%7.%8.%9"/>
+      <w:lvlJc w:val="left"/>
+      <w:pPr>
+        <w:ind w:left="1584" w:hanging="1584"/>
+      </w:pPr>
+    </w:lvl>
+  </w:abstractNum>
+  <w:abstractNum w:abstractNumId="4" w15:restartNumberingAfterBreak="0">
+    <w:nsid w:val="417C024E"/>
+    <w:multiLevelType w:val="hybridMultilevel"/>
+    <w:tmpl w:val="24E4C11C"/>
+    <w:lvl w:ilvl="0" w:tplc="E6D41556">
+      <w:start w:val="1"/>
+      <w:numFmt w:val="bullet"/>
+      <w:lvlText w:val="•"/>
+      <w:lvlJc w:val="left"/>
+      <w:pPr>
+        <w:tabs>
+          <w:tab w:val="num" w:pos="720"/>
+        </w:tabs>
+        <w:ind w:left="720" w:hanging="360"/>
+      </w:pPr>
+      <w:rPr>
+        <w:rFonts w:ascii="Arial" w:hAnsi="Arial" w:hint="default"/>
+      </w:rPr>
+    </w:lvl>
+    <w:lvl w:ilvl="1" w:tplc="F06C10A4" w:tentative="1">
+      <w:start w:val="1"/>
+      <w:numFmt w:val="bullet"/>
+      <w:lvlText w:val="•"/>
+      <w:lvlJc w:val="left"/>
+      <w:pPr>
+        <w:tabs>
+          <w:tab w:val="num" w:pos="1440"/>
+        </w:tabs>
+        <w:ind w:left="1440" w:hanging="360"/>
+      </w:pPr>
+      <w:rPr>
+        <w:rFonts w:ascii="Arial" w:hAnsi="Arial" w:hint="default"/>
+      </w:rPr>
+    </w:lvl>
+    <w:lvl w:ilvl="2" w:tplc="E6587118" w:tentative="1">
+      <w:start w:val="1"/>
+      <w:numFmt w:val="bullet"/>
+      <w:lvlText w:val="•"/>
+      <w:lvlJc w:val="left"/>
+      <w:pPr>
+        <w:tabs>
+          <w:tab w:val="num" w:pos="2160"/>
+        </w:tabs>
+        <w:ind w:left="2160" w:hanging="360"/>
+      </w:pPr>
+      <w:rPr>
+        <w:rFonts w:ascii="Arial" w:hAnsi="Arial" w:hint="default"/>
+      </w:rPr>
+    </w:lvl>
+    <w:lvl w:ilvl="3" w:tplc="0A7EC06E" w:tentative="1">
+      <w:start w:val="1"/>
+      <w:numFmt w:val="bullet"/>
+      <w:lvlText w:val="•"/>
+      <w:lvlJc w:val="left"/>
+      <w:pPr>
+        <w:tabs>
+          <w:tab w:val="num" w:pos="2880"/>
+        </w:tabs>
+        <w:ind w:left="2880" w:hanging="360"/>
+      </w:pPr>
+      <w:rPr>
+        <w:rFonts w:ascii="Arial" w:hAnsi="Arial" w:hint="default"/>
+      </w:rPr>
+    </w:lvl>
+    <w:lvl w:ilvl="4" w:tplc="B4C0B65A" w:tentative="1">
+      <w:start w:val="1"/>
+      <w:numFmt w:val="bullet"/>
+      <w:lvlText w:val="•"/>
+      <w:lvlJc w:val="left"/>
+      <w:pPr>
+        <w:tabs>
+          <w:tab w:val="num" w:pos="3600"/>
+        </w:tabs>
+        <w:ind w:left="3600" w:hanging="360"/>
+      </w:pPr>
+      <w:rPr>
+        <w:rFonts w:ascii="Arial" w:hAnsi="Arial" w:hint="default"/>
+      </w:rPr>
+    </w:lvl>
+    <w:lvl w:ilvl="5" w:tplc="0FC69650" w:tentative="1">
+      <w:start w:val="1"/>
+      <w:numFmt w:val="bullet"/>
+      <w:lvlText w:val="•"/>
+      <w:lvlJc w:val="left"/>
+      <w:pPr>
+        <w:tabs>
+          <w:tab w:val="num" w:pos="4320"/>
+        </w:tabs>
+        <w:ind w:left="4320" w:hanging="360"/>
+      </w:pPr>
+      <w:rPr>
+        <w:rFonts w:ascii="Arial" w:hAnsi="Arial" w:hint="default"/>
+      </w:rPr>
+    </w:lvl>
+    <w:lvl w:ilvl="6" w:tplc="F5E61072" w:tentative="1">
+      <w:start w:val="1"/>
+      <w:numFmt w:val="bullet"/>
+      <w:lvlText w:val="•"/>
+      <w:lvlJc w:val="left"/>
+      <w:pPr>
+        <w:tabs>
+          <w:tab w:val="num" w:pos="5040"/>
+        </w:tabs>
+        <w:ind w:left="5040" w:hanging="360"/>
+      </w:pPr>
+      <w:rPr>
+        <w:rFonts w:ascii="Arial" w:hAnsi="Arial" w:hint="default"/>
+      </w:rPr>
+    </w:lvl>
+    <w:lvl w:ilvl="7" w:tplc="5D32DB62" w:tentative="1">
+      <w:start w:val="1"/>
+      <w:numFmt w:val="bullet"/>
+      <w:lvlText w:val="•"/>
+      <w:lvlJc w:val="left"/>
+      <w:pPr>
+        <w:tabs>
+          <w:tab w:val="num" w:pos="5760"/>
+        </w:tabs>
+        <w:ind w:left="5760" w:hanging="360"/>
+      </w:pPr>
+      <w:rPr>
+        <w:rFonts w:ascii="Arial" w:hAnsi="Arial" w:hint="default"/>
+      </w:rPr>
+    </w:lvl>
+    <w:lvl w:ilvl="8" w:tplc="EBD6F2F6" w:tentative="1">
+      <w:start w:val="1"/>
+      <w:numFmt w:val="bullet"/>
+      <w:lvlText w:val="•"/>
+      <w:lvlJc w:val="left"/>
+      <w:pPr>
+        <w:tabs>
+          <w:tab w:val="num" w:pos="6480"/>
+        </w:tabs>
+        <w:ind w:left="6480" w:hanging="360"/>
+      </w:pPr>
+      <w:rPr>
+        <w:rFonts w:ascii="Arial" w:hAnsi="Arial" w:hint="default"/>
+      </w:rPr>
+    </w:lvl>
+  </w:abstractNum>
   <w:num w:numId="1" w16cid:durableId="691999202">
     <w:abstractNumId w:val="0"/>
+  </w:num>
+  <w:num w:numId="2" w16cid:durableId="1161458546">
+    <w:abstractNumId w:val="2"/>
+  </w:num>
+  <w:num w:numId="3" w16cid:durableId="145325925">
+    <w:abstractNumId w:val="1"/>
+  </w:num>
+  <w:num w:numId="4" w16cid:durableId="1119488605">
+    <w:abstractNumId w:val="3"/>
+  </w:num>
+  <w:num w:numId="5" w16cid:durableId="1061713459">
+    <w:abstractNumId w:val="4"/>
   </w:num>
 </w:numbering>
 </file>
@@ -1051,7 +4391,7 @@
     <w:lsdException w:name="Closing" w:semiHidden="1" w:unhideWhenUsed="1"/>
     <w:lsdException w:name="Signature" w:semiHidden="1" w:unhideWhenUsed="1"/>
     <w:lsdException w:name="Default Paragraph Font" w:semiHidden="1" w:uiPriority="1" w:unhideWhenUsed="1"/>
-    <w:lsdException w:name="Body Text" w:semiHidden="1" w:unhideWhenUsed="1"/>
+    <w:lsdException w:name="Body Text" w:semiHidden="1" w:uiPriority="0" w:unhideWhenUsed="1"/>
     <w:lsdException w:name="Body Text Indent" w:semiHidden="1" w:unhideWhenUsed="1"/>
     <w:lsdException w:name="List Continue" w:semiHidden="1" w:unhideWhenUsed="1"/>
     <w:lsdException w:name="List Continue 2" w:semiHidden="1" w:unhideWhenUsed="1"/>
@@ -1386,6 +4726,9 @@
     <w:pPr>
       <w:keepNext/>
       <w:keepLines/>
+      <w:numPr>
+        <w:numId w:val="4"/>
+      </w:numPr>
       <w:spacing w:before="360" w:after="80"/>
       <w:outlineLvl w:val="0"/>
     </w:pPr>
@@ -1402,13 +4745,16 @@
     <w:next w:val="Normal"/>
     <w:link w:val="Heading2Char"/>
     <w:uiPriority w:val="9"/>
-    <w:semiHidden/>
     <w:unhideWhenUsed/>
     <w:qFormat/>
     <w:rsid w:val="00874355"/>
     <w:pPr>
       <w:keepNext/>
       <w:keepLines/>
+      <w:numPr>
+        <w:ilvl w:val="1"/>
+        <w:numId w:val="4"/>
+      </w:numPr>
       <w:spacing w:before="160" w:after="80"/>
       <w:outlineLvl w:val="1"/>
     </w:pPr>
@@ -1425,13 +4771,16 @@
     <w:next w:val="Normal"/>
     <w:link w:val="Heading3Char"/>
     <w:uiPriority w:val="9"/>
-    <w:semiHidden/>
     <w:unhideWhenUsed/>
     <w:qFormat/>
     <w:rsid w:val="00874355"/>
     <w:pPr>
       <w:keepNext/>
       <w:keepLines/>
+      <w:numPr>
+        <w:ilvl w:val="2"/>
+        <w:numId w:val="4"/>
+      </w:numPr>
       <w:spacing w:before="160" w:after="80"/>
       <w:outlineLvl w:val="2"/>
     </w:pPr>
@@ -1455,6 +4804,10 @@
     <w:pPr>
       <w:keepNext/>
       <w:keepLines/>
+      <w:numPr>
+        <w:ilvl w:val="3"/>
+        <w:numId w:val="4"/>
+      </w:numPr>
       <w:spacing w:before="80" w:after="40"/>
       <w:outlineLvl w:val="3"/>
     </w:pPr>
@@ -1478,6 +4831,10 @@
     <w:pPr>
       <w:keepNext/>
       <w:keepLines/>
+      <w:numPr>
+        <w:ilvl w:val="4"/>
+        <w:numId w:val="4"/>
+      </w:numPr>
       <w:spacing w:before="80" w:after="40"/>
       <w:outlineLvl w:val="4"/>
     </w:pPr>
@@ -1499,6 +4856,10 @@
     <w:pPr>
       <w:keepNext/>
       <w:keepLines/>
+      <w:numPr>
+        <w:ilvl w:val="5"/>
+        <w:numId w:val="4"/>
+      </w:numPr>
       <w:spacing w:before="40" w:after="0"/>
       <w:outlineLvl w:val="5"/>
     </w:pPr>
@@ -1522,6 +4883,10 @@
     <w:pPr>
       <w:keepNext/>
       <w:keepLines/>
+      <w:numPr>
+        <w:ilvl w:val="6"/>
+        <w:numId w:val="4"/>
+      </w:numPr>
       <w:spacing w:before="40" w:after="0"/>
       <w:outlineLvl w:val="6"/>
     </w:pPr>
@@ -1543,6 +4908,10 @@
     <w:pPr>
       <w:keepNext/>
       <w:keepLines/>
+      <w:numPr>
+        <w:ilvl w:val="7"/>
+        <w:numId w:val="4"/>
+      </w:numPr>
       <w:spacing w:after="0"/>
       <w:outlineLvl w:val="7"/>
     </w:pPr>
@@ -1566,6 +4935,10 @@
     <w:pPr>
       <w:keepNext/>
       <w:keepLines/>
+      <w:numPr>
+        <w:ilvl w:val="8"/>
+        <w:numId w:val="4"/>
+      </w:numPr>
       <w:spacing w:after="0"/>
       <w:outlineLvl w:val="8"/>
     </w:pPr>
@@ -1577,6 +4950,7 @@
   <w:style w:type="character" w:default="1" w:styleId="DefaultParagraphFont">
     <w:name w:val="Default Paragraph Font"/>
     <w:uiPriority w:val="1"/>
+    <w:semiHidden/>
     <w:unhideWhenUsed/>
   </w:style>
   <w:style w:type="table" w:default="1" w:styleId="TableNormal">
@@ -1618,7 +4992,6 @@
     <w:basedOn w:val="DefaultParagraphFont"/>
     <w:link w:val="Heading2"/>
     <w:uiPriority w:val="9"/>
-    <w:semiHidden/>
     <w:rsid w:val="00874355"/>
     <w:rPr>
       <w:rFonts w:asciiTheme="majorHAnsi" w:eastAsiaTheme="majorEastAsia" w:hAnsiTheme="majorHAnsi" w:cstheme="majorBidi"/>
@@ -1632,7 +5005,6 @@
     <w:basedOn w:val="DefaultParagraphFont"/>
     <w:link w:val="Heading3"/>
     <w:uiPriority w:val="9"/>
-    <w:semiHidden/>
     <w:rsid w:val="00874355"/>
     <w:rPr>
       <w:rFonts w:eastAsiaTheme="majorEastAsia" w:cstheme="majorBidi"/>
@@ -1962,6 +5334,143 @@
       <w14:ligatures w14:val="none"/>
     </w:rPr>
   </w:style>
+  <w:style w:type="paragraph" w:styleId="TOC1">
+    <w:name w:val="toc 1"/>
+    <w:basedOn w:val="Normal"/>
+    <w:next w:val="Normal"/>
+    <w:autoRedefine/>
+    <w:uiPriority w:val="39"/>
+    <w:unhideWhenUsed/>
+    <w:rsid w:val="00821412"/>
+    <w:pPr>
+      <w:spacing w:after="100"/>
+    </w:pPr>
+  </w:style>
+  <w:style w:type="paragraph" w:styleId="TOC2">
+    <w:name w:val="toc 2"/>
+    <w:basedOn w:val="Normal"/>
+    <w:next w:val="Normal"/>
+    <w:autoRedefine/>
+    <w:uiPriority w:val="39"/>
+    <w:unhideWhenUsed/>
+    <w:rsid w:val="00821412"/>
+    <w:pPr>
+      <w:spacing w:after="100"/>
+      <w:ind w:left="220"/>
+    </w:pPr>
+  </w:style>
+  <w:style w:type="character" w:styleId="Hyperlink">
+    <w:name w:val="Hyperlink"/>
+    <w:basedOn w:val="DefaultParagraphFont"/>
+    <w:uiPriority w:val="99"/>
+    <w:unhideWhenUsed/>
+    <w:rsid w:val="00821412"/>
+    <w:rPr>
+      <w:color w:val="467886" w:themeColor="hyperlink"/>
+      <w:u w:val="single"/>
+    </w:rPr>
+  </w:style>
+  <w:style w:type="paragraph" w:styleId="NoSpacing">
+    <w:name w:val="No Spacing"/>
+    <w:link w:val="NoSpacingChar"/>
+    <w:uiPriority w:val="1"/>
+    <w:qFormat/>
+    <w:rsid w:val="002A6931"/>
+    <w:pPr>
+      <w:spacing w:after="0" w:line="240" w:lineRule="auto"/>
+    </w:pPr>
+    <w:rPr>
+      <w:rFonts w:ascii="Oxygen" w:eastAsiaTheme="minorEastAsia" w:hAnsi="Oxygen"/>
+      <w:color w:val="595959" w:themeColor="text1" w:themeTint="A6"/>
+      <w:kern w:val="0"/>
+      <w:lang w:val="en-US" w:eastAsia="zh-CN"/>
+      <w14:ligatures w14:val="none"/>
+    </w:rPr>
+  </w:style>
+  <w:style w:type="character" w:customStyle="1" w:styleId="NoSpacingChar">
+    <w:name w:val="No Spacing Char"/>
+    <w:basedOn w:val="DefaultParagraphFont"/>
+    <w:link w:val="NoSpacing"/>
+    <w:uiPriority w:val="1"/>
+    <w:rsid w:val="002A6931"/>
+    <w:rPr>
+      <w:rFonts w:ascii="Oxygen" w:eastAsiaTheme="minorEastAsia" w:hAnsi="Oxygen"/>
+      <w:color w:val="595959" w:themeColor="text1" w:themeTint="A6"/>
+      <w:kern w:val="0"/>
+      <w:lang w:val="en-US" w:eastAsia="zh-CN"/>
+      <w14:ligatures w14:val="none"/>
+    </w:rPr>
+  </w:style>
+  <w:style w:type="table" w:styleId="TableGrid">
+    <w:name w:val="Table Grid"/>
+    <w:basedOn w:val="TableNormal"/>
+    <w:uiPriority w:val="39"/>
+    <w:rsid w:val="002A6931"/>
+    <w:pPr>
+      <w:spacing w:after="0" w:line="240" w:lineRule="auto"/>
+    </w:pPr>
+    <w:rPr>
+      <w:rFonts w:eastAsiaTheme="minorEastAsia"/>
+      <w:kern w:val="0"/>
+      <w:sz w:val="24"/>
+      <w:szCs w:val="21"/>
+      <w:lang w:eastAsia="zh-CN" w:bidi="hi-IN"/>
+      <w14:ligatures w14:val="none"/>
+    </w:rPr>
+    <w:tblPr>
+      <w:tblBorders>
+        <w:top w:val="single" w:sz="4" w:space="0" w:color="auto"/>
+        <w:left w:val="single" w:sz="4" w:space="0" w:color="auto"/>
+        <w:bottom w:val="single" w:sz="4" w:space="0" w:color="auto"/>
+        <w:right w:val="single" w:sz="4" w:space="0" w:color="auto"/>
+        <w:insideH w:val="single" w:sz="4" w:space="0" w:color="auto"/>
+        <w:insideV w:val="single" w:sz="4" w:space="0" w:color="auto"/>
+      </w:tblBorders>
+    </w:tblPr>
+  </w:style>
+  <w:style w:type="paragraph" w:styleId="BodyText">
+    <w:name w:val="Body Text"/>
+    <w:basedOn w:val="Normal"/>
+    <w:link w:val="BodyTextChar"/>
+    <w:unhideWhenUsed/>
+    <w:rsid w:val="002A6931"/>
+    <w:pPr>
+      <w:spacing w:after="0" w:line="360" w:lineRule="auto"/>
+    </w:pPr>
+    <w:rPr>
+      <w:rFonts w:ascii="Times New Roman" w:eastAsia="Times New Roman" w:hAnsi="Times New Roman" w:cs="Times New Roman"/>
+      <w:sz w:val="24"/>
+      <w:szCs w:val="20"/>
+      <w:lang w:val="en-AU"/>
+    </w:rPr>
+  </w:style>
+  <w:style w:type="character" w:customStyle="1" w:styleId="BodyTextChar">
+    <w:name w:val="Body Text Char"/>
+    <w:basedOn w:val="DefaultParagraphFont"/>
+    <w:link w:val="BodyText"/>
+    <w:rsid w:val="002A6931"/>
+    <w:rPr>
+      <w:rFonts w:ascii="Times New Roman" w:eastAsia="Times New Roman" w:hAnsi="Times New Roman" w:cs="Times New Roman"/>
+      <w:kern w:val="0"/>
+      <w:sz w:val="24"/>
+      <w:szCs w:val="20"/>
+      <w:lang w:val="en-AU"/>
+      <w14:ligatures w14:val="none"/>
+    </w:rPr>
+  </w:style>
+  <w:style w:type="paragraph" w:styleId="TOC3">
+    <w:name w:val="toc 3"/>
+    <w:basedOn w:val="Normal"/>
+    <w:next w:val="Normal"/>
+    <w:autoRedefine/>
+    <w:uiPriority w:val="39"/>
+    <w:unhideWhenUsed/>
+    <w:rsid w:val="008E7991"/>
+    <w:pPr>
+      <w:spacing w:after="100"/>
+      <w:ind w:left="440"/>
+    </w:pPr>
+  </w:style>
 </w:styles>
 </file>
 

</xml_diff>

<commit_message>
Working on Question 5
</commit_message>
<xml_diff>
--- a/OisinGibson_L00172671_AADSHashingCA.docx
+++ b/OisinGibson_L00172671_AADSHashingCA.docx
@@ -933,20 +933,8 @@
                 <w:sz w:val="18"/>
                 <w:szCs w:val="18"/>
               </w:rPr>
-              <w:t xml:space="preserve">Place and time for submitting work:    </w:t>
-            </w:r>
-            <w:proofErr w:type="spellStart"/>
-            <w:r>
-              <w:rPr>
-                <w:rFonts w:ascii="Open Sans" w:hAnsi="Open Sans" w:cs="Open Sans"/>
-                <w:b/>
-                <w:bCs/>
-                <w:sz w:val="18"/>
-                <w:szCs w:val="18"/>
-              </w:rPr>
-              <w:t>BlackBoard</w:t>
-            </w:r>
-            <w:proofErr w:type="spellEnd"/>
+              <w:t>Place and time for submitting work:    BlackBoard</w:t>
+            </w:r>
             <w:r>
               <w:rPr>
                 <w:rFonts w:ascii="Open Sans" w:hAnsi="Open Sans" w:cs="Open Sans"/>
@@ -1159,6 +1147,16 @@
               </w:rPr>
               <w:t xml:space="preserve">Word Count (where applicable):  </w:t>
             </w:r>
+            <w:r>
+              <w:rPr>
+                <w:rFonts w:ascii="Open Sans" w:hAnsi="Open Sans" w:cs="Open Sans"/>
+                <w:b/>
+                <w:bCs/>
+                <w:sz w:val="18"/>
+                <w:szCs w:val="18"/>
+              </w:rPr>
+              <w:t>1422</w:t>
+            </w:r>
           </w:p>
         </w:tc>
       </w:tr>
@@ -1318,9 +1316,27 @@
                 <w:sz w:val="18"/>
                 <w:szCs w:val="18"/>
               </w:rPr>
-              <w:t>Penalties</w:t>
-            </w:r>
-            <w:proofErr w:type="gramStart"/>
+              <w:t xml:space="preserve">Penalties:  </w:t>
+            </w:r>
+            <w:r>
+              <w:rPr>
+                <w:rFonts w:ascii="Open Sans" w:hAnsi="Open Sans" w:cs="Open Sans"/>
+                <w:sz w:val="18"/>
+                <w:szCs w:val="18"/>
+              </w:rPr>
+              <w:t xml:space="preserve">The total marks available for an assessment is reduced by 15% for work submitted up to one week late.  The total marks available are reduced by 30% for work up to two weeks late.  Assessment work received more than two weeks late will receive a mark of zero.  </w:t>
+            </w:r>
+          </w:p>
+          <w:p>
+            <w:pPr>
+              <w:pStyle w:val="NoSpacing"/>
+              <w:spacing w:line="276" w:lineRule="auto"/>
+              <w:rPr>
+                <w:rFonts w:ascii="Open Sans" w:hAnsi="Open Sans" w:cs="Open Sans"/>
+                <w:sz w:val="18"/>
+                <w:szCs w:val="18"/>
+              </w:rPr>
+            </w:pPr>
             <w:r>
               <w:rPr>
                 <w:rFonts w:ascii="Open Sans" w:hAnsi="Open Sans" w:cs="Open Sans"/>
@@ -1329,7 +1345,17 @@
                 <w:sz w:val="18"/>
                 <w:szCs w:val="18"/>
               </w:rPr>
-              <w:t xml:space="preserve">:  </w:t>
+              <w:t>Continuous Assessment</w:t>
+            </w:r>
+            <w:r>
+              <w:rPr>
+                <w:rFonts w:ascii="Open Sans" w:hAnsi="Open Sans" w:cs="Open Sans"/>
+                <w:b/>
+                <w:bCs/>
+                <w:sz w:val="18"/>
+                <w:szCs w:val="18"/>
+              </w:rPr>
+              <w:t>:</w:t>
             </w:r>
             <w:r>
               <w:rPr>
@@ -1337,88 +1363,15 @@
                 <w:sz w:val="18"/>
                 <w:szCs w:val="18"/>
               </w:rPr>
-              <w:t>The</w:t>
-            </w:r>
-            <w:proofErr w:type="gramEnd"/>
+              <w:t xml:space="preserve"> For</w:t>
+            </w:r>
             <w:r>
               <w:rPr>
                 <w:rFonts w:ascii="Open Sans" w:hAnsi="Open Sans" w:cs="Open Sans"/>
                 <w:sz w:val="18"/>
                 <w:szCs w:val="18"/>
               </w:rPr>
-              <w:t xml:space="preserve"> total marks available for an assessment </w:t>
-            </w:r>
-            <w:proofErr w:type="gramStart"/>
-            <w:r>
-              <w:rPr>
-                <w:rFonts w:ascii="Open Sans" w:hAnsi="Open Sans" w:cs="Open Sans"/>
-                <w:sz w:val="18"/>
-                <w:szCs w:val="18"/>
-              </w:rPr>
-              <w:t>is</w:t>
-            </w:r>
-            <w:proofErr w:type="gramEnd"/>
-            <w:r>
-              <w:rPr>
-                <w:rFonts w:ascii="Open Sans" w:hAnsi="Open Sans" w:cs="Open Sans"/>
-                <w:sz w:val="18"/>
-                <w:szCs w:val="18"/>
-              </w:rPr>
-              <w:t xml:space="preserve"> reduced by 15% for work submitted up to one week </w:t>
-            </w:r>
-            <w:proofErr w:type="gramStart"/>
-            <w:r>
-              <w:rPr>
-                <w:rFonts w:ascii="Open Sans" w:hAnsi="Open Sans" w:cs="Open Sans"/>
-                <w:sz w:val="18"/>
-                <w:szCs w:val="18"/>
-              </w:rPr>
-              <w:t>late</w:t>
-            </w:r>
-            <w:proofErr w:type="gramEnd"/>
-            <w:r>
-              <w:rPr>
-                <w:rFonts w:ascii="Open Sans" w:hAnsi="Open Sans" w:cs="Open Sans"/>
-                <w:sz w:val="18"/>
-                <w:szCs w:val="18"/>
-              </w:rPr>
-              <w:t xml:space="preserve">.  The total marks available are reduced by 30% for work up to two weeks </w:t>
-            </w:r>
-            <w:proofErr w:type="gramStart"/>
-            <w:r>
-              <w:rPr>
-                <w:rFonts w:ascii="Open Sans" w:hAnsi="Open Sans" w:cs="Open Sans"/>
-                <w:sz w:val="18"/>
-                <w:szCs w:val="18"/>
-              </w:rPr>
-              <w:t>late</w:t>
-            </w:r>
-            <w:proofErr w:type="gramEnd"/>
-            <w:r>
-              <w:rPr>
-                <w:rFonts w:ascii="Open Sans" w:hAnsi="Open Sans" w:cs="Open Sans"/>
-                <w:sz w:val="18"/>
-                <w:szCs w:val="18"/>
-              </w:rPr>
-              <w:t xml:space="preserve">.  Assessment work received more than two weeks </w:t>
-            </w:r>
-            <w:proofErr w:type="gramStart"/>
-            <w:r>
-              <w:rPr>
-                <w:rFonts w:ascii="Open Sans" w:hAnsi="Open Sans" w:cs="Open Sans"/>
-                <w:sz w:val="18"/>
-                <w:szCs w:val="18"/>
-              </w:rPr>
-              <w:t>late</w:t>
-            </w:r>
-            <w:proofErr w:type="gramEnd"/>
-            <w:r>
-              <w:rPr>
-                <w:rFonts w:ascii="Open Sans" w:hAnsi="Open Sans" w:cs="Open Sans"/>
-                <w:sz w:val="18"/>
-                <w:szCs w:val="18"/>
-              </w:rPr>
-              <w:t xml:space="preserve"> will receive a mark of zero.  </w:t>
+              <w:t xml:space="preserve"> students repeating an examination, marks awarded for continuous assessment shall normally be carried forward from the original examination to the repeat examination.</w:t>
             </w:r>
           </w:p>
           <w:p>
@@ -1427,6 +1380,7 @@
               <w:spacing w:line="276" w:lineRule="auto"/>
               <w:rPr>
                 <w:rFonts w:ascii="Open Sans" w:hAnsi="Open Sans" w:cs="Open Sans"/>
+                <w:b/>
                 <w:sz w:val="18"/>
                 <w:szCs w:val="18"/>
               </w:rPr>
@@ -1435,37 +1389,10 @@
               <w:rPr>
                 <w:rFonts w:ascii="Open Sans" w:hAnsi="Open Sans" w:cs="Open Sans"/>
                 <w:b/>
-                <w:bCs/>
                 <w:sz w:val="18"/>
                 <w:szCs w:val="18"/>
               </w:rPr>
-              <w:t>Continuous Assessment</w:t>
-            </w:r>
-            <w:r>
-              <w:rPr>
-                <w:rFonts w:ascii="Open Sans" w:hAnsi="Open Sans" w:cs="Open Sans"/>
-                <w:b/>
-                <w:bCs/>
-                <w:sz w:val="18"/>
-                <w:szCs w:val="18"/>
-              </w:rPr>
-              <w:t>:</w:t>
-            </w:r>
-            <w:r>
-              <w:rPr>
-                <w:rFonts w:ascii="Open Sans" w:hAnsi="Open Sans" w:cs="Open Sans"/>
-                <w:sz w:val="18"/>
-                <w:szCs w:val="18"/>
-              </w:rPr>
-              <w:t xml:space="preserve"> For</w:t>
-            </w:r>
-            <w:r>
-              <w:rPr>
-                <w:rFonts w:ascii="Open Sans" w:hAnsi="Open Sans" w:cs="Open Sans"/>
-                <w:sz w:val="18"/>
-                <w:szCs w:val="18"/>
-              </w:rPr>
-              <w:t xml:space="preserve"> students repeating an examination, marks awarded for continuous assessment shall normally be carried forward from the original examination to the repeat examination.</w:t>
+              <w:t>Declaration:</w:t>
             </w:r>
           </w:p>
           <w:p>
@@ -1482,11 +1409,42 @@
             <w:r>
               <w:rPr>
                 <w:rFonts w:ascii="Open Sans" w:hAnsi="Open Sans" w:cs="Open Sans"/>
-                <w:b/>
                 <w:sz w:val="18"/>
                 <w:szCs w:val="18"/>
               </w:rPr>
-              <w:t>Declaration:</w:t>
+              <w:t xml:space="preserve">I declare that this work is entirely my own and does not contain the words or ideas of someone else, whether published or not, without specific acknowledgement by relevant referencing. I have read and understood the </w:t>
+            </w:r>
+            <w:r>
+              <w:rPr>
+                <w:rFonts w:ascii="Open Sans" w:hAnsi="Open Sans" w:cs="Open Sans"/>
+                <w:sz w:val="18"/>
+                <w:szCs w:val="18"/>
+              </w:rPr>
+              <w:t>ATU Donegal</w:t>
+            </w:r>
+            <w:r>
+              <w:rPr>
+                <w:rFonts w:ascii="Open Sans" w:hAnsi="Open Sans" w:cs="Open Sans"/>
+                <w:sz w:val="18"/>
+                <w:szCs w:val="18"/>
+              </w:rPr>
+              <w:t xml:space="preserve"> Plagiarism Policy on the “Student &amp; Academic Policies” section of the </w:t>
+            </w:r>
+            <w:r>
+              <w:rPr>
+                <w:rFonts w:ascii="Open Sans" w:hAnsi="Open Sans" w:cs="Open Sans"/>
+                <w:sz w:val="18"/>
+                <w:szCs w:val="18"/>
+              </w:rPr>
+              <w:t>ATU Donegal</w:t>
+            </w:r>
+            <w:r>
+              <w:rPr>
+                <w:rFonts w:ascii="Open Sans" w:hAnsi="Open Sans" w:cs="Open Sans"/>
+                <w:sz w:val="18"/>
+                <w:szCs w:val="18"/>
+              </w:rPr>
+              <w:t xml:space="preserve"> Website and understand plagiarism to include:</w:t>
             </w:r>
           </w:p>
           <w:p>
@@ -1495,7 +1453,6 @@
               <w:spacing w:line="276" w:lineRule="auto"/>
               <w:rPr>
                 <w:rFonts w:ascii="Open Sans" w:hAnsi="Open Sans" w:cs="Open Sans"/>
-                <w:b/>
                 <w:sz w:val="18"/>
                 <w:szCs w:val="18"/>
               </w:rPr>
@@ -1506,57 +1463,7 @@
                 <w:sz w:val="18"/>
                 <w:szCs w:val="18"/>
               </w:rPr>
-              <w:t xml:space="preserve">I declare that this work is entirely my own and does not contain the words or ideas of someone else, whether published or not, without specific acknowledgement by relevant </w:t>
-            </w:r>
-            <w:proofErr w:type="gramStart"/>
-            <w:r>
-              <w:rPr>
-                <w:rFonts w:ascii="Open Sans" w:hAnsi="Open Sans" w:cs="Open Sans"/>
-                <w:sz w:val="18"/>
-                <w:szCs w:val="18"/>
-              </w:rPr>
-              <w:t>referencing</w:t>
-            </w:r>
-            <w:proofErr w:type="gramEnd"/>
-            <w:r>
-              <w:rPr>
-                <w:rFonts w:ascii="Open Sans" w:hAnsi="Open Sans" w:cs="Open Sans"/>
-                <w:sz w:val="18"/>
-                <w:szCs w:val="18"/>
-              </w:rPr>
-              <w:t xml:space="preserve">. I have read and understood the </w:t>
-            </w:r>
-            <w:r>
-              <w:rPr>
-                <w:rFonts w:ascii="Open Sans" w:hAnsi="Open Sans" w:cs="Open Sans"/>
-                <w:sz w:val="18"/>
-                <w:szCs w:val="18"/>
-              </w:rPr>
-              <w:t>ATU Donegal</w:t>
-            </w:r>
-            <w:r>
-              <w:rPr>
-                <w:rFonts w:ascii="Open Sans" w:hAnsi="Open Sans" w:cs="Open Sans"/>
-                <w:sz w:val="18"/>
-                <w:szCs w:val="18"/>
-              </w:rPr>
-              <w:t xml:space="preserve"> Plagiarism Policy on the “Student &amp; Academic Policies” section of the </w:t>
-            </w:r>
-            <w:r>
-              <w:rPr>
-                <w:rFonts w:ascii="Open Sans" w:hAnsi="Open Sans" w:cs="Open Sans"/>
-                <w:sz w:val="18"/>
-                <w:szCs w:val="18"/>
-              </w:rPr>
-              <w:t>ATU Donegal</w:t>
-            </w:r>
-            <w:r>
-              <w:rPr>
-                <w:rFonts w:ascii="Open Sans" w:hAnsi="Open Sans" w:cs="Open Sans"/>
-                <w:sz w:val="18"/>
-                <w:szCs w:val="18"/>
-              </w:rPr>
-              <w:t xml:space="preserve"> Website and understand plagiarism to include:</w:t>
+              <w:t>Direct copying of text, images and other materials (electronic or otherwise) from a book, article, fellow student’s essay, handout, web page or other source without proper acknowledgement.</w:t>
             </w:r>
           </w:p>
           <w:p>
@@ -1575,7 +1482,7 @@
                 <w:sz w:val="18"/>
                 <w:szCs w:val="18"/>
               </w:rPr>
-              <w:t>Direct copying of text, images and other materials (electronic or otherwise) from a book, article, fellow student’s essay, handout, web page or other source without proper acknowledgement.</w:t>
+              <w:t>Claiming individual ideas derived from a book, article etc. as one’s own and incorporating them into one’s work without acknowledging the source of these ideas.</w:t>
             </w:r>
           </w:p>
           <w:p>
@@ -1594,7 +1501,7 @@
                 <w:sz w:val="18"/>
                 <w:szCs w:val="18"/>
               </w:rPr>
-              <w:t>Claiming individual ideas derived from a book, article etc. as one’s own and incorporating them into one’s work without acknowledging the source of these ideas.</w:t>
+              <w:t xml:space="preserve">Overly depending on the work of one or more other sources without proper acknowledgement of the source, by constructing an essay, project etc., extracting large sections of text from another source and merely linking these together with a few of one’s own sentences. </w:t>
             </w:r>
           </w:p>
           <w:p>
@@ -1613,44 +1520,7 @@
                 <w:sz w:val="18"/>
                 <w:szCs w:val="18"/>
               </w:rPr>
-              <w:t xml:space="preserve">Overly depending on the work of one or more other sources without proper acknowledgement of the source, by constructing an essay, project etc., extracting large sections of text from another source and merely linking these together with a few of one’s own sentences. </w:t>
-            </w:r>
-          </w:p>
-          <w:p>
-            <w:pPr>
-              <w:pStyle w:val="NoSpacing"/>
-              <w:spacing w:line="276" w:lineRule="auto"/>
-              <w:rPr>
-                <w:rFonts w:ascii="Open Sans" w:hAnsi="Open Sans" w:cs="Open Sans"/>
-                <w:sz w:val="18"/>
-                <w:szCs w:val="18"/>
-              </w:rPr>
-            </w:pPr>
-            <w:r>
-              <w:rPr>
-                <w:rFonts w:ascii="Open Sans" w:hAnsi="Open Sans" w:cs="Open Sans"/>
-                <w:sz w:val="18"/>
-                <w:szCs w:val="18"/>
-              </w:rPr>
-              <w:t xml:space="preserve">I understand that it is my responsibility to </w:t>
-            </w:r>
-            <w:proofErr w:type="spellStart"/>
-            <w:r>
-              <w:rPr>
-                <w:rFonts w:ascii="Open Sans" w:hAnsi="Open Sans" w:cs="Open Sans"/>
-                <w:sz w:val="18"/>
-                <w:szCs w:val="18"/>
-              </w:rPr>
-              <w:t>familiarise</w:t>
-            </w:r>
-            <w:proofErr w:type="spellEnd"/>
-            <w:r>
-              <w:rPr>
-                <w:rFonts w:ascii="Open Sans" w:hAnsi="Open Sans" w:cs="Open Sans"/>
-                <w:sz w:val="18"/>
-                <w:szCs w:val="18"/>
-              </w:rPr>
-              <w:t xml:space="preserve"> myself with and to follow the Institute’s Assessment Regulations. I acknowledge that Incidents of alleged plagiarism and cheating are dealt with in accordance with the Institute’s Assessment Regulations and that penalties will be applied if I breach this policy.</w:t>
+              <w:t>I understand that it is my responsibility to familiarise myself with and to follow the Institute’s Assessment Regulations. I acknowledge that Incidents of alleged plagiarism and cheating are dealt with in accordance with the Institute’s Assessment Regulations and that penalties will be applied if I breach this policy.</w:t>
             </w:r>
           </w:p>
           <w:p>
@@ -1730,6 +1600,16 @@
                 <w:szCs w:val="18"/>
               </w:rPr>
               <w:t>Date:</w:t>
+            </w:r>
+            <w:r>
+              <w:rPr>
+                <w:rFonts w:ascii="Open Sans" w:hAnsi="Open Sans" w:cs="Open Sans"/>
+                <w:b/>
+                <w:bCs/>
+                <w:sz w:val="18"/>
+                <w:szCs w:val="18"/>
+              </w:rPr>
+              <w:t xml:space="preserve"> 29/12/2025</w:t>
             </w:r>
           </w:p>
         </w:tc>
@@ -1840,7 +1720,7 @@
             </w:rPr>
             <w:fldChar w:fldCharType="separate"/>
           </w:r>
-          <w:hyperlink w:anchor="_Toc216967439" w:history="1">
+          <w:hyperlink w:anchor="_Toc217725657" w:history="1">
             <w:r>
               <w:rPr>
                 <w:rStyle w:val="Hyperlink"/>
@@ -1887,7 +1767,7 @@
                 <w:noProof/>
                 <w:webHidden/>
               </w:rPr>
-              <w:instrText xml:space="preserve"> PAGEREF _Toc216967439 \h </w:instrText>
+              <w:instrText xml:space="preserve"> PAGEREF _Toc217725657 \h </w:instrText>
             </w:r>
             <w:r>
               <w:rPr>
@@ -1934,7 +1814,7 @@
               <w14:ligatures w14:val="standardContextual"/>
             </w:rPr>
           </w:pPr>
-          <w:hyperlink w:anchor="_Toc216967440" w:history="1">
+          <w:hyperlink w:anchor="_Toc217725658" w:history="1">
             <w:r>
               <w:rPr>
                 <w:rStyle w:val="Hyperlink"/>
@@ -1981,7 +1861,7 @@
                 <w:noProof/>
                 <w:webHidden/>
               </w:rPr>
-              <w:instrText xml:space="preserve"> PAGEREF _Toc216967440 \h </w:instrText>
+              <w:instrText xml:space="preserve"> PAGEREF _Toc217725658 \h </w:instrText>
             </w:r>
             <w:r>
               <w:rPr>
@@ -2028,7 +1908,7 @@
               <w14:ligatures w14:val="standardContextual"/>
             </w:rPr>
           </w:pPr>
-          <w:hyperlink w:anchor="_Toc216967441" w:history="1">
+          <w:hyperlink w:anchor="_Toc217725659" w:history="1">
             <w:r>
               <w:rPr>
                 <w:rStyle w:val="Hyperlink"/>
@@ -2075,7 +1955,7 @@
                 <w:noProof/>
                 <w:webHidden/>
               </w:rPr>
-              <w:instrText xml:space="preserve"> PAGEREF _Toc216967441 \h </w:instrText>
+              <w:instrText xml:space="preserve"> PAGEREF _Toc217725659 \h </w:instrText>
             </w:r>
             <w:r>
               <w:rPr>
@@ -2122,7 +2002,7 @@
               <w14:ligatures w14:val="standardContextual"/>
             </w:rPr>
           </w:pPr>
-          <w:hyperlink w:anchor="_Toc216967442" w:history="1">
+          <w:hyperlink w:anchor="_Toc217725660" w:history="1">
             <w:r>
               <w:rPr>
                 <w:rStyle w:val="Hyperlink"/>
@@ -2169,7 +2049,7 @@
                 <w:noProof/>
                 <w:webHidden/>
               </w:rPr>
-              <w:instrText xml:space="preserve"> PAGEREF _Toc216967442 \h </w:instrText>
+              <w:instrText xml:space="preserve"> PAGEREF _Toc217725660 \h </w:instrText>
             </w:r>
             <w:r>
               <w:rPr>
@@ -2216,7 +2096,7 @@
               <w14:ligatures w14:val="standardContextual"/>
             </w:rPr>
           </w:pPr>
-          <w:hyperlink w:anchor="_Toc216967443" w:history="1">
+          <w:hyperlink w:anchor="_Toc217725661" w:history="1">
             <w:r>
               <w:rPr>
                 <w:rStyle w:val="Hyperlink"/>
@@ -2263,7 +2143,7 @@
                 <w:noProof/>
                 <w:webHidden/>
               </w:rPr>
-              <w:instrText xml:space="preserve"> PAGEREF _Toc216967443 \h </w:instrText>
+              <w:instrText xml:space="preserve"> PAGEREF _Toc217725661 \h </w:instrText>
             </w:r>
             <w:r>
               <w:rPr>
@@ -2310,7 +2190,7 @@
               <w14:ligatures w14:val="standardContextual"/>
             </w:rPr>
           </w:pPr>
-          <w:hyperlink w:anchor="_Toc216967444" w:history="1">
+          <w:hyperlink w:anchor="_Toc217725662" w:history="1">
             <w:r>
               <w:rPr>
                 <w:rStyle w:val="Hyperlink"/>
@@ -2357,7 +2237,7 @@
                 <w:noProof/>
                 <w:webHidden/>
               </w:rPr>
-              <w:instrText xml:space="preserve"> PAGEREF _Toc216967444 \h </w:instrText>
+              <w:instrText xml:space="preserve"> PAGEREF _Toc217725662 \h </w:instrText>
             </w:r>
             <w:r>
               <w:rPr>
@@ -2404,7 +2284,7 @@
               <w14:ligatures w14:val="standardContextual"/>
             </w:rPr>
           </w:pPr>
-          <w:hyperlink w:anchor="_Toc216967445" w:history="1">
+          <w:hyperlink w:anchor="_Toc217725663" w:history="1">
             <w:r>
               <w:rPr>
                 <w:rStyle w:val="Hyperlink"/>
@@ -2449,7 +2329,7 @@
                 <w:noProof/>
                 <w:webHidden/>
               </w:rPr>
-              <w:instrText xml:space="preserve"> PAGEREF _Toc216967445 \h </w:instrText>
+              <w:instrText xml:space="preserve"> PAGEREF _Toc217725663 \h </w:instrText>
             </w:r>
             <w:r>
               <w:rPr>
@@ -2496,7 +2376,7 @@
               <w14:ligatures w14:val="standardContextual"/>
             </w:rPr>
           </w:pPr>
-          <w:hyperlink w:anchor="_Toc216967446" w:history="1">
+          <w:hyperlink w:anchor="_Toc217725664" w:history="1">
             <w:r>
               <w:rPr>
                 <w:rStyle w:val="Hyperlink"/>
@@ -2541,7 +2421,7 @@
                 <w:noProof/>
                 <w:webHidden/>
               </w:rPr>
-              <w:instrText xml:space="preserve"> PAGEREF _Toc216967446 \h </w:instrText>
+              <w:instrText xml:space="preserve"> PAGEREF _Toc217725664 \h </w:instrText>
             </w:r>
             <w:r>
               <w:rPr>
@@ -2588,7 +2468,7 @@
               <w14:ligatures w14:val="standardContextual"/>
             </w:rPr>
           </w:pPr>
-          <w:hyperlink w:anchor="_Toc216967447" w:history="1">
+          <w:hyperlink w:anchor="_Toc217725665" w:history="1">
             <w:r>
               <w:rPr>
                 <w:rStyle w:val="Hyperlink"/>
@@ -2633,7 +2513,7 @@
                 <w:noProof/>
                 <w:webHidden/>
               </w:rPr>
-              <w:instrText xml:space="preserve"> PAGEREF _Toc216967447 \h </w:instrText>
+              <w:instrText xml:space="preserve"> PAGEREF _Toc217725665 \h </w:instrText>
             </w:r>
             <w:r>
               <w:rPr>
@@ -2680,7 +2560,7 @@
               <w14:ligatures w14:val="standardContextual"/>
             </w:rPr>
           </w:pPr>
-          <w:hyperlink w:anchor="_Toc216967448" w:history="1">
+          <w:hyperlink w:anchor="_Toc217725666" w:history="1">
             <w:r>
               <w:rPr>
                 <w:rStyle w:val="Hyperlink"/>
@@ -2725,7 +2605,7 @@
                 <w:noProof/>
                 <w:webHidden/>
               </w:rPr>
-              <w:instrText xml:space="preserve"> PAGEREF _Toc216967448 \h </w:instrText>
+              <w:instrText xml:space="preserve"> PAGEREF _Toc217725666 \h </w:instrText>
             </w:r>
             <w:r>
               <w:rPr>
@@ -2772,7 +2652,7 @@
               <w14:ligatures w14:val="standardContextual"/>
             </w:rPr>
           </w:pPr>
-          <w:hyperlink w:anchor="_Toc216967449" w:history="1">
+          <w:hyperlink w:anchor="_Toc217725667" w:history="1">
             <w:r>
               <w:rPr>
                 <w:rStyle w:val="Hyperlink"/>
@@ -2817,7 +2697,7 @@
                 <w:noProof/>
                 <w:webHidden/>
               </w:rPr>
-              <w:instrText xml:space="preserve"> PAGEREF _Toc216967449 \h </w:instrText>
+              <w:instrText xml:space="preserve"> PAGEREF _Toc217725667 \h </w:instrText>
             </w:r>
             <w:r>
               <w:rPr>
@@ -2864,7 +2744,7 @@
               <w14:ligatures w14:val="standardContextual"/>
             </w:rPr>
           </w:pPr>
-          <w:hyperlink w:anchor="_Toc216967450" w:history="1">
+          <w:hyperlink w:anchor="_Toc217725668" w:history="1">
             <w:r>
               <w:rPr>
                 <w:rStyle w:val="Hyperlink"/>
@@ -2888,7 +2768,7 @@
                 <w:rStyle w:val="Hyperlink"/>
                 <w:noProof/>
               </w:rPr>
-              <w:t>Question 5</w:t>
+              <w:t>Question 5 - Briefly describe how Question 4 can be updated to support concurrency</w:t>
             </w:r>
             <w:r>
               <w:rPr>
@@ -2909,7 +2789,7 @@
                 <w:noProof/>
                 <w:webHidden/>
               </w:rPr>
-              <w:instrText xml:space="preserve"> PAGEREF _Toc216967450 \h </w:instrText>
+              <w:instrText xml:space="preserve"> PAGEREF _Toc217725668 \h </w:instrText>
             </w:r>
             <w:r>
               <w:rPr>
@@ -2956,7 +2836,7 @@
               <w14:ligatures w14:val="standardContextual"/>
             </w:rPr>
           </w:pPr>
-          <w:hyperlink w:anchor="_Toc216967451" w:history="1">
+          <w:hyperlink w:anchor="_Toc217725669" w:history="1">
             <w:r>
               <w:rPr>
                 <w:rStyle w:val="Hyperlink"/>
@@ -3001,7 +2881,7 @@
                 <w:noProof/>
                 <w:webHidden/>
               </w:rPr>
-              <w:instrText xml:space="preserve"> PAGEREF _Toc216967451 \h </w:instrText>
+              <w:instrText xml:space="preserve"> PAGEREF _Toc217725669 \h </w:instrText>
             </w:r>
             <w:r>
               <w:rPr>
@@ -3021,7 +2901,7 @@
                 <w:noProof/>
                 <w:webHidden/>
               </w:rPr>
-              <w:t>9</w:t>
+              <w:t>10</w:t>
             </w:r>
             <w:r>
               <w:rPr>
@@ -3048,7 +2928,7 @@
               <w14:ligatures w14:val="standardContextual"/>
             </w:rPr>
           </w:pPr>
-          <w:hyperlink w:anchor="_Toc216967452" w:history="1">
+          <w:hyperlink w:anchor="_Toc217725670" w:history="1">
             <w:r>
               <w:rPr>
                 <w:rStyle w:val="Hyperlink"/>
@@ -3095,7 +2975,7 @@
                 <w:noProof/>
                 <w:webHidden/>
               </w:rPr>
-              <w:instrText xml:space="preserve"> PAGEREF _Toc216967452 \h </w:instrText>
+              <w:instrText xml:space="preserve"> PAGEREF _Toc217725670 \h </w:instrText>
             </w:r>
             <w:r>
               <w:rPr>
@@ -3115,7 +2995,7 @@
                 <w:noProof/>
                 <w:webHidden/>
               </w:rPr>
-              <w:t>10</w:t>
+              <w:t>11</w:t>
             </w:r>
             <w:r>
               <w:rPr>
@@ -3252,7 +3132,7 @@
           <w:rFonts w:cs="Arial"/>
         </w:rPr>
       </w:pPr>
-      <w:bookmarkStart w:id="1" w:name="_Toc216967439"/>
+      <w:bookmarkStart w:id="1" w:name="_Toc217725657"/>
       <w:r>
         <w:rPr>
           <w:rFonts w:cs="Arial"/>
@@ -3271,7 +3151,7 @@
           <w:szCs w:val="28"/>
         </w:rPr>
       </w:pPr>
-      <w:bookmarkStart w:id="2" w:name="_Toc216967440"/>
+      <w:bookmarkStart w:id="2" w:name="_Toc217725658"/>
       <w:r>
         <w:rPr>
           <w:rFonts w:cs="Arial"/>
@@ -3530,7 +3410,7 @@
           <w:szCs w:val="28"/>
         </w:rPr>
       </w:pPr>
-      <w:bookmarkStart w:id="3" w:name="_Toc216967441"/>
+      <w:bookmarkStart w:id="3" w:name="_Toc217725659"/>
       <w:r>
         <w:rPr>
           <w:rFonts w:cs="Arial"/>
@@ -3728,7 +3608,7 @@
           <w:szCs w:val="28"/>
         </w:rPr>
       </w:pPr>
-      <w:bookmarkStart w:id="4" w:name="_Toc216967442"/>
+      <w:bookmarkStart w:id="4" w:name="_Toc217725660"/>
       <w:r>
         <w:rPr>
           <w:rFonts w:cs="Arial"/>
@@ -3769,25 +3649,7 @@
           <w:sz w:val="24"/>
           <w:szCs w:val="24"/>
         </w:rPr>
-        <w:t xml:space="preserve"> Conflict is created as an index should </w:t>
-      </w:r>
-      <w:proofErr w:type="gramStart"/>
-      <w:r>
-        <w:rPr>
-          <w:rFonts w:cs="Arial"/>
-          <w:sz w:val="24"/>
-          <w:szCs w:val="24"/>
-        </w:rPr>
-        <w:t>really only</w:t>
-      </w:r>
-      <w:proofErr w:type="gramEnd"/>
-      <w:r>
-        <w:rPr>
-          <w:rFonts w:cs="Arial"/>
-          <w:sz w:val="24"/>
-          <w:szCs w:val="24"/>
-        </w:rPr>
-        <w:t xml:space="preserve"> hold one value</w:t>
+        <w:t xml:space="preserve"> Conflict is created as an index should really only hold one value</w:t>
       </w:r>
       <w:r>
         <w:rPr>
@@ -3879,7 +3741,7 @@
           <w:szCs w:val="28"/>
         </w:rPr>
       </w:pPr>
-      <w:bookmarkStart w:id="5" w:name="_Toc216967443"/>
+      <w:bookmarkStart w:id="5" w:name="_Toc217725661"/>
       <w:r>
         <w:rPr>
           <w:rFonts w:cs="Arial"/>
@@ -4112,7 +3974,7 @@
           <w:szCs w:val="28"/>
         </w:rPr>
       </w:pPr>
-      <w:bookmarkStart w:id="6" w:name="_Toc216967444"/>
+      <w:bookmarkStart w:id="6" w:name="_Toc217725662"/>
       <w:r>
         <w:rPr>
           <w:rFonts w:cs="Arial"/>
@@ -4387,7 +4249,7 @@
       <w:pPr>
         <w:pStyle w:val="Heading1"/>
       </w:pPr>
-      <w:bookmarkStart w:id="7" w:name="_Toc216967445"/>
+      <w:bookmarkStart w:id="7" w:name="_Toc217725663"/>
       <w:r>
         <w:t>Question 2</w:t>
       </w:r>
@@ -4401,7 +4263,7 @@
           <w:szCs w:val="28"/>
         </w:rPr>
       </w:pPr>
-      <w:bookmarkStart w:id="8" w:name="_Toc216967446"/>
+      <w:bookmarkStart w:id="8" w:name="_Toc217725664"/>
       <w:r>
         <w:rPr>
           <w:sz w:val="28"/>
@@ -4762,7 +4624,7 @@
           <w:szCs w:val="28"/>
         </w:rPr>
       </w:pPr>
-      <w:bookmarkStart w:id="9" w:name="_Toc216967447"/>
+      <w:bookmarkStart w:id="9" w:name="_Toc217725665"/>
       <w:r>
         <w:rPr>
           <w:sz w:val="28"/>
@@ -4777,7 +4639,7 @@
       <w:pPr>
         <w:pStyle w:val="Heading3"/>
       </w:pPr>
-      <w:bookmarkStart w:id="10" w:name="_Toc216967448"/>
+      <w:bookmarkStart w:id="10" w:name="_Toc217725666"/>
       <w:r>
         <w:t>Hash-Based data structures</w:t>
       </w:r>
@@ -5179,7 +5041,7 @@
       <w:pPr>
         <w:pStyle w:val="Heading3"/>
       </w:pPr>
-      <w:bookmarkStart w:id="11" w:name="_Toc216967449"/>
+      <w:bookmarkStart w:id="11" w:name="_Toc217725667"/>
       <w:r>
         <w:lastRenderedPageBreak/>
         <w:t>Tree-Based Structures</w:t>
@@ -5477,23 +5339,7 @@
           <w:sz w:val="24"/>
           <w:szCs w:val="24"/>
         </w:rPr>
-        <w:t xml:space="preserve">range queries and </w:t>
-      </w:r>
-      <w:proofErr w:type="gramStart"/>
-      <w:r>
-        <w:rPr>
-          <w:sz w:val="24"/>
-          <w:szCs w:val="24"/>
-        </w:rPr>
-        <w:t>ordered</w:t>
-      </w:r>
-      <w:proofErr w:type="gramEnd"/>
-      <w:r>
-        <w:rPr>
-          <w:sz w:val="24"/>
-          <w:szCs w:val="24"/>
-        </w:rPr>
-        <w:t xml:space="preserve"> traversals without the need for </w:t>
+        <w:t xml:space="preserve">range queries and ordered traversals without the need for </w:t>
       </w:r>
       <w:r>
         <w:rPr>
@@ -5823,21 +5669,85 @@
         <w:rPr>
           <w:rFonts w:ascii="Arial" w:hAnsi="Arial" w:cs="Arial"/>
         </w:rPr>
+        <w:t xml:space="preserve"> in order to maintain balance.</w:t>
+      </w:r>
+      <w:r>
+        <w:rPr>
+          <w:rFonts w:ascii="Arial" w:hAnsi="Arial" w:cs="Arial"/>
+        </w:rPr>
         <w:t xml:space="preserve"> </w:t>
       </w:r>
-      <w:proofErr w:type="gramStart"/>
-      <w:r>
-        <w:rPr>
-          <w:rFonts w:ascii="Arial" w:hAnsi="Arial" w:cs="Arial"/>
-        </w:rPr>
-        <w:t>in order to</w:t>
-      </w:r>
-      <w:proofErr w:type="gramEnd"/>
-      <w:r>
-        <w:rPr>
-          <w:rFonts w:ascii="Arial" w:hAnsi="Arial" w:cs="Arial"/>
-        </w:rPr>
-        <w:t xml:space="preserve"> maintain balance.</w:t>
+      <w:r>
+        <w:rPr>
+          <w:rFonts w:ascii="Arial" w:hAnsi="Arial" w:cs="Arial"/>
+        </w:rPr>
+        <w:t xml:space="preserve">Tree-based structures also </w:t>
+      </w:r>
+      <w:r>
+        <w:rPr>
+          <w:rFonts w:ascii="Arial" w:hAnsi="Arial" w:cs="Arial"/>
+        </w:rPr>
+        <w:t>heavily rely on pointer traversal. This reduces the cache efficiency and can result in slower performance</w:t>
+      </w:r>
+      <w:r>
+        <w:rPr>
+          <w:rFonts w:ascii="Arial" w:hAnsi="Arial" w:cs="Arial"/>
+        </w:rPr>
+        <w:t xml:space="preserve"> compared to that of a hash-based structure.</w:t>
+      </w:r>
+    </w:p>
+    <w:p>
+      <w:pPr>
+        <w:rPr>
+          <w:rFonts w:ascii="Arial" w:hAnsi="Arial" w:cs="Arial"/>
+        </w:rPr>
+      </w:pPr>
+    </w:p>
+    <w:p>
+      <w:pPr>
+        <w:pStyle w:val="Heading1"/>
+      </w:pPr>
+      <w:bookmarkStart w:id="12" w:name="_Toc217725668"/>
+      <w:r>
+        <w:t>Question 5</w:t>
+      </w:r>
+      <w:r>
+        <w:t xml:space="preserve"> - </w:t>
+      </w:r>
+      <w:r>
+        <w:t>Briefly describe how Question 4 can be updated to support concurrency</w:t>
+      </w:r>
+      <w:bookmarkEnd w:id="12"/>
+    </w:p>
+    <w:p>
+      <w:pPr>
+        <w:rPr>
+          <w:rFonts w:ascii="Arial" w:hAnsi="Arial" w:cs="Arial"/>
+        </w:rPr>
+      </w:pPr>
+      <w:r>
+        <w:rPr>
+          <w:rFonts w:ascii="Arial" w:hAnsi="Arial" w:cs="Arial"/>
+        </w:rPr>
+        <w:t xml:space="preserve">In order to support concurrency </w:t>
+      </w:r>
+      <w:r>
+        <w:rPr>
+          <w:rFonts w:ascii="Arial" w:hAnsi="Arial" w:cs="Arial"/>
+        </w:rPr>
+        <w:t xml:space="preserve">in </w:t>
+      </w:r>
+      <w:r>
+        <w:rPr>
+          <w:rFonts w:ascii="Arial" w:hAnsi="Arial" w:cs="Arial"/>
+        </w:rPr>
+        <w:t xml:space="preserve">Question 4, </w:t>
+      </w:r>
+      <w:r>
+        <w:rPr>
+          <w:rFonts w:ascii="Arial" w:hAnsi="Arial" w:cs="Arial"/>
+        </w:rPr>
+        <w:t>Hash Table as a LRU</w:t>
       </w:r>
       <w:r>
         <w:rPr>
@@ -5849,20 +5759,460 @@
         <w:rPr>
           <w:rFonts w:ascii="Arial" w:hAnsi="Arial" w:cs="Arial"/>
         </w:rPr>
-        <w:t xml:space="preserve">Tree-based structures also </w:t>
-      </w:r>
-      <w:r>
-        <w:rPr>
-          <w:rFonts w:ascii="Arial" w:hAnsi="Arial" w:cs="Arial"/>
-        </w:rPr>
-        <w:t>heavily rely on pointer traversal. This reduces the cache efficiency and can result in slower performance</w:t>
-      </w:r>
-      <w:r>
-        <w:rPr>
-          <w:rFonts w:ascii="Arial" w:hAnsi="Arial" w:cs="Arial"/>
-        </w:rPr>
-        <w:t xml:space="preserve"> compared to that of a hash-based structure.</w:t>
-      </w:r>
+        <w:t>Caching</w:t>
+      </w:r>
+      <w:r>
+        <w:rPr>
+          <w:rFonts w:ascii="Arial" w:hAnsi="Arial" w:cs="Arial"/>
+        </w:rPr>
+        <w:t>,</w:t>
+      </w:r>
+      <w:r>
+        <w:rPr>
+          <w:rFonts w:ascii="Arial" w:hAnsi="Arial" w:cs="Arial"/>
+        </w:rPr>
+        <w:t xml:space="preserve"> the main aim is to make each get() and put() method atomic across both shared structures. This being </w:t>
+      </w:r>
+      <w:r>
+        <w:rPr>
+          <w:rFonts w:ascii="Arial" w:hAnsi="Arial" w:cs="Arial"/>
+        </w:rPr>
+        <w:t>the map</w:t>
+      </w:r>
+      <w:r>
+        <w:rPr>
+          <w:rFonts w:ascii="Arial" w:hAnsi="Arial" w:cs="Arial"/>
+        </w:rPr>
+        <w:t xml:space="preserve"> or cache and the </w:t>
+      </w:r>
+      <w:r>
+        <w:rPr>
+          <w:rFonts w:ascii="Arial" w:hAnsi="Arial" w:cs="Arial"/>
+        </w:rPr>
+        <w:t>doubly linked</w:t>
+      </w:r>
+      <w:r>
+        <w:rPr>
+          <w:rFonts w:ascii="Arial" w:hAnsi="Arial" w:cs="Arial"/>
+        </w:rPr>
+        <w:t xml:space="preserve"> list.</w:t>
+      </w:r>
+      <w:r>
+        <w:rPr>
+          <w:rFonts w:ascii="Arial" w:hAnsi="Arial" w:cs="Arial"/>
+        </w:rPr>
+        <w:t xml:space="preserve"> As it is now, there are multiple threads which could interleave. This can cause race conditions and also corrupt the map state. </w:t>
+      </w:r>
+      <w:r>
+        <w:rPr>
+          <w:rFonts w:ascii="Arial" w:hAnsi="Arial" w:cs="Arial"/>
+        </w:rPr>
+        <w:fldChar w:fldCharType="begin"/>
+      </w:r>
+      <w:r>
+        <w:rPr>
+          <w:rFonts w:ascii="Arial" w:hAnsi="Arial" w:cs="Arial"/>
+        </w:rPr>
+        <w:instrText xml:space="preserve"> ADDIN ZOTERO_ITEM CSL_CITATION {"citationID":"SCytCSxZ","properties":{"formattedCitation":"({\\i{}Synchronization in Java}, 2025)","plainCitation":"(Synchronization in Java, 2025)","noteIndex":0},"citationItems":[{"id":768,"uris":["http://zotero.org/users/15491865/items/XSN3CHFN"],"itemData":{"id":768,"type":"webpage","abstract":"Your All-in-One Learning Portal: GeeksforGeeks is a comprehensive educational platform that empowers learners across domains-spanning computer science and programming, school education, upskilling, commerce, software tools, competitive exams, and more.","container-title":"GeeksforGeeks","language":"en","note":"section: Java","title":"Synchronization in Java","URL":"https://www.geeksforgeeks.org/java/synchronization-in-java/","accessed":{"date-parts":[["2025",12,27]]},"issued":{"date-parts":[["2025",10,30]]}}}],"schema":"https://github.com/citation-style-language/schema/raw/master/csl-citation.json"} </w:instrText>
+      </w:r>
+      <w:r>
+        <w:rPr>
+          <w:rFonts w:ascii="Arial" w:hAnsi="Arial" w:cs="Arial"/>
+        </w:rPr>
+        <w:fldChar w:fldCharType="separate"/>
+      </w:r>
+      <w:r>
+        <w:rPr>
+          <w:rFonts w:ascii="Arial" w:hAnsi="Arial" w:cs="Arial"/>
+        </w:rPr>
+        <w:t>(</w:t>
+      </w:r>
+      <w:r>
+        <w:rPr>
+          <w:rFonts w:ascii="Arial" w:hAnsi="Arial" w:cs="Arial"/>
+          <w:i/>
+          <w:iCs/>
+        </w:rPr>
+        <w:t>Synchronization in Java</w:t>
+      </w:r>
+      <w:r>
+        <w:rPr>
+          <w:rFonts w:ascii="Arial" w:hAnsi="Arial" w:cs="Arial"/>
+        </w:rPr>
+        <w:t>, 2025)</w:t>
+      </w:r>
+      <w:r>
+        <w:rPr>
+          <w:rFonts w:ascii="Arial" w:hAnsi="Arial" w:cs="Arial"/>
+        </w:rPr>
+        <w:fldChar w:fldCharType="end"/>
+      </w:r>
+      <w:r>
+        <w:rPr>
+          <w:rFonts w:ascii="Arial" w:hAnsi="Arial" w:cs="Arial"/>
+        </w:rPr>
+        <w:t xml:space="preserve">. </w:t>
+      </w:r>
+      <w:r>
+        <w:rPr>
+          <w:rFonts w:ascii="Arial" w:hAnsi="Arial" w:cs="Arial"/>
+        </w:rPr>
+        <w:t xml:space="preserve"> As simple update to the code would be to add a single lock. </w:t>
+      </w:r>
+      <w:r>
+        <w:rPr>
+          <w:rFonts w:ascii="Arial" w:hAnsi="Arial" w:cs="Arial"/>
+        </w:rPr>
+        <w:t>This</w:t>
+      </w:r>
+      <w:r>
+        <w:rPr>
+          <w:rFonts w:ascii="Arial" w:hAnsi="Arial" w:cs="Arial"/>
+        </w:rPr>
+        <w:t xml:space="preserve"> lock would go around the critical get() and put()</w:t>
+      </w:r>
+      <w:r>
+        <w:rPr>
+          <w:rFonts w:ascii="Arial" w:hAnsi="Arial" w:cs="Arial"/>
+        </w:rPr>
+        <w:t xml:space="preserve"> methods using either </w:t>
+      </w:r>
+      <w:r>
+        <w:rPr>
+          <w:rFonts w:ascii="Arial" w:hAnsi="Arial" w:cs="Arial"/>
+        </w:rPr>
+        <w:t>synchronized</w:t>
+      </w:r>
+      <w:r>
+        <w:rPr>
+          <w:rFonts w:ascii="Arial" w:hAnsi="Arial" w:cs="Arial"/>
+        </w:rPr>
+        <w:t xml:space="preserve"> methods or blocks or an explici</w:t>
+      </w:r>
+      <w:r>
+        <w:rPr>
+          <w:rFonts w:ascii="Arial" w:hAnsi="Arial" w:cs="Arial"/>
+        </w:rPr>
+        <w:t>t lock. The explicit lock could be something along the lines of ReentrantLock which has more flexible features</w:t>
+      </w:r>
+      <w:r>
+        <w:rPr>
+          <w:rFonts w:ascii="Arial" w:hAnsi="Arial" w:cs="Arial"/>
+        </w:rPr>
+        <w:t xml:space="preserve"> like a time/try-lock. </w:t>
+      </w:r>
+      <w:r>
+        <w:rPr>
+          <w:rFonts w:ascii="Arial" w:hAnsi="Arial" w:cs="Arial"/>
+        </w:rPr>
+        <w:fldChar w:fldCharType="begin"/>
+      </w:r>
+      <w:r>
+        <w:rPr>
+          <w:rFonts w:ascii="Arial" w:hAnsi="Arial" w:cs="Arial"/>
+        </w:rPr>
+        <w:instrText xml:space="preserve"> ADDIN ZOTERO_ITEM CSL_CITATION {"citationID":"HzBGS7mS","properties":{"formattedCitation":"({\\i{}ReentrantLock in Java}, 2025)","plainCitation":"(ReentrantLock in Java, 2025)","noteIndex":0},"citationItems":[{"id":770,"uris":["http://zotero.org/users/15491865/items/W423IFUD"],"itemData":{"id":770,"type":"webpage","abstract":"Your All-in-One Learning Portal: GeeksforGeeks is a comprehensive educational platform that empowers learners across domains-spanning computer science and programming, school education, upskilling, commerce, software tools, competitive exams, and more.","container-title":"GeeksforGeeks","language":"en","note":"section: Java","title":"ReentrantLock in Java","URL":"https://www.geeksforgeeks.org/java/reentrant-lock-in-java/","accessed":{"date-parts":[["2025",12,27]]},"issued":{"date-parts":[["2025",10,3]]}}}],"schema":"https://github.com/citation-style-language/schema/raw/master/csl-citation.json"} </w:instrText>
+      </w:r>
+      <w:r>
+        <w:rPr>
+          <w:rFonts w:ascii="Arial" w:hAnsi="Arial" w:cs="Arial"/>
+        </w:rPr>
+        <w:fldChar w:fldCharType="separate"/>
+      </w:r>
+      <w:r>
+        <w:rPr>
+          <w:rFonts w:ascii="Arial" w:hAnsi="Arial" w:cs="Arial"/>
+        </w:rPr>
+        <w:t>(</w:t>
+      </w:r>
+      <w:r>
+        <w:rPr>
+          <w:rFonts w:ascii="Arial" w:hAnsi="Arial" w:cs="Arial"/>
+          <w:i/>
+          <w:iCs/>
+        </w:rPr>
+        <w:t>ReentrantLock in Java</w:t>
+      </w:r>
+      <w:r>
+        <w:rPr>
+          <w:rFonts w:ascii="Arial" w:hAnsi="Arial" w:cs="Arial"/>
+        </w:rPr>
+        <w:t>, 2025)</w:t>
+      </w:r>
+      <w:r>
+        <w:rPr>
+          <w:rFonts w:ascii="Arial" w:hAnsi="Arial" w:cs="Arial"/>
+        </w:rPr>
+        <w:fldChar w:fldCharType="end"/>
+      </w:r>
+      <w:r>
+        <w:rPr>
+          <w:rFonts w:ascii="Arial" w:hAnsi="Arial" w:cs="Arial"/>
+        </w:rPr>
+        <w:t xml:space="preserve">. </w:t>
+      </w:r>
+      <w:r>
+        <w:rPr>
+          <w:rFonts w:ascii="Arial" w:hAnsi="Arial" w:cs="Arial"/>
+        </w:rPr>
+        <w:t xml:space="preserve">To have better </w:t>
+      </w:r>
+      <w:r>
+        <w:rPr>
+          <w:rFonts w:ascii="Arial" w:hAnsi="Arial" w:cs="Arial"/>
+        </w:rPr>
+        <w:t>scalability</w:t>
+      </w:r>
+      <w:r>
+        <w:rPr>
+          <w:rFonts w:ascii="Arial" w:hAnsi="Arial" w:cs="Arial"/>
+        </w:rPr>
+        <w:t xml:space="preserve"> the HashMap could be replaced with a ConcurrentHashMap</w:t>
+      </w:r>
+      <w:r>
+        <w:rPr>
+          <w:rFonts w:ascii="Arial" w:hAnsi="Arial" w:cs="Arial"/>
+        </w:rPr>
+        <w:t xml:space="preserve">. This would mean map access is thread-safe under contention. </w:t>
+      </w:r>
+      <w:r>
+        <w:rPr>
+          <w:rFonts w:ascii="Arial" w:hAnsi="Arial" w:cs="Arial"/>
+        </w:rPr>
+        <w:t xml:space="preserve">You would still however </w:t>
+      </w:r>
+      <w:r>
+        <w:rPr>
+          <w:rFonts w:ascii="Arial" w:hAnsi="Arial" w:cs="Arial"/>
+        </w:rPr>
+        <w:t>have</w:t>
+      </w:r>
+      <w:r>
+        <w:rPr>
+          <w:rFonts w:ascii="Arial" w:hAnsi="Arial" w:cs="Arial"/>
+        </w:rPr>
+        <w:t xml:space="preserve"> to lock the </w:t>
+      </w:r>
+      <w:r>
+        <w:rPr>
+          <w:rFonts w:ascii="Arial" w:hAnsi="Arial" w:cs="Arial"/>
+        </w:rPr>
+        <w:t>list</w:t>
+      </w:r>
+      <w:r>
+        <w:rPr>
+          <w:rFonts w:ascii="Arial" w:hAnsi="Arial" w:cs="Arial"/>
+        </w:rPr>
+        <w:t xml:space="preserve"> updates because “move-to-front” </w:t>
+      </w:r>
+      <w:r>
+        <w:rPr>
+          <w:rFonts w:ascii="Arial" w:hAnsi="Arial" w:cs="Arial"/>
+        </w:rPr>
+        <w:t xml:space="preserve">requires a pointer change which must not interleave. </w:t>
+      </w:r>
+      <w:r>
+        <w:rPr>
+          <w:rFonts w:ascii="Arial" w:hAnsi="Arial" w:cs="Arial"/>
+        </w:rPr>
+        <w:t xml:space="preserve">A </w:t>
+      </w:r>
+      <w:r>
+        <w:rPr>
+          <w:rFonts w:ascii="Arial" w:hAnsi="Arial" w:cs="Arial"/>
+        </w:rPr>
+        <w:lastRenderedPageBreak/>
+        <w:t>more common pattern is a ConcurrentHashMap with one lock for the list</w:t>
+      </w:r>
+      <w:r>
+        <w:rPr>
+          <w:rFonts w:ascii="Arial" w:hAnsi="Arial" w:cs="Arial"/>
+        </w:rPr>
+        <w:t xml:space="preserve">. </w:t>
+      </w:r>
+      <w:r>
+        <w:rPr>
+          <w:rFonts w:ascii="Arial" w:hAnsi="Arial" w:cs="Arial"/>
+        </w:rPr>
+        <w:fldChar w:fldCharType="begin"/>
+      </w:r>
+      <w:r>
+        <w:rPr>
+          <w:rFonts w:ascii="Arial" w:hAnsi="Arial" w:cs="Arial"/>
+        </w:rPr>
+        <w:instrText xml:space="preserve"> ADDIN ZOTERO_ITEM CSL_CITATION {"citationID":"q4g5VaE9","properties":{"formattedCitation":"({\\i{}ConcurrentHashMap in Java}, 2025)","plainCitation":"(ConcurrentHashMap in Java, 2025)","noteIndex":0},"citationItems":[{"id":772,"uris":["http://zotero.org/users/15491865/items/G38S92YK"],"itemData":{"id":772,"type":"webpage","abstract":"Your All-in-One Learning Portal: GeeksforGeeks is a comprehensive educational platform that empowers learners across domains-spanning computer science and programming, school education, upskilling, commerce, software tools, competitive exams, and more.","container-title":"GeeksforGeeks","language":"en","note":"section: Java","title":"ConcurrentHashMap in Java","URL":"https://www.geeksforgeeks.org/java/concurrenthashmap-in-java/","accessed":{"date-parts":[["2025",12,27]]},"issued":{"date-parts":[["2025",10,15]]}}}],"schema":"https://github.com/citation-style-language/schema/raw/master/csl-citation.json"} </w:instrText>
+      </w:r>
+      <w:r>
+        <w:rPr>
+          <w:rFonts w:ascii="Arial" w:hAnsi="Arial" w:cs="Arial"/>
+        </w:rPr>
+        <w:fldChar w:fldCharType="separate"/>
+      </w:r>
+      <w:r>
+        <w:rPr>
+          <w:rFonts w:ascii="Arial" w:hAnsi="Arial" w:cs="Arial"/>
+        </w:rPr>
+        <w:t>(</w:t>
+      </w:r>
+      <w:r>
+        <w:rPr>
+          <w:rFonts w:ascii="Arial" w:hAnsi="Arial" w:cs="Arial"/>
+          <w:i/>
+          <w:iCs/>
+        </w:rPr>
+        <w:t>ConcurrentHashMap in Java</w:t>
+      </w:r>
+      <w:r>
+        <w:rPr>
+          <w:rFonts w:ascii="Arial" w:hAnsi="Arial" w:cs="Arial"/>
+        </w:rPr>
+        <w:t>, 2025)</w:t>
+      </w:r>
+      <w:r>
+        <w:rPr>
+          <w:rFonts w:ascii="Arial" w:hAnsi="Arial" w:cs="Arial"/>
+        </w:rPr>
+        <w:fldChar w:fldCharType="end"/>
+      </w:r>
+      <w:r>
+        <w:rPr>
+          <w:rFonts w:ascii="Arial" w:hAnsi="Arial" w:cs="Arial"/>
+        </w:rPr>
+        <w:t>.</w:t>
+      </w:r>
+    </w:p>
+    <w:p>
+      <w:pPr>
+        <w:rPr>
+          <w:rFonts w:ascii="Arial" w:hAnsi="Arial" w:cs="Arial"/>
+        </w:rPr>
+      </w:pPr>
+    </w:p>
+    <w:p>
+      <w:pPr>
+        <w:rPr>
+          <w:rFonts w:ascii="Arial" w:hAnsi="Arial" w:cs="Arial"/>
+        </w:rPr>
+      </w:pPr>
+    </w:p>
+    <w:p>
+      <w:pPr>
+        <w:rPr>
+          <w:rFonts w:ascii="Arial" w:hAnsi="Arial" w:cs="Arial"/>
+        </w:rPr>
+      </w:pPr>
+    </w:p>
+    <w:p>
+      <w:pPr>
+        <w:rPr>
+          <w:rFonts w:ascii="Arial" w:hAnsi="Arial" w:cs="Arial"/>
+        </w:rPr>
+      </w:pPr>
+    </w:p>
+    <w:p>
+      <w:pPr>
+        <w:rPr>
+          <w:rFonts w:ascii="Arial" w:hAnsi="Arial" w:cs="Arial"/>
+        </w:rPr>
+      </w:pPr>
+    </w:p>
+    <w:p>
+      <w:pPr>
+        <w:rPr>
+          <w:rFonts w:ascii="Arial" w:hAnsi="Arial" w:cs="Arial"/>
+        </w:rPr>
+      </w:pPr>
+    </w:p>
+    <w:p>
+      <w:pPr>
+        <w:rPr>
+          <w:rFonts w:ascii="Arial" w:hAnsi="Arial" w:cs="Arial"/>
+        </w:rPr>
+      </w:pPr>
+    </w:p>
+    <w:p>
+      <w:pPr>
+        <w:rPr>
+          <w:rFonts w:ascii="Arial" w:hAnsi="Arial" w:cs="Arial"/>
+        </w:rPr>
+      </w:pPr>
+    </w:p>
+    <w:p>
+      <w:pPr>
+        <w:rPr>
+          <w:rFonts w:ascii="Arial" w:hAnsi="Arial" w:cs="Arial"/>
+        </w:rPr>
+      </w:pPr>
+    </w:p>
+    <w:p>
+      <w:pPr>
+        <w:rPr>
+          <w:rFonts w:ascii="Arial" w:hAnsi="Arial" w:cs="Arial"/>
+        </w:rPr>
+      </w:pPr>
+    </w:p>
+    <w:p>
+      <w:pPr>
+        <w:rPr>
+          <w:rFonts w:ascii="Arial" w:hAnsi="Arial" w:cs="Arial"/>
+        </w:rPr>
+      </w:pPr>
+    </w:p>
+    <w:p>
+      <w:pPr>
+        <w:rPr>
+          <w:rFonts w:ascii="Arial" w:hAnsi="Arial" w:cs="Arial"/>
+        </w:rPr>
+      </w:pPr>
+    </w:p>
+    <w:p>
+      <w:pPr>
+        <w:rPr>
+          <w:rFonts w:ascii="Arial" w:hAnsi="Arial" w:cs="Arial"/>
+        </w:rPr>
+      </w:pPr>
+    </w:p>
+    <w:p>
+      <w:pPr>
+        <w:rPr>
+          <w:rFonts w:ascii="Arial" w:hAnsi="Arial" w:cs="Arial"/>
+        </w:rPr>
+      </w:pPr>
+    </w:p>
+    <w:p>
+      <w:pPr>
+        <w:rPr>
+          <w:rFonts w:ascii="Arial" w:hAnsi="Arial" w:cs="Arial"/>
+        </w:rPr>
+      </w:pPr>
+    </w:p>
+    <w:p>
+      <w:pPr>
+        <w:rPr>
+          <w:rFonts w:ascii="Arial" w:hAnsi="Arial" w:cs="Arial"/>
+        </w:rPr>
+      </w:pPr>
+    </w:p>
+    <w:p>
+      <w:pPr>
+        <w:rPr>
+          <w:rFonts w:ascii="Arial" w:hAnsi="Arial" w:cs="Arial"/>
+        </w:rPr>
+      </w:pPr>
+    </w:p>
+    <w:p>
+      <w:pPr>
+        <w:rPr>
+          <w:rFonts w:ascii="Arial" w:hAnsi="Arial" w:cs="Arial"/>
+        </w:rPr>
+      </w:pPr>
+    </w:p>
+    <w:p>
+      <w:pPr>
+        <w:rPr>
+          <w:rFonts w:ascii="Arial" w:hAnsi="Arial" w:cs="Arial"/>
+        </w:rPr>
+      </w:pPr>
     </w:p>
     <w:p>
       <w:pPr>
@@ -5874,166 +6224,22 @@
     <w:p>
       <w:pPr>
         <w:pStyle w:val="Heading1"/>
-      </w:pPr>
-      <w:bookmarkStart w:id="12" w:name="_Toc216967450"/>
-      <w:r>
-        <w:t>Question 5</w:t>
-      </w:r>
-      <w:bookmarkEnd w:id="12"/>
-    </w:p>
-    <w:p>
-      <w:pPr>
-        <w:rPr>
-          <w:rFonts w:ascii="Arial" w:hAnsi="Arial" w:cs="Arial"/>
-        </w:rPr>
-      </w:pPr>
-    </w:p>
-    <w:p>
-      <w:pPr>
-        <w:rPr>
-          <w:rFonts w:ascii="Arial" w:hAnsi="Arial" w:cs="Arial"/>
-        </w:rPr>
-      </w:pPr>
-    </w:p>
-    <w:p>
-      <w:pPr>
-        <w:rPr>
-          <w:rFonts w:ascii="Arial" w:hAnsi="Arial" w:cs="Arial"/>
-        </w:rPr>
-      </w:pPr>
-    </w:p>
-    <w:p>
-      <w:pPr>
-        <w:rPr>
-          <w:rFonts w:ascii="Arial" w:hAnsi="Arial" w:cs="Arial"/>
-        </w:rPr>
-      </w:pPr>
-    </w:p>
-    <w:p>
-      <w:pPr>
-        <w:rPr>
-          <w:rFonts w:ascii="Arial" w:hAnsi="Arial" w:cs="Arial"/>
-        </w:rPr>
-      </w:pPr>
-    </w:p>
-    <w:p>
-      <w:pPr>
-        <w:rPr>
-          <w:rFonts w:ascii="Arial" w:hAnsi="Arial" w:cs="Arial"/>
-        </w:rPr>
-      </w:pPr>
-    </w:p>
-    <w:p>
-      <w:pPr>
-        <w:rPr>
-          <w:rFonts w:ascii="Arial" w:hAnsi="Arial" w:cs="Arial"/>
-        </w:rPr>
-      </w:pPr>
-    </w:p>
-    <w:p>
-      <w:pPr>
-        <w:rPr>
-          <w:rFonts w:ascii="Arial" w:hAnsi="Arial" w:cs="Arial"/>
-        </w:rPr>
-      </w:pPr>
-    </w:p>
-    <w:p>
-      <w:pPr>
-        <w:rPr>
-          <w:rFonts w:ascii="Arial" w:hAnsi="Arial" w:cs="Arial"/>
-        </w:rPr>
-      </w:pPr>
-    </w:p>
-    <w:p>
-      <w:pPr>
-        <w:rPr>
-          <w:rFonts w:ascii="Arial" w:hAnsi="Arial" w:cs="Arial"/>
-        </w:rPr>
-      </w:pPr>
-    </w:p>
-    <w:p>
-      <w:pPr>
-        <w:rPr>
-          <w:rFonts w:ascii="Arial" w:hAnsi="Arial" w:cs="Arial"/>
-        </w:rPr>
-      </w:pPr>
-    </w:p>
-    <w:p>
-      <w:pPr>
-        <w:rPr>
-          <w:rFonts w:ascii="Arial" w:hAnsi="Arial" w:cs="Arial"/>
-        </w:rPr>
-      </w:pPr>
-    </w:p>
-    <w:p>
-      <w:pPr>
-        <w:rPr>
-          <w:rFonts w:ascii="Arial" w:hAnsi="Arial" w:cs="Arial"/>
-        </w:rPr>
-      </w:pPr>
-    </w:p>
-    <w:p>
-      <w:pPr>
-        <w:rPr>
-          <w:rFonts w:ascii="Arial" w:hAnsi="Arial" w:cs="Arial"/>
-        </w:rPr>
-      </w:pPr>
-    </w:p>
-    <w:p>
-      <w:pPr>
-        <w:rPr>
-          <w:rFonts w:ascii="Arial" w:hAnsi="Arial" w:cs="Arial"/>
-        </w:rPr>
-      </w:pPr>
-    </w:p>
-    <w:p>
-      <w:pPr>
-        <w:rPr>
-          <w:rFonts w:ascii="Arial" w:hAnsi="Arial" w:cs="Arial"/>
-        </w:rPr>
-      </w:pPr>
-    </w:p>
-    <w:p>
-      <w:pPr>
-        <w:rPr>
-          <w:rFonts w:ascii="Arial" w:hAnsi="Arial" w:cs="Arial"/>
-        </w:rPr>
-      </w:pPr>
-    </w:p>
-    <w:p>
-      <w:pPr>
-        <w:rPr>
-          <w:rFonts w:ascii="Arial" w:hAnsi="Arial" w:cs="Arial"/>
-        </w:rPr>
-      </w:pPr>
-    </w:p>
-    <w:p>
-      <w:pPr>
-        <w:rPr>
-          <w:rFonts w:ascii="Arial" w:hAnsi="Arial" w:cs="Arial"/>
-        </w:rPr>
-      </w:pPr>
-    </w:p>
-    <w:p>
-      <w:pPr>
-        <w:rPr>
-          <w:rFonts w:ascii="Arial" w:hAnsi="Arial" w:cs="Arial"/>
-        </w:rPr>
-      </w:pPr>
-    </w:p>
-    <w:p>
-      <w:pPr>
-        <w:rPr>
-          <w:rFonts w:ascii="Arial" w:hAnsi="Arial" w:cs="Arial"/>
-        </w:rPr>
-      </w:pPr>
-    </w:p>
+        <w:numPr>
+          <w:ilvl w:val="0"/>
+          <w:numId w:val="0"/>
+        </w:numPr>
+        <w:ind w:left="432"/>
+      </w:pPr>
+    </w:p>
+    <w:p/>
+    <w:p/>
     <w:p>
       <w:pPr>
         <w:pStyle w:val="Heading1"/>
       </w:pPr>
-      <w:bookmarkStart w:id="13" w:name="_Toc216967451"/>
-      <w:r>
+      <w:bookmarkStart w:id="13" w:name="_Toc217725669"/>
+      <w:r>
+        <w:lastRenderedPageBreak/>
         <w:t>References</w:t>
       </w:r>
       <w:bookmarkEnd w:id="13"/>
@@ -6068,7 +6274,6 @@
         </w:rPr>
         <w:t xml:space="preserve"> (2025) </w:t>
       </w:r>
-      <w:proofErr w:type="spellStart"/>
       <w:r>
         <w:rPr>
           <w:rFonts w:ascii="Aptos" w:hAnsi="Aptos"/>
@@ -6077,7 +6282,6 @@
         </w:rPr>
         <w:t>GeeksforGeeks</w:t>
       </w:r>
-      <w:proofErr w:type="spellEnd"/>
       <w:r>
         <w:rPr>
           <w:rFonts w:ascii="Aptos" w:hAnsi="Aptos"/>
@@ -6106,7 +6310,6 @@
         </w:rPr>
         <w:t xml:space="preserve"> (2025) </w:t>
       </w:r>
-      <w:proofErr w:type="spellStart"/>
       <w:r>
         <w:rPr>
           <w:rFonts w:ascii="Aptos" w:hAnsi="Aptos"/>
@@ -6115,7 +6318,6 @@
         </w:rPr>
         <w:t>GeeksforGeeks</w:t>
       </w:r>
-      <w:proofErr w:type="spellEnd"/>
       <w:r>
         <w:rPr>
           <w:rFonts w:ascii="Aptos" w:hAnsi="Aptos"/>
@@ -6172,27 +6374,13 @@
           <w:i/>
           <w:iCs/>
         </w:rPr>
-        <w:t>DSA AVL Trees</w:t>
+        <w:t>ConcurrentHashMap in Java</w:t>
       </w:r>
       <w:r>
         <w:rPr>
           <w:rFonts w:ascii="Aptos" w:hAnsi="Aptos"/>
         </w:rPr>
-        <w:t xml:space="preserve"> (no date). Available at: https://www.w3schools.com/dsa/dsa_data_avltrees.php?utm_source=copilot.com (Accessed: December 18, 2025).</w:t>
-      </w:r>
-    </w:p>
-    <w:p>
-      <w:pPr>
-        <w:pStyle w:val="Bibliography"/>
-        <w:rPr>
-          <w:rFonts w:ascii="Aptos" w:hAnsi="Aptos"/>
-        </w:rPr>
-      </w:pPr>
-      <w:r>
-        <w:rPr>
-          <w:rFonts w:ascii="Aptos" w:hAnsi="Aptos"/>
-        </w:rPr>
-        <w:t xml:space="preserve">“Hash Collisions Explained” (no date) </w:t>
+        <w:t xml:space="preserve"> (2025) </w:t>
       </w:r>
       <w:r>
         <w:rPr>
@@ -6200,13 +6388,13 @@
           <w:i/>
           <w:iCs/>
         </w:rPr>
-        <w:t>Freeman Law</w:t>
+        <w:t>GeeksforGeeks</w:t>
       </w:r>
       <w:r>
         <w:rPr>
           <w:rFonts w:ascii="Aptos" w:hAnsi="Aptos"/>
         </w:rPr>
-        <w:t>. Available at: https://freemanlaw.com/hash-collisions-explained/ (Accessed: November 27, 2025).</w:t>
+        <w:t>. Available at: https://www.geeksforgeeks.org/java/concurrenthashmap-in-java/ (Accessed: December 27, 2025).</w:t>
       </w:r>
     </w:p>
     <w:p>
@@ -6222,23 +6410,41 @@
           <w:i/>
           <w:iCs/>
         </w:rPr>
-        <w:t xml:space="preserve">Hash Functions and Types of Hash functions - </w:t>
-      </w:r>
-      <w:proofErr w:type="spellStart"/>
+        <w:t>DSA AVL Trees</w:t>
+      </w:r>
+      <w:r>
+        <w:rPr>
+          <w:rFonts w:ascii="Aptos" w:hAnsi="Aptos"/>
+        </w:rPr>
+        <w:t xml:space="preserve"> (no date). Available at: https://www.w3schools.com/dsa/dsa_data_avltrees.php?utm_source=copilot.com (Accessed: December 18, 2025).</w:t>
+      </w:r>
+    </w:p>
+    <w:p>
+      <w:pPr>
+        <w:pStyle w:val="Bibliography"/>
+        <w:rPr>
+          <w:rFonts w:ascii="Aptos" w:hAnsi="Aptos"/>
+        </w:rPr>
+      </w:pPr>
+      <w:r>
+        <w:rPr>
+          <w:rFonts w:ascii="Aptos" w:hAnsi="Aptos"/>
+        </w:rPr>
+        <w:t xml:space="preserve">“Hash Collisions Explained” (no date) </w:t>
+      </w:r>
       <w:r>
         <w:rPr>
           <w:rFonts w:ascii="Aptos" w:hAnsi="Aptos"/>
           <w:i/>
           <w:iCs/>
         </w:rPr>
-        <w:t>GeeksforGeeks</w:t>
-      </w:r>
-      <w:proofErr w:type="spellEnd"/>
+        <w:t>Freeman Law</w:t>
+      </w:r>
       <w:r>
         <w:rPr>
           <w:rFonts w:ascii="Aptos" w:hAnsi="Aptos"/>
         </w:rPr>
-        <w:t xml:space="preserve"> (2025). Available at: https://www.geeksforgeeks.org/dsa/hash-functions-and-list-types-of-hash-functions/ (Accessed: November 26, 2025).</w:t>
+        <w:t>. Available at: https://freemanlaw.com/hash-collisions-explained/ (Accessed: November 27, 2025).</w:t>
       </w:r>
     </w:p>
     <w:p>
@@ -6254,82 +6460,100 @@
           <w:i/>
           <w:iCs/>
         </w:rPr>
-        <w:t>Hash Table Data Structure</w:t>
+        <w:t>Hash Functions and Types of Hash functions - GeeksforGeeks</w:t>
       </w:r>
       <w:r>
         <w:rPr>
           <w:rFonts w:ascii="Aptos" w:hAnsi="Aptos"/>
         </w:rPr>
-        <w:t xml:space="preserve"> (2025) </w:t>
-      </w:r>
-      <w:proofErr w:type="spellStart"/>
+        <w:t xml:space="preserve"> (2025). Available at: https://www.geeksforgeeks.org/dsa/hash-functions-and-list-types-of-hash-functions/ (Accessed: November 26, 2025).</w:t>
+      </w:r>
+    </w:p>
+    <w:p>
+      <w:pPr>
+        <w:pStyle w:val="Bibliography"/>
+        <w:rPr>
+          <w:rFonts w:ascii="Aptos" w:hAnsi="Aptos"/>
+        </w:rPr>
+      </w:pPr>
       <w:r>
         <w:rPr>
           <w:rFonts w:ascii="Aptos" w:hAnsi="Aptos"/>
           <w:i/>
           <w:iCs/>
         </w:rPr>
-        <w:t>GeeksforGeeks</w:t>
-      </w:r>
-      <w:proofErr w:type="spellEnd"/>
+        <w:t>Hash Table Data Structure</w:t>
+      </w:r>
       <w:r>
         <w:rPr>
           <w:rFonts w:ascii="Aptos" w:hAnsi="Aptos"/>
         </w:rPr>
-        <w:t>. Available at: https://www.geeksforgeeks.org/dsa/hash-table-data-structure/ (Accessed: November 27, 2025).</w:t>
-      </w:r>
-    </w:p>
-    <w:p>
-      <w:pPr>
-        <w:pStyle w:val="Bibliography"/>
-        <w:rPr>
-          <w:rFonts w:ascii="Aptos" w:hAnsi="Aptos"/>
-        </w:rPr>
-      </w:pPr>
+        <w:t xml:space="preserve"> (2025) </w:t>
+      </w:r>
       <w:r>
         <w:rPr>
           <w:rFonts w:ascii="Aptos" w:hAnsi="Aptos"/>
           <w:i/>
           <w:iCs/>
         </w:rPr>
-        <w:t>Load factor in hash table</w:t>
+        <w:t>GeeksforGeeks</w:t>
       </w:r>
       <w:r>
         <w:rPr>
           <w:rFonts w:ascii="Aptos" w:hAnsi="Aptos"/>
         </w:rPr>
-        <w:t xml:space="preserve"> (no date) </w:t>
-      </w:r>
-      <w:proofErr w:type="spellStart"/>
+        <w:t>. Available at: https://www.geeksforgeeks.org/dsa/hash-table-data-structure/ (Accessed: November 27, 2025).</w:t>
+      </w:r>
+    </w:p>
+    <w:p>
+      <w:pPr>
+        <w:pStyle w:val="Bibliography"/>
+        <w:rPr>
+          <w:rFonts w:ascii="Aptos" w:hAnsi="Aptos"/>
+        </w:rPr>
+      </w:pPr>
       <w:r>
         <w:rPr>
           <w:rFonts w:ascii="Aptos" w:hAnsi="Aptos"/>
           <w:i/>
           <w:iCs/>
         </w:rPr>
-        <w:t>Hyperskill</w:t>
-      </w:r>
-      <w:proofErr w:type="spellEnd"/>
+        <w:t>Load factor in hash table</w:t>
+      </w:r>
       <w:r>
         <w:rPr>
           <w:rFonts w:ascii="Aptos" w:hAnsi="Aptos"/>
         </w:rPr>
-        <w:t>. Available at: https://hyperskill.org/learn/step/40135 (Accessed: November 27, 2025).</w:t>
-      </w:r>
-    </w:p>
-    <w:p>
-      <w:pPr>
-        <w:pStyle w:val="Bibliography"/>
-        <w:rPr>
-          <w:rFonts w:ascii="Aptos" w:hAnsi="Aptos"/>
-        </w:rPr>
-      </w:pPr>
+        <w:t xml:space="preserve"> (no date) </w:t>
+      </w:r>
       <w:r>
         <w:rPr>
           <w:rFonts w:ascii="Aptos" w:hAnsi="Aptos"/>
           <w:i/>
           <w:iCs/>
         </w:rPr>
+        <w:t>Hyperskill</w:t>
+      </w:r>
+      <w:r>
+        <w:rPr>
+          <w:rFonts w:ascii="Aptos" w:hAnsi="Aptos"/>
+        </w:rPr>
+        <w:t>. Available at: https://hyperskill.org/learn/step/40135 (Accessed: November 27, 2025).</w:t>
+      </w:r>
+    </w:p>
+    <w:p>
+      <w:pPr>
+        <w:pStyle w:val="Bibliography"/>
+        <w:rPr>
+          <w:rFonts w:ascii="Aptos" w:hAnsi="Aptos"/>
+        </w:rPr>
+      </w:pPr>
+      <w:r>
+        <w:rPr>
+          <w:rFonts w:ascii="Aptos" w:hAnsi="Aptos"/>
+          <w:i/>
+          <w:iCs/>
+        </w:rPr>
         <w:t>Open addressing | Study Glance</w:t>
       </w:r>
       <w:r>
@@ -6337,6 +6561,78 @@
           <w:rFonts w:ascii="Aptos" w:hAnsi="Aptos"/>
         </w:rPr>
         <w:t xml:space="preserve"> (no date). Available at: http://studyglance.in/php/ (Accessed: November 27, 2025).</w:t>
+      </w:r>
+    </w:p>
+    <w:p>
+      <w:pPr>
+        <w:pStyle w:val="Bibliography"/>
+        <w:rPr>
+          <w:rFonts w:ascii="Aptos" w:hAnsi="Aptos"/>
+        </w:rPr>
+      </w:pPr>
+      <w:r>
+        <w:rPr>
+          <w:rFonts w:ascii="Aptos" w:hAnsi="Aptos"/>
+          <w:i/>
+          <w:iCs/>
+        </w:rPr>
+        <w:t>ReentrantLock in Java</w:t>
+      </w:r>
+      <w:r>
+        <w:rPr>
+          <w:rFonts w:ascii="Aptos" w:hAnsi="Aptos"/>
+        </w:rPr>
+        <w:t xml:space="preserve"> (2025) </w:t>
+      </w:r>
+      <w:r>
+        <w:rPr>
+          <w:rFonts w:ascii="Aptos" w:hAnsi="Aptos"/>
+          <w:i/>
+          <w:iCs/>
+        </w:rPr>
+        <w:t>GeeksforGeeks</w:t>
+      </w:r>
+      <w:r>
+        <w:rPr>
+          <w:rFonts w:ascii="Aptos" w:hAnsi="Aptos"/>
+        </w:rPr>
+        <w:t>. Available at: https://www.geeksforgeeks.org/java/reentrant-lock-in-java/ (Accessed: December 27, 2025).</w:t>
+      </w:r>
+    </w:p>
+    <w:p>
+      <w:pPr>
+        <w:pStyle w:val="Bibliography"/>
+        <w:rPr>
+          <w:rFonts w:ascii="Aptos" w:hAnsi="Aptos"/>
+        </w:rPr>
+      </w:pPr>
+      <w:r>
+        <w:rPr>
+          <w:rFonts w:ascii="Aptos" w:hAnsi="Aptos"/>
+          <w:i/>
+          <w:iCs/>
+        </w:rPr>
+        <w:t>Synchronization in Java</w:t>
+      </w:r>
+      <w:r>
+        <w:rPr>
+          <w:rFonts w:ascii="Aptos" w:hAnsi="Aptos"/>
+        </w:rPr>
+        <w:t xml:space="preserve"> (2025) </w:t>
+      </w:r>
+      <w:r>
+        <w:rPr>
+          <w:rFonts w:ascii="Aptos" w:hAnsi="Aptos"/>
+          <w:i/>
+          <w:iCs/>
+        </w:rPr>
+        <w:t>GeeksforGeeks</w:t>
+      </w:r>
+      <w:r>
+        <w:rPr>
+          <w:rFonts w:ascii="Aptos" w:hAnsi="Aptos"/>
+        </w:rPr>
+        <w:t>. Available at: https://www.geeksforgeeks.org/java/synchronization-in-java/ (Accessed: December 27, 2025).</w:t>
       </w:r>
     </w:p>
     <w:p>
@@ -6430,7 +6726,7 @@
           <w:szCs w:val="32"/>
         </w:rPr>
       </w:pPr>
-      <w:bookmarkStart w:id="14" w:name="_Toc216967452"/>
+      <w:bookmarkStart w:id="14" w:name="_Toc217725670"/>
       <w:r>
         <w:rPr>
           <w:rFonts w:cs="Arial"/>
@@ -8158,7 +8454,6 @@
   <w:style w:type="character" w:default="1" w:styleId="DefaultParagraphFont">
     <w:name w:val="Default Paragraph Font"/>
     <w:uiPriority w:val="1"/>
-    <w:semiHidden/>
     <w:unhideWhenUsed/>
   </w:style>
   <w:style w:type="table" w:default="1" w:styleId="TableNormal">

</xml_diff>